<commit_message>
fix: make Word report template customer-maintainable (closes regression FB-117)
</commit_message>
<xml_diff>
--- a/Go-based Refactored System/configs/export-templates/competency-phase1-report.docx
+++ b/Go-based Refactored System/configs/export-templates/competency-phase1-report.docx
@@ -4,7 +4,7 @@
   <w:body>
     <w:p>
       <w:pPr>
-        <w:spacing w:line="360" w:lineRule="auto"/>
+        <w:spacing w:line="144" w:lineRule="auto"/>
         <w:rPr>
           <w:rFonts w:hint="default" w:ascii="Calibri" w:hAnsi="Calibri" w:eastAsia="宋体" w:cs="Times New Roman"/>
           <w:szCs w:val="22"/>
@@ -592,17 +592,26 @@
           </mc:Fallback>
         </mc:AlternateContent>
       </w:r>
-      <w:r>
-        <w:rPr>
-          <w:rFonts w:hint="eastAsia" w:ascii="微软雅黑" w:hAnsi="微软雅黑" w:eastAsia="微软雅黑" w:cs="微软雅黑"/>
-          <w:b/>
-          <w:bCs/>
-          <w:color w:val="75BD42"/>
-          <w:sz w:val="32"/>
-          <w:szCs w:val="36"/>
-        </w:rPr>
-        <w:t>{{report.date}}</w:t>
-      </w:r>
+      <w:sdt>
+        <w:sdtPr>
+          <w:alias w:val="report.date"/>
+          <w:tag w:val="report.date"/>
+          <w:text/>
+        </w:sdtPr>
+        <w:sdtContent>
+          <w:r>
+            <w:rPr>
+              <w:rFonts w:hint="eastAsia" w:ascii="微软雅黑" w:hAnsi="微软雅黑" w:eastAsia="微软雅黑" w:cs="微软雅黑"/>
+              <w:b/>
+              <w:bCs/>
+              <w:color w:val="75BD42"/>
+              <w:sz w:val="32"/>
+              <w:szCs w:val="36"/>
+            </w:rPr>
+            <w:t>2026年8月12日</w:t>
+          </w:r>
+        </w:sdtContent>
+      </w:sdt>
       <w:r>
         <w:rPr>
           <w:rFonts w:hint="eastAsia" w:ascii="微软雅黑" w:hAnsi="微软雅黑" w:eastAsia="微软雅黑" w:cs="微软雅黑"/>
@@ -689,41 +698,41 @@
     </w:p>
     <w:p>
       <w:pPr>
-        <w:spacing w:line="360" w:lineRule="auto"/>
+        <w:spacing w:line="144" w:lineRule="auto"/>
         <w:ind w:firstLine="480" w:firstLineChars="200"/>
         <w:rPr>
           <w:rFonts w:hint="eastAsia" w:ascii="仿宋" w:hAnsi="仿宋" w:eastAsia="仿宋" w:cs="仿宋"/>
-          <w:sz w:val="24"/>
+          <w:sz w:val="22"/>
         </w:rPr>
       </w:pPr>
       <w:r>
         <w:rPr>
           <w:rFonts w:hint="eastAsia" w:ascii="仿宋" w:hAnsi="仿宋" w:eastAsia="仿宋" w:cs="仿宋"/>
-          <w:sz w:val="24"/>
+          <w:sz w:val="22"/>
         </w:rPr>
         <w:t>在组织人才竞争日益激烈的当下，科学评估员工的岗位胜任力水平已成为企业人力资源管理的关键环节。无数研究与实践证明，员工绩效差异往往并非仅由知识储备与基础技能的高低所决定，而是更多源于更深层的素质——包括能力倾向、价值取向、心理动力，这些深层特征构成了区分绩优者与一般者的员工胜任力，是本测评关注的焦点。</w:t>
       </w:r>
     </w:p>
     <w:p>
       <w:pPr>
-        <w:spacing w:line="360" w:lineRule="auto"/>
+        <w:spacing w:line="144" w:lineRule="auto"/>
         <w:ind w:firstLine="480" w:firstLineChars="200"/>
         <w:rPr>
           <w:rFonts w:hint="eastAsia" w:ascii="仿宋" w:hAnsi="仿宋" w:eastAsia="仿宋" w:cs="仿宋"/>
-          <w:sz w:val="24"/>
+          <w:sz w:val="22"/>
         </w:rPr>
       </w:pPr>
       <w:r>
         <w:rPr>
           <w:rFonts w:hint="eastAsia" w:ascii="仿宋" w:hAnsi="仿宋" w:eastAsia="仿宋" w:cs="仿宋"/>
-          <w:sz w:val="24"/>
+          <w:sz w:val="22"/>
         </w:rPr>
         <w:t>本测评以麦克利兰（McClelland）的冰山模型与博亚特兹（Boyatzis）的洋葱模型为理论基础，聚焦鉴别性素质的评估，从通用能力、</w:t>
       </w:r>
       <w:r>
         <w:rPr>
           <w:rFonts w:hint="eastAsia" w:ascii="仿宋" w:hAnsi="仿宋" w:eastAsia="仿宋" w:cs="仿宋"/>
-          <w:sz w:val="24"/>
+          <w:sz w:val="22"/>
           <w:lang w:val="en-US" w:eastAsia="zh-CN"/>
         </w:rPr>
         <w:t>心理素养两</w:t>
@@ -731,14 +740,14 @@
       <w:r>
         <w:rPr>
           <w:rFonts w:hint="eastAsia" w:ascii="仿宋" w:hAnsi="仿宋" w:eastAsia="仿宋" w:cs="仿宋"/>
-          <w:sz w:val="24"/>
+          <w:sz w:val="22"/>
         </w:rPr>
         <w:t>个方面共计10个维度对员工进行系统考察，旨在全面评估影响工作表现的关键因素。其中，通用能力包括逻辑思维、数字应用、计划执行、持续学习、沟通表达</w:t>
       </w:r>
       <w:r>
         <w:rPr>
           <w:rFonts w:hint="eastAsia" w:ascii="仿宋" w:hAnsi="仿宋" w:eastAsia="仿宋" w:cs="仿宋"/>
-          <w:sz w:val="24"/>
+          <w:sz w:val="22"/>
           <w:lang w:val="en-US" w:eastAsia="zh-CN"/>
         </w:rPr>
         <w:t>5</w:t>
@@ -746,14 +755,14 @@
       <w:r>
         <w:rPr>
           <w:rFonts w:hint="eastAsia" w:ascii="仿宋" w:hAnsi="仿宋" w:eastAsia="仿宋" w:cs="仿宋"/>
-          <w:sz w:val="24"/>
+          <w:sz w:val="22"/>
         </w:rPr>
         <w:t>个子维度，</w:t>
       </w:r>
       <w:r>
         <w:rPr>
           <w:rFonts w:hint="eastAsia" w:ascii="仿宋" w:hAnsi="仿宋" w:eastAsia="仿宋" w:cs="仿宋"/>
-          <w:sz w:val="24"/>
+          <w:sz w:val="22"/>
           <w:lang w:val="en-US" w:eastAsia="zh-CN"/>
         </w:rPr>
         <w:t>心理素养</w:t>
@@ -761,14 +770,14 @@
       <w:r>
         <w:rPr>
           <w:rFonts w:hint="eastAsia" w:ascii="仿宋" w:hAnsi="仿宋" w:eastAsia="仿宋" w:cs="仿宋"/>
-          <w:sz w:val="24"/>
+          <w:sz w:val="22"/>
         </w:rPr>
         <w:t>包括敬业奉献</w:t>
       </w:r>
       <w:r>
         <w:rPr>
           <w:rFonts w:hint="eastAsia" w:ascii="仿宋" w:hAnsi="仿宋" w:eastAsia="仿宋" w:cs="仿宋"/>
-          <w:sz w:val="24"/>
+          <w:sz w:val="22"/>
           <w:lang w:eastAsia="zh-CN"/>
         </w:rPr>
         <w:t>、</w:t>
@@ -776,14 +785,14 @@
       <w:r>
         <w:rPr>
           <w:rFonts w:hint="eastAsia" w:ascii="仿宋" w:hAnsi="仿宋" w:eastAsia="仿宋" w:cs="仿宋"/>
-          <w:sz w:val="24"/>
+          <w:sz w:val="22"/>
         </w:rPr>
         <w:t>求真务实</w:t>
       </w:r>
       <w:r>
         <w:rPr>
           <w:rFonts w:hint="eastAsia" w:ascii="仿宋" w:hAnsi="仿宋" w:eastAsia="仿宋" w:cs="仿宋"/>
-          <w:sz w:val="24"/>
+          <w:sz w:val="22"/>
           <w:lang w:eastAsia="zh-CN"/>
         </w:rPr>
         <w:t>、</w:t>
@@ -791,14 +800,14 @@
       <w:r>
         <w:rPr>
           <w:rFonts w:hint="eastAsia" w:ascii="仿宋" w:hAnsi="仿宋" w:eastAsia="仿宋" w:cs="仿宋"/>
-          <w:sz w:val="24"/>
+          <w:sz w:val="22"/>
         </w:rPr>
         <w:t>自律性</w:t>
       </w:r>
       <w:r>
         <w:rPr>
           <w:rFonts w:hint="eastAsia" w:ascii="仿宋" w:hAnsi="仿宋" w:eastAsia="仿宋" w:cs="仿宋"/>
-          <w:sz w:val="24"/>
+          <w:sz w:val="22"/>
           <w:lang w:eastAsia="zh-CN"/>
         </w:rPr>
         <w:t>、</w:t>
@@ -806,14 +815,14 @@
       <w:r>
         <w:rPr>
           <w:rFonts w:hint="eastAsia" w:ascii="仿宋" w:hAnsi="仿宋" w:eastAsia="仿宋" w:cs="仿宋"/>
-          <w:sz w:val="24"/>
+          <w:sz w:val="22"/>
         </w:rPr>
         <w:t>成就导向</w:t>
       </w:r>
       <w:r>
         <w:rPr>
           <w:rFonts w:hint="eastAsia" w:ascii="仿宋" w:hAnsi="仿宋" w:eastAsia="仿宋" w:cs="仿宋"/>
-          <w:sz w:val="24"/>
+          <w:sz w:val="22"/>
           <w:lang w:val="en-US" w:eastAsia="zh-CN"/>
         </w:rPr>
         <w:t>和合作意识5</w:t>
@@ -821,20 +830,20 @@
       <w:r>
         <w:rPr>
           <w:rFonts w:hint="eastAsia" w:ascii="仿宋" w:hAnsi="仿宋" w:eastAsia="仿宋" w:cs="仿宋"/>
-          <w:sz w:val="24"/>
+          <w:sz w:val="22"/>
         </w:rPr>
         <w:t>个子维度。</w:t>
       </w:r>
     </w:p>
     <w:p>
       <w:pPr>
-        <w:spacing w:line="360" w:lineRule="auto"/>
+        <w:spacing w:line="144" w:lineRule="auto"/>
         <w:jc w:val="center"/>
         <w:rPr>
           <w:rFonts w:hint="eastAsia" w:ascii="仿宋" w:hAnsi="仿宋" w:eastAsia="仿宋" w:cs="仿宋"/>
           <w:b/>
           <w:bCs/>
-          <w:sz w:val="24"/>
+          <w:sz w:val="22"/>
         </w:rPr>
       </w:pPr>
       <w:r>
@@ -848,11 +857,11 @@
     </w:p>
     <w:p>
       <w:pPr>
-        <w:spacing w:line="360" w:lineRule="auto"/>
+        <w:spacing w:line="144" w:lineRule="auto"/>
         <w:jc w:val="center"/>
         <w:rPr>
           <w:rFonts w:hint="eastAsia" w:ascii="仿宋" w:hAnsi="仿宋" w:eastAsia="仿宋" w:cs="仿宋"/>
-          <w:sz w:val="24"/>
+          <w:sz w:val="22"/>
         </w:rPr>
       </w:pPr>
       <w:r>
@@ -904,24 +913,24 @@
     </w:p>
     <w:p>
       <w:pPr>
-        <w:spacing w:line="360" w:lineRule="auto"/>
+        <w:spacing w:line="144" w:lineRule="auto"/>
         <w:ind w:firstLine="480" w:firstLineChars="200"/>
         <w:rPr>
           <w:rFonts w:hint="eastAsia" w:ascii="仿宋" w:hAnsi="仿宋" w:eastAsia="仿宋" w:cs="仿宋"/>
-          <w:sz w:val="24"/>
+          <w:sz w:val="22"/>
         </w:rPr>
       </w:pPr>
       <w:r>
         <w:rPr>
           <w:rFonts w:hint="eastAsia" w:ascii="仿宋" w:hAnsi="仿宋" w:eastAsia="仿宋" w:cs="仿宋"/>
-          <w:sz w:val="24"/>
+          <w:sz w:val="22"/>
         </w:rPr>
         <w:t>本测评能够有效鉴别员工的能力短板与发展优势，可以应用于组织的招聘、选拔、在岗评估、培训发展与人才盘点等，为组织客观量化人才评价与个性化人才培养的提供数据支撑，辅助实现人岗匹配与人才发展战略的制定与落地。</w:t>
       </w:r>
     </w:p>
     <w:p>
       <w:pPr>
-        <w:spacing w:line="360" w:lineRule="auto"/>
+        <w:spacing w:line="144" w:lineRule="auto"/>
         <w:ind w:firstLine="480" w:firstLineChars="200"/>
         <w:rPr>
           <w:rFonts w:ascii="Calibri" w:hAnsi="Calibri" w:eastAsia="宋体" w:cs="Times New Roman"/>
@@ -932,8 +941,24 @@
           <w:rFonts w:hint="eastAsia" w:ascii="仿宋" w:hAnsi="仿宋" w:eastAsia="仿宋" w:cs="仿宋"/>
           <w:sz w:val="24"/>
         </w:rPr>
-        <w:t>特别说明：{{report.disclaimer}}</w:t>
+        <w:t xml:space="preserve">特别说明：</w:t>
       </w:r>
+      <w:sdt>
+        <w:sdtPr>
+          <w:alias w:val="report.disclaimer"/>
+          <w:tag w:val="report.disclaimer"/>
+          <w:text/>
+        </w:sdtPr>
+        <w:sdtContent>
+          <w:r>
+            <w:rPr>
+              <w:rFonts w:hint="eastAsia" w:ascii="仿宋" w:hAnsi="仿宋" w:eastAsia="仿宋" w:cs="仿宋"/>
+              <w:sz w:val="24"/>
+            </w:rPr>
+            <w:t>此处显示经批准的报告免责声明。</w:t>
+          </w:r>
+        </w:sdtContent>
+      </w:sdt>
       <w:r>
         <w:rPr>
           <w:rFonts w:ascii="Calibri" w:hAnsi="Calibri" w:eastAsia="宋体" w:cs="Times New Roman"/>
@@ -969,7 +994,7 @@
           <w:ilvl w:val="0"/>
           <w:numId w:val="1"/>
         </w:numPr>
-        <w:spacing w:before="156" w:beforeLines="50" w:after="156" w:afterLines="50" w:line="360" w:lineRule="auto"/>
+        <w:spacing w:before="62" w:beforeLines="50" w:after="62" w:afterLines="50" w:line="144" w:lineRule="auto"/>
         <w:ind w:left="420" w:hanging="420"/>
         <w:rPr>
           <w:rFonts w:hint="eastAsia" w:ascii="黑体" w:hAnsi="黑体" w:eastAsia="黑体" w:cs="黑体"/>
@@ -994,7 +1019,7 @@
     </w:p>
     <w:p>
       <w:pPr>
-        <w:spacing w:line="360" w:lineRule="auto"/>
+        <w:spacing w:line="144" w:lineRule="auto"/>
         <w:ind w:firstLine="420"/>
         <w:rPr>
           <w:rFonts w:hint="eastAsia" w:ascii="仿宋" w:hAnsi="仿宋" w:eastAsia="仿宋" w:cs="仿宋"/>
@@ -1006,8 +1031,24 @@
           <w:rFonts w:hint="eastAsia" w:ascii="仿宋" w:hAnsi="仿宋" w:eastAsia="仿宋" w:cs="仿宋"/>
           <w:sz w:val="24"/>
         </w:rPr>
-        <w:t>姓名：{{participant.name}}</w:t>
+        <w:t xml:space="preserve">姓名：</w:t>
       </w:r>
+      <w:sdt>
+        <w:sdtPr>
+          <w:alias w:val="participant.name"/>
+          <w:tag w:val="participant.name"/>
+          <w:text/>
+        </w:sdtPr>
+        <w:sdtContent>
+          <w:r>
+            <w:rPr>
+              <w:rFonts w:hint="eastAsia" w:ascii="仿宋" w:hAnsi="仿宋" w:eastAsia="仿宋" w:cs="仿宋"/>
+              <w:sz w:val="24"/>
+            </w:rPr>
+            <w:t>张三</w:t>
+          </w:r>
+        </w:sdtContent>
+      </w:sdt>
       <w:r>
         <w:rPr>
           <w:rFonts w:hint="eastAsia" w:ascii="仿宋" w:hAnsi="仿宋" w:eastAsia="仿宋" w:cs="仿宋"/>
@@ -1076,12 +1117,28 @@
           <w:rFonts w:hint="eastAsia" w:ascii="仿宋" w:hAnsi="仿宋" w:eastAsia="仿宋" w:cs="仿宋"/>
           <w:sz w:val="24"/>
         </w:rPr>
-        <w:t>年龄：{{participant.age}}</w:t>
+        <w:t xml:space="preserve">年龄：</w:t>
       </w:r>
+      <w:sdt>
+        <w:sdtPr>
+          <w:alias w:val="participant.age"/>
+          <w:tag w:val="participant.age"/>
+          <w:text/>
+        </w:sdtPr>
+        <w:sdtContent>
+          <w:r>
+            <w:rPr>
+              <w:rFonts w:hint="eastAsia" w:ascii="仿宋" w:hAnsi="仿宋" w:eastAsia="仿宋" w:cs="仿宋"/>
+              <w:sz w:val="24"/>
+            </w:rPr>
+            <w:t>30</w:t>
+          </w:r>
+        </w:sdtContent>
+      </w:sdt>
     </w:p>
     <w:p>
       <w:pPr>
-        <w:spacing w:line="360" w:lineRule="auto"/>
+        <w:spacing w:line="144" w:lineRule="auto"/>
         <w:ind w:firstLine="420"/>
         <w:rPr>
           <w:rFonts w:hint="eastAsia" w:ascii="仿宋" w:hAnsi="仿宋" w:eastAsia="仿宋" w:cs="仿宋"/>
@@ -1093,8 +1150,24 @@
           <w:rFonts w:hint="eastAsia" w:ascii="仿宋" w:hAnsi="仿宋" w:eastAsia="仿宋" w:cs="仿宋"/>
           <w:sz w:val="24"/>
         </w:rPr>
-        <w:t>性别：{{participant.gender}}</w:t>
+        <w:t xml:space="preserve">性别：</w:t>
       </w:r>
+      <w:sdt>
+        <w:sdtPr>
+          <w:alias w:val="participant.gender"/>
+          <w:tag w:val="participant.gender"/>
+          <w:text/>
+        </w:sdtPr>
+        <w:sdtContent>
+          <w:r>
+            <w:rPr>
+              <w:rFonts w:hint="eastAsia" w:ascii="仿宋" w:hAnsi="仿宋" w:eastAsia="仿宋" w:cs="仿宋"/>
+              <w:sz w:val="24"/>
+            </w:rPr>
+            <w:t>男</w:t>
+          </w:r>
+        </w:sdtContent>
+      </w:sdt>
       <w:r>
         <w:rPr>
           <w:rFonts w:hint="eastAsia" w:ascii="仿宋" w:hAnsi="仿宋" w:eastAsia="仿宋" w:cs="仿宋"/>
@@ -1163,12 +1236,28 @@
           <w:rFonts w:hint="eastAsia" w:ascii="仿宋" w:hAnsi="仿宋" w:eastAsia="仿宋" w:cs="仿宋"/>
           <w:sz w:val="24"/>
         </w:rPr>
-        <w:t>手机号：{{participant.telephone}}</w:t>
+        <w:t xml:space="preserve">手机号：</w:t>
       </w:r>
+      <w:sdt>
+        <w:sdtPr>
+          <w:alias w:val="participant.telephone"/>
+          <w:tag w:val="participant.telephone"/>
+          <w:text/>
+        </w:sdtPr>
+        <w:sdtContent>
+          <w:r>
+            <w:rPr>
+              <w:rFonts w:hint="eastAsia" w:ascii="仿宋" w:hAnsi="仿宋" w:eastAsia="仿宋" w:cs="仿宋"/>
+              <w:sz w:val="24"/>
+            </w:rPr>
+            <w:t>13800000000</w:t>
+          </w:r>
+        </w:sdtContent>
+      </w:sdt>
     </w:p>
     <w:p>
       <w:pPr>
-        <w:spacing w:line="360" w:lineRule="auto"/>
+        <w:spacing w:line="144" w:lineRule="auto"/>
         <w:ind w:firstLine="420"/>
         <w:rPr>
           <w:rFonts w:hint="eastAsia" w:ascii="仿宋" w:hAnsi="仿宋" w:eastAsia="仿宋" w:cs="仿宋"/>
@@ -1180,12 +1269,28 @@
           <w:rFonts w:hint="eastAsia" w:ascii="仿宋" w:hAnsi="仿宋" w:eastAsia="仿宋" w:cs="仿宋"/>
           <w:sz w:val="24"/>
         </w:rPr>
-        <w:t>单位：{{participant.affiliation}}</w:t>
+        <w:t xml:space="preserve">单位：</w:t>
       </w:r>
+      <w:sdt>
+        <w:sdtPr>
+          <w:alias w:val="participant.affiliation"/>
+          <w:tag w:val="participant.affiliation"/>
+          <w:text/>
+        </w:sdtPr>
+        <w:sdtContent>
+          <w:r>
+            <w:rPr>
+              <w:rFonts w:hint="eastAsia" w:ascii="仿宋" w:hAnsi="仿宋" w:eastAsia="仿宋" w:cs="仿宋"/>
+              <w:sz w:val="24"/>
+            </w:rPr>
+            <w:t>示例单位</w:t>
+          </w:r>
+        </w:sdtContent>
+      </w:sdt>
     </w:p>
     <w:p>
       <w:pPr>
-        <w:spacing w:line="360" w:lineRule="auto"/>
+        <w:spacing w:line="144" w:lineRule="auto"/>
         <w:ind w:firstLine="420"/>
         <w:rPr>
           <w:rFonts w:hint="eastAsia" w:ascii="仿宋" w:hAnsi="仿宋" w:eastAsia="仿宋" w:cs="仿宋"/>
@@ -1197,12 +1302,28 @@
           <w:rFonts w:hint="eastAsia" w:ascii="仿宋" w:hAnsi="仿宋" w:eastAsia="仿宋" w:cs="仿宋"/>
           <w:sz w:val="24"/>
         </w:rPr>
-        <w:t>岗位：{{participant.post}}</w:t>
+        <w:t xml:space="preserve">岗位：</w:t>
       </w:r>
+      <w:sdt>
+        <w:sdtPr>
+          <w:alias w:val="participant.post"/>
+          <w:tag w:val="participant.post"/>
+          <w:text/>
+        </w:sdtPr>
+        <w:sdtContent>
+          <w:r>
+            <w:rPr>
+              <w:rFonts w:hint="eastAsia" w:ascii="仿宋" w:hAnsi="仿宋" w:eastAsia="仿宋" w:cs="仿宋"/>
+              <w:sz w:val="24"/>
+            </w:rPr>
+            <w:t>示例岗位</w:t>
+          </w:r>
+        </w:sdtContent>
+      </w:sdt>
     </w:p>
     <w:p>
       <w:pPr>
-        <w:spacing w:line="360" w:lineRule="auto"/>
+        <w:spacing w:line="144" w:lineRule="auto"/>
         <w:ind w:firstLine="420"/>
         <w:rPr>
           <w:rFonts w:hint="eastAsia" w:ascii="仿宋" w:hAnsi="仿宋" w:eastAsia="仿宋" w:cs="仿宋"/>
@@ -1214,8 +1335,24 @@
           <w:rFonts w:hint="eastAsia" w:ascii="仿宋" w:hAnsi="仿宋" w:eastAsia="仿宋" w:cs="仿宋"/>
           <w:sz w:val="24"/>
         </w:rPr>
-        <w:t>时间：{{result.submittedAt}}</w:t>
+        <w:t xml:space="preserve">时间：</w:t>
       </w:r>
+      <w:sdt>
+        <w:sdtPr>
+          <w:alias w:val="result.submittedAt"/>
+          <w:tag w:val="result.submittedAt"/>
+          <w:text/>
+        </w:sdtPr>
+        <w:sdtContent>
+          <w:r>
+            <w:rPr>
+              <w:rFonts w:hint="eastAsia" w:ascii="仿宋" w:hAnsi="仿宋" w:eastAsia="仿宋" w:cs="仿宋"/>
+              <w:sz w:val="24"/>
+            </w:rPr>
+            <w:t>2026年8月12日</w:t>
+          </w:r>
+        </w:sdtContent>
+      </w:sdt>
       <w:r>
         <w:rPr>
           <w:rFonts w:hint="eastAsia" w:ascii="仿宋" w:hAnsi="仿宋" w:eastAsia="仿宋" w:cs="仿宋"/>
@@ -1286,7 +1423,30 @@
           <w:rFonts w:hint="eastAsia" w:ascii="仿宋" w:hAnsi="仿宋" w:eastAsia="仿宋" w:cs="仿宋"/>
           <w:sz w:val="24"/>
         </w:rPr>
-        <w:t>时长：{{result.userTime}}分钟</w:t>
+        <w:t xml:space="preserve">时长：</w:t>
+      </w:r>
+      <w:sdt>
+        <w:sdtPr>
+          <w:alias w:val="result.userTime"/>
+          <w:tag w:val="result.userTime"/>
+          <w:text/>
+        </w:sdtPr>
+        <w:sdtContent>
+          <w:r>
+            <w:rPr>
+              <w:rFonts w:hint="eastAsia" w:ascii="仿宋" w:hAnsi="仿宋" w:eastAsia="仿宋" w:cs="仿宋"/>
+              <w:sz w:val="24"/>
+            </w:rPr>
+            <w:t>20</w:t>
+          </w:r>
+        </w:sdtContent>
+      </w:sdt>
+      <w:r>
+        <w:rPr>
+          <w:rFonts w:hint="eastAsia" w:ascii="仿宋" w:hAnsi="仿宋" w:eastAsia="仿宋" w:cs="仿宋"/>
+          <w:sz w:val="24"/>
+        </w:rPr>
+        <w:t xml:space="preserve">分钟</w:t>
       </w:r>
     </w:p>
     <w:p>
@@ -1295,7 +1455,7 @@
           <w:ilvl w:val="0"/>
           <w:numId w:val="1"/>
         </w:numPr>
-        <w:spacing w:before="156" w:beforeLines="50" w:after="156" w:afterLines="50" w:line="360" w:lineRule="auto"/>
+        <w:spacing w:before="62" w:beforeLines="50" w:after="62" w:afterLines="50" w:line="144" w:lineRule="auto"/>
         <w:ind w:left="420" w:hanging="420"/>
         <w:rPr>
           <w:rFonts w:hint="eastAsia" w:ascii="黑体" w:hAnsi="黑体" w:eastAsia="黑体" w:cs="黑体"/>
@@ -1339,19 +1499,28 @@
         </w:rPr>
         <w:t>您的胜任力等级为</w:t>
       </w:r>
-      <w:r>
-        <w:rPr>
-          <w:rFonts w:hint="eastAsia" w:ascii="仿宋" w:hAnsi="仿宋" w:eastAsia="仿宋" w:cs="仿宋"/>
-          <w:b/>
-          <w:bCs/>
-          <w:i/>
-          <w:iCs/>
-          <w:color w:val="00B050"/>
-          <w:sz w:val="32"/>
-          <w:szCs w:val="32"/>
-        </w:rPr>
-        <w:t>{{overall.level}}</w:t>
-      </w:r>
+      <w:sdt>
+        <w:sdtPr>
+          <w:alias w:val="overall.level"/>
+          <w:tag w:val="overall.level"/>
+          <w:text/>
+        </w:sdtPr>
+        <w:sdtContent>
+          <w:r>
+            <w:rPr>
+              <w:rFonts w:hint="eastAsia" w:ascii="仿宋" w:hAnsi="仿宋" w:eastAsia="仿宋" w:cs="仿宋"/>
+              <w:b/>
+              <w:bCs/>
+              <w:i/>
+              <w:iCs/>
+              <w:color w:val="00B050"/>
+              <w:sz w:val="32"/>
+              <w:szCs w:val="32"/>
+            </w:rPr>
+            <w:t>合格胜任</w:t>
+          </w:r>
+        </w:sdtContent>
+      </w:sdt>
     </w:p>
     <w:p>
       <w:pPr>
@@ -1412,7 +1581,7 @@
     </w:p>
     <w:p>
       <w:pPr>
-        <w:spacing w:before="156" w:beforeLines="50" w:after="156" w:afterLines="50" w:line="360" w:lineRule="auto"/>
+        <w:spacing w:before="62" w:beforeLines="50" w:after="62" w:afterLines="50" w:line="144" w:lineRule="auto"/>
         <w:jc w:val="both"/>
         <w:rPr>
           <w:rFonts w:hint="eastAsia" w:ascii="仿宋" w:hAnsi="仿宋" w:eastAsia="仿宋" w:cs="仿宋"/>
@@ -1566,8 +1735,28 @@
           <w:sz w:val="28"/>
           <w:szCs w:val="28"/>
         </w:rPr>
-        <w:t>【诊断】{{overall.diagnosis}}</w:t>
+        <w:t xml:space="preserve">【诊断】</w:t>
       </w:r>
+      <w:sdt>
+        <w:sdtPr>
+          <w:alias w:val="overall.diagnosis"/>
+          <w:tag w:val="overall.diagnosis"/>
+          <w:text/>
+        </w:sdtPr>
+        <w:sdtContent>
+          <w:r>
+            <w:rPr>
+              <w:rFonts w:hint="eastAsia" w:ascii="仿宋" w:hAnsi="仿宋" w:eastAsia="仿宋" w:cs="仿宋"/>
+              <w:b/>
+              <w:bCs/>
+              <w:color w:val="00B050"/>
+              <w:sz w:val="28"/>
+              <w:szCs w:val="28"/>
+            </w:rPr>
+            <w:t>此处显示总体诊断。</w:t>
+          </w:r>
+        </w:sdtContent>
+      </w:sdt>
       <w:r>
         <w:rPr>
           <w:rFonts w:hint="eastAsia" w:ascii="仿宋" w:hAnsi="仿宋" w:eastAsia="仿宋" w:cs="仿宋"/>
@@ -1578,7 +1767,7 @@
     </w:p>
     <w:p>
       <w:pPr>
-        <w:spacing w:before="156" w:beforeLines="50" w:after="156" w:afterLines="50" w:line="360" w:lineRule="auto"/>
+        <w:spacing w:before="62" w:beforeLines="50" w:after="62" w:afterLines="50" w:line="144" w:lineRule="auto"/>
         <w:ind w:firstLine="480" w:firstLineChars="200"/>
         <w:rPr>
           <w:rFonts w:hint="eastAsia" w:ascii="仿宋" w:hAnsi="仿宋" w:eastAsia="仿宋" w:cs="仿宋"/>
@@ -1591,8 +1780,25 @@
           <w:sz w:val="24"/>
           <w:lang w:eastAsia="zh-CN"/>
         </w:rPr>
-        <w:t>提示：{{validity.notice}}</w:t>
+        <w:t xml:space="preserve">提示：</w:t>
       </w:r>
+      <w:sdt>
+        <w:sdtPr>
+          <w:alias w:val="validity.notice"/>
+          <w:tag w:val="validity.notice"/>
+          <w:text/>
+        </w:sdtPr>
+        <w:sdtContent>
+          <w:r>
+            <w:rPr>
+              <w:rFonts w:hint="eastAsia" w:ascii="仿宋" w:hAnsi="仿宋" w:eastAsia="仿宋" w:cs="仿宋"/>
+              <w:sz w:val="24"/>
+              <w:lang w:eastAsia="zh-CN"/>
+            </w:rPr>
+            <w:t>此处显示作答效度提示。</w:t>
+          </w:r>
+        </w:sdtContent>
+      </w:sdt>
       <w:r>
         <w:rPr>
           <w:rFonts w:hint="eastAsia" w:ascii="仿宋" w:hAnsi="仿宋" w:eastAsia="仿宋" w:cs="仿宋"/>
@@ -1621,7 +1827,7 @@
     </w:p>
     <w:p>
       <w:pPr>
-        <w:spacing w:before="156" w:beforeLines="50" w:after="156" w:afterLines="50" w:line="360" w:lineRule="auto"/>
+        <w:spacing w:before="62" w:beforeLines="50" w:after="62" w:afterLines="50" w:line="144" w:lineRule="auto"/>
         <w:rPr>
           <w:rFonts w:hint="eastAsia" w:ascii="微软雅黑" w:hAnsi="微软雅黑" w:eastAsia="微软雅黑" w:cs="微软雅黑"/>
           <w:sz w:val="24"/>
@@ -1641,7 +1847,7 @@
           <w:ilvl w:val="0"/>
           <w:numId w:val="1"/>
         </w:numPr>
-        <w:spacing w:before="156" w:beforeLines="50" w:after="156" w:afterLines="50" w:line="360" w:lineRule="auto"/>
+        <w:spacing w:before="62" w:beforeLines="50" w:after="62" w:afterLines="50" w:line="144" w:lineRule="auto"/>
         <w:ind w:left="420" w:hanging="420"/>
         <w:rPr>
           <w:rFonts w:hint="eastAsia" w:ascii="黑体" w:hAnsi="黑体" w:eastAsia="黑体" w:cs="黑体"/>
@@ -1666,7 +1872,7 @@
     </w:p>
     <w:p>
       <w:pPr>
-        <w:spacing w:line="360" w:lineRule="auto"/>
+        <w:spacing w:line="144" w:lineRule="auto"/>
         <w:rPr>
           <w:rFonts w:hint="eastAsia" w:ascii="仿宋" w:hAnsi="仿宋" w:eastAsia="仿宋" w:cs="仿宋"/>
           <w:b/>
@@ -1731,7 +1937,7 @@
           </w:tblCellMar>
         </w:tblPrEx>
         <w:trPr>
-          <w:trHeight w:val="624" w:hRule="atLeast"/>
+          <w:trHeight w:val="250" w:hRule="atLeast"/>
         </w:trPr>
         <w:tc>
           <w:tcPr>
@@ -1745,7 +1951,7 @@
           <w:p>
             <w:pPr>
               <w:widowControl/>
-              <w:spacing w:line="360" w:lineRule="auto"/>
+              <w:spacing w:line="144" w:lineRule="auto"/>
               <w:jc w:val="center"/>
               <w:textAlignment w:val="center"/>
               <w:rPr>
@@ -1784,7 +1990,7 @@
           <w:p>
             <w:pPr>
               <w:widowControl/>
-              <w:spacing w:line="360" w:lineRule="auto"/>
+              <w:spacing w:line="144" w:lineRule="auto"/>
               <w:jc w:val="center"/>
               <w:textAlignment w:val="center"/>
               <w:rPr>
@@ -1830,7 +2036,7 @@
           </w:tblCellMar>
         </w:tblPrEx>
         <w:trPr>
-          <w:trHeight w:val="624" w:hRule="atLeast"/>
+          <w:trHeight w:val="250" w:hRule="atLeast"/>
         </w:trPr>
         <w:tc>
           <w:tcPr>
@@ -1844,7 +2050,7 @@
           <w:p>
             <w:pPr>
               <w:widowControl/>
-              <w:spacing w:line="360" w:lineRule="auto"/>
+              <w:spacing w:line="144" w:lineRule="auto"/>
               <w:jc w:val="center"/>
               <w:textAlignment w:val="center"/>
               <w:rPr>
@@ -1889,7 +2095,7 @@
           <w:p>
             <w:pPr>
               <w:widowControl/>
-              <w:spacing w:line="360" w:lineRule="auto"/>
+              <w:spacing w:line="144" w:lineRule="auto"/>
               <w:jc w:val="center"/>
               <w:textAlignment w:val="center"/>
               <w:rPr>
@@ -1941,7 +2147,7 @@
           </w:tblCellMar>
         </w:tblPrEx>
         <w:trPr>
-          <w:trHeight w:val="4561" w:hRule="atLeast"/>
+          <w:trHeight w:val="1824" w:hRule="atLeast"/>
         </w:trPr>
         <w:tc>
           <w:tcPr>
@@ -1954,7 +2160,7 @@
           </w:tcPr>
           <w:p>
             <w:pPr>
-              <w:spacing w:before="156" w:beforeLines="50" w:after="156" w:afterLines="50" w:line="360" w:lineRule="auto"/>
+              <w:spacing w:before="62" w:beforeLines="50" w:after="62" w:afterLines="50" w:line="144" w:lineRule="auto"/>
               <w:jc w:val="center"/>
               <w:rPr>
                 <w:rFonts w:hint="eastAsia" w:ascii="仿宋" w:hAnsi="仿宋" w:eastAsia="仿宋" w:cs="仿宋"/>
@@ -1981,7 +2187,7 @@
     </w:tbl>
     <w:p>
       <w:pPr>
-        <w:spacing w:line="360" w:lineRule="auto"/>
+        <w:spacing w:line="144" w:lineRule="auto"/>
         <w:rPr>
           <w:rFonts w:hint="eastAsia" w:ascii="仿宋" w:hAnsi="仿宋" w:eastAsia="仿宋" w:cs="仿宋"/>
           <w:b/>
@@ -2046,7 +2252,7 @@
           </w:tblCellMar>
         </w:tblPrEx>
         <w:trPr>
-          <w:trHeight w:val="1417" w:hRule="atLeast"/>
+          <w:trHeight w:val="567" w:hRule="atLeast"/>
         </w:trPr>
         <w:tc>
           <w:tcPr>
@@ -2105,8 +2311,25 @@
                 <w:sz w:val="24"/>
                 <w:szCs w:val="32"/>
               </w:rPr>
-              <w:t xml:space="preserve">【得分】 {{group.general_ability.score}}</w:t>
+              <w:t xml:space="preserve">【得分】 </w:t>
             </w:r>
+            <w:sdt>
+              <w:sdtPr>
+                <w:alias w:val="group.general_ability.score"/>
+                <w:tag w:val="group.general_ability.score"/>
+                <w:text/>
+              </w:sdtPr>
+              <w:sdtContent>
+                <w:r>
+                  <w:rPr>
+                    <w:rFonts w:hint="eastAsia" w:ascii="仿宋" w:hAnsi="仿宋" w:eastAsia="仿宋" w:cs="仿宋"/>
+                    <w:sz w:val="24"/>
+                    <w:szCs w:val="32"/>
+                  </w:rPr>
+                  <w:t>3.50</w:t>
+                </w:r>
+              </w:sdtContent>
+            </w:sdt>
             <w:r>
               <w:rPr>
                 <w:rFonts w:hint="eastAsia" w:ascii="仿宋" w:hAnsi="仿宋" w:eastAsia="仿宋" w:cs="仿宋"/>
@@ -2150,7 +2373,7 @@
           </w:tcPr>
           <w:p>
             <w:pPr>
-              <w:spacing w:before="156" w:beforeLines="50" w:after="156" w:afterLines="50" w:line="360" w:lineRule="auto"/>
+              <w:spacing w:before="62" w:beforeLines="50" w:after="62" w:afterLines="50" w:line="144" w:lineRule="auto"/>
               <w:jc w:val="center"/>
               <w:rPr>
                 <w:rFonts w:hint="eastAsia" w:ascii="仿宋" w:hAnsi="仿宋" w:eastAsia="仿宋" w:cs="仿宋"/>
@@ -2186,7 +2409,7 @@
           </w:tcPr>
           <w:p>
             <w:pPr>
-              <w:spacing w:before="156" w:beforeLines="50"/>
+              <w:spacing w:before="62" w:beforeLines="50"/>
               <w:rPr>
                 <w:rFonts w:hint="eastAsia" w:ascii="仿宋" w:hAnsi="仿宋" w:eastAsia="仿宋" w:cs="仿宋"/>
                 <w:sz w:val="24"/>
@@ -2199,8 +2422,25 @@
                 <w:sz w:val="24"/>
                 <w:szCs w:val="32"/>
               </w:rPr>
-              <w:t>【评价等级】{{group.general_ability.level}}</w:t>
+              <w:t xml:space="preserve">【评价等级】</w:t>
             </w:r>
+            <w:sdt>
+              <w:sdtPr>
+                <w:alias w:val="group.general_ability.level"/>
+                <w:tag w:val="group.general_ability.level"/>
+                <w:text/>
+              </w:sdtPr>
+              <w:sdtContent>
+                <w:r>
+                  <w:rPr>
+                    <w:rFonts w:hint="eastAsia" w:ascii="仿宋" w:hAnsi="仿宋" w:eastAsia="仿宋" w:cs="仿宋"/>
+                    <w:sz w:val="24"/>
+                    <w:szCs w:val="32"/>
+                  </w:rPr>
+                  <w:t>较高分</w:t>
+                </w:r>
+              </w:sdtContent>
+            </w:sdt>
             <w:r>
               <w:rPr>
                 <w:rFonts w:hint="eastAsia" w:ascii="仿宋" w:hAnsi="仿宋" w:eastAsia="仿宋" w:cs="仿宋"/>
@@ -2221,7 +2461,7 @@
           </w:p>
           <w:p>
             <w:pPr>
-              <w:spacing w:before="156" w:beforeLines="50"/>
+              <w:spacing w:before="62" w:beforeLines="50"/>
               <w:rPr>
                 <w:rFonts w:hint="eastAsia" w:ascii="仿宋" w:hAnsi="仿宋" w:eastAsia="仿宋" w:cs="仿宋"/>
                 <w:sz w:val="24"/>
@@ -2239,7 +2479,7 @@
           </w:p>
           <w:p>
             <w:pPr>
-              <w:spacing w:before="156" w:beforeLines="50" w:after="156" w:afterLines="50"/>
+              <w:spacing w:before="62" w:beforeLines="50" w:after="62" w:afterLines="50"/>
               <w:rPr>
                 <w:rFonts w:hint="eastAsia" w:ascii="仿宋" w:hAnsi="仿宋" w:eastAsia="仿宋" w:cs="仿宋"/>
                 <w:b/>
@@ -2255,8 +2495,25 @@
                 <w:sz w:val="24"/>
                 <w:szCs w:val="32"/>
               </w:rPr>
-              <w:t>【维度说明】{{group.general_ability.description}}</w:t>
+              <w:t xml:space="preserve">【维度说明】</w:t>
             </w:r>
+            <w:sdt>
+              <w:sdtPr>
+                <w:alias w:val="group.general_ability.description"/>
+                <w:tag w:val="group.general_ability.description"/>
+                <w:text/>
+              </w:sdtPr>
+              <w:sdtContent>
+                <w:r>
+                  <w:rPr>
+                    <w:rFonts w:hint="eastAsia" w:ascii="仿宋" w:hAnsi="仿宋" w:eastAsia="仿宋" w:cs="仿宋"/>
+                    <w:sz w:val="24"/>
+                    <w:szCs w:val="32"/>
+                  </w:rPr>
+                  <w:t>此处显示通用能力说明。</w:t>
+                </w:r>
+              </w:sdtContent>
+            </w:sdt>
             <w:r>
               <w:rPr>
                 <w:rFonts w:hint="eastAsia" w:ascii="仿宋" w:hAnsi="仿宋" w:eastAsia="仿宋" w:cs="仿宋"/>
@@ -2329,7 +2586,7 @@
           </w:tblCellMar>
         </w:tblPrEx>
         <w:trPr>
-          <w:trHeight w:val="1417" w:hRule="atLeast"/>
+          <w:trHeight w:val="567" w:hRule="atLeast"/>
         </w:trPr>
         <w:tc>
           <w:tcPr>
@@ -2390,8 +2647,25 @@
                 <w:sz w:val="24"/>
                 <w:szCs w:val="32"/>
               </w:rPr>
-              <w:t>【得分】 {{group.psychological_quality.score}}</w:t>
+              <w:t xml:space="preserve">【得分】 </w:t>
             </w:r>
+            <w:sdt>
+              <w:sdtPr>
+                <w:alias w:val="group.psychological_quality.score"/>
+                <w:tag w:val="group.psychological_quality.score"/>
+                <w:text/>
+              </w:sdtPr>
+              <w:sdtContent>
+                <w:r>
+                  <w:rPr>
+                    <w:rFonts w:hint="eastAsia" w:ascii="仿宋" w:hAnsi="仿宋" w:eastAsia="仿宋" w:cs="仿宋"/>
+                    <w:sz w:val="24"/>
+                    <w:szCs w:val="32"/>
+                  </w:rPr>
+                  <w:t>3.50</w:t>
+                </w:r>
+              </w:sdtContent>
+            </w:sdt>
             <w:r>
               <w:rPr>
                 <w:rFonts w:hint="eastAsia" w:ascii="仿宋" w:hAnsi="仿宋" w:eastAsia="仿宋" w:cs="仿宋"/>
@@ -2435,7 +2709,7 @@
           </w:tcPr>
           <w:p>
             <w:pPr>
-              <w:spacing w:before="156" w:beforeLines="50" w:after="156" w:afterLines="50" w:line="360" w:lineRule="auto"/>
+              <w:spacing w:before="62" w:beforeLines="50" w:after="62" w:afterLines="50" w:line="144" w:lineRule="auto"/>
               <w:jc w:val="center"/>
               <w:rPr>
                 <w:rFonts w:hint="eastAsia" w:ascii="仿宋" w:hAnsi="仿宋" w:eastAsia="仿宋" w:cs="仿宋"/>
@@ -2470,7 +2744,7 @@
           </w:tcPr>
           <w:p>
             <w:pPr>
-              <w:spacing w:before="156" w:beforeLines="50"/>
+              <w:spacing w:before="62" w:beforeLines="50"/>
               <w:rPr>
                 <w:rFonts w:hint="eastAsia" w:ascii="仿宋" w:hAnsi="仿宋" w:eastAsia="仿宋" w:cs="仿宋"/>
                 <w:sz w:val="24"/>
@@ -2483,12 +2757,29 @@
                 <w:sz w:val="24"/>
                 <w:szCs w:val="32"/>
               </w:rPr>
-              <w:t>【评价等级】{{group.psychological_quality.level}}</w:t>
+              <w:t xml:space="preserve">【评价等级】</w:t>
             </w:r>
+            <w:sdt>
+              <w:sdtPr>
+                <w:alias w:val="group.psychological_quality.level"/>
+                <w:tag w:val="group.psychological_quality.level"/>
+                <w:text/>
+              </w:sdtPr>
+              <w:sdtContent>
+                <w:r>
+                  <w:rPr>
+                    <w:rFonts w:hint="eastAsia" w:ascii="仿宋" w:hAnsi="仿宋" w:eastAsia="仿宋" w:cs="仿宋"/>
+                    <w:sz w:val="24"/>
+                    <w:szCs w:val="32"/>
+                  </w:rPr>
+                  <w:t>较高分</w:t>
+                </w:r>
+              </w:sdtContent>
+            </w:sdt>
           </w:p>
           <w:p>
             <w:pPr>
-              <w:spacing w:before="156" w:beforeLines="50"/>
+              <w:spacing w:before="62" w:beforeLines="50"/>
               <w:rPr>
                 <w:rFonts w:hint="eastAsia" w:ascii="仿宋" w:hAnsi="仿宋" w:eastAsia="仿宋" w:cs="仿宋"/>
                 <w:sz w:val="24"/>
@@ -2506,7 +2797,7 @@
           </w:p>
           <w:p>
             <w:pPr>
-              <w:spacing w:before="156" w:beforeLines="50"/>
+              <w:spacing w:before="62" w:beforeLines="50"/>
               <w:rPr>
                 <w:rFonts w:hint="eastAsia" w:ascii="仿宋" w:hAnsi="仿宋" w:eastAsia="仿宋" w:cs="仿宋"/>
                 <w:b/>
@@ -2522,8 +2813,25 @@
                 <w:sz w:val="24"/>
                 <w:szCs w:val="32"/>
               </w:rPr>
-              <w:t>【维度说明】{{group.psychological_quality.description}}</w:t>
+              <w:t xml:space="preserve">【维度说明】</w:t>
             </w:r>
+            <w:sdt>
+              <w:sdtPr>
+                <w:alias w:val="group.psychological_quality.description"/>
+                <w:tag w:val="group.psychological_quality.description"/>
+                <w:text/>
+              </w:sdtPr>
+              <w:sdtContent>
+                <w:r>
+                  <w:rPr>
+                    <w:rFonts w:hint="eastAsia" w:ascii="仿宋" w:hAnsi="仿宋" w:eastAsia="仿宋" w:cs="仿宋"/>
+                    <w:sz w:val="24"/>
+                    <w:szCs w:val="32"/>
+                  </w:rPr>
+                  <w:t>此处显示心理素养说明。</w:t>
+                </w:r>
+              </w:sdtContent>
+            </w:sdt>
             <w:r>
               <w:rPr>
                 <w:rFonts w:hint="eastAsia" w:ascii="仿宋" w:hAnsi="仿宋" w:eastAsia="仿宋" w:cs="仿宋"/>
@@ -2611,7 +2919,7 @@
           <w:ilvl w:val="0"/>
           <w:numId w:val="1"/>
         </w:numPr>
-        <w:spacing w:before="312" w:beforeLines="100" w:after="312" w:afterLines="100" w:line="360" w:lineRule="auto"/>
+        <w:spacing w:before="125" w:beforeLines="100" w:after="125" w:afterLines="100" w:line="144" w:lineRule="auto"/>
         <w:ind w:left="420" w:hanging="420"/>
         <w:rPr>
           <w:rFonts w:hint="eastAsia" w:ascii="黑体" w:hAnsi="黑体" w:eastAsia="黑体" w:cs="黑体"/>
@@ -2636,7 +2944,7 @@
     </w:p>
     <w:p>
       <w:pPr>
-        <w:spacing w:line="360" w:lineRule="auto"/>
+        <w:spacing w:line="144" w:lineRule="auto"/>
         <w:rPr>
           <w:rFonts w:hint="eastAsia" w:ascii="仿宋" w:hAnsi="仿宋" w:eastAsia="仿宋" w:cs="仿宋"/>
           <w:b/>
@@ -2660,7 +2968,7 @@
     </w:p>
     <w:p>
       <w:pPr>
-        <w:spacing w:line="360" w:lineRule="auto"/>
+        <w:spacing w:line="144" w:lineRule="auto"/>
         <w:jc w:val="center"/>
         <w:rPr>
           <w:rFonts w:hint="eastAsia" w:ascii="仿宋" w:hAnsi="仿宋" w:eastAsia="仿宋" w:cs="仿宋"/>
@@ -2688,7 +2996,7 @@
     </w:p>
     <w:p>
       <w:pPr>
-        <w:spacing w:line="360" w:lineRule="auto"/>
+        <w:spacing w:line="144" w:lineRule="auto"/>
         <w:ind w:firstLine="442" w:firstLineChars="200"/>
         <w:rPr>
           <w:rFonts w:hint="eastAsia" w:ascii="仿宋" w:hAnsi="仿宋" w:eastAsia="仿宋" w:cs="仿宋"/>
@@ -2711,7 +3019,7 @@
     </w:p>
     <w:p>
       <w:pPr>
-        <w:spacing w:line="360" w:lineRule="auto"/>
+        <w:spacing w:line="144" w:lineRule="auto"/>
         <w:ind w:firstLine="440" w:firstLineChars="200"/>
         <w:rPr>
           <w:rFonts w:hint="eastAsia" w:ascii="仿宋" w:hAnsi="仿宋" w:eastAsia="仿宋" w:cs="仿宋"/>
@@ -2747,7 +3055,7 @@
     </w:p>
     <w:p>
       <w:pPr>
-        <w:spacing w:line="360" w:lineRule="auto"/>
+        <w:spacing w:line="144" w:lineRule="auto"/>
         <w:ind w:firstLine="440" w:firstLineChars="200"/>
         <w:rPr>
           <w:rFonts w:hint="eastAsia" w:ascii="仿宋" w:hAnsi="仿宋" w:eastAsia="仿宋" w:cs="仿宋"/>
@@ -2783,7 +3091,7 @@
     </w:p>
     <w:p>
       <w:pPr>
-        <w:spacing w:line="360" w:lineRule="auto"/>
+        <w:spacing w:line="144" w:lineRule="auto"/>
         <w:ind w:firstLine="440" w:firstLineChars="200"/>
         <w:rPr>
           <w:rFonts w:hint="eastAsia" w:ascii="仿宋" w:hAnsi="仿宋" w:eastAsia="仿宋" w:cs="仿宋"/>
@@ -2802,7 +3110,7 @@
     </w:p>
     <w:p>
       <w:pPr>
-        <w:spacing w:line="360" w:lineRule="auto"/>
+        <w:spacing w:line="144" w:lineRule="auto"/>
         <w:ind w:firstLine="440" w:firstLineChars="200"/>
         <w:rPr>
           <w:rFonts w:hint="eastAsia" w:ascii="仿宋" w:hAnsi="仿宋" w:eastAsia="仿宋" w:cs="仿宋"/>
@@ -2838,7 +3146,7 @@
     </w:p>
     <w:p>
       <w:pPr>
-        <w:spacing w:line="360" w:lineRule="auto"/>
+        <w:spacing w:line="144" w:lineRule="auto"/>
         <w:ind w:firstLine="440" w:firstLineChars="200"/>
         <w:rPr>
           <w:rFonts w:hint="eastAsia" w:ascii="仿宋" w:hAnsi="仿宋" w:eastAsia="仿宋" w:cs="仿宋"/>
@@ -2866,7 +3174,7 @@
     </w:p>
     <w:p>
       <w:pPr>
-        <w:spacing w:line="360" w:lineRule="auto"/>
+        <w:spacing w:line="144" w:lineRule="auto"/>
         <w:rPr>
           <w:rFonts w:hint="eastAsia" w:ascii="仿宋" w:hAnsi="仿宋" w:eastAsia="仿宋" w:cs="仿宋"/>
           <w:b/>
@@ -2926,7 +3234,7 @@
     </w:p>
     <w:p>
       <w:pPr>
-        <w:spacing w:line="360" w:lineRule="auto"/>
+        <w:spacing w:line="144" w:lineRule="auto"/>
         <w:rPr>
           <w:rFonts w:hint="eastAsia" w:ascii="仿宋" w:hAnsi="仿宋" w:eastAsia="仿宋" w:cs="仿宋"/>
           <w:b/>
@@ -3071,7 +3379,7 @@
                           <w:txbxContent>
                             <w:p>
                               <w:pPr>
-                                <w:spacing w:line="400" w:lineRule="exact"/>
+                                <w:spacing w:line="160" w:lineRule="exact"/>
                                 <w:jc w:val="center"/>
                                 <w:rPr>
                                   <w:rFonts w:hint="eastAsia" w:ascii="仿宋" w:hAnsi="仿宋" w:eastAsia="仿宋" w:cs="仿宋"/>
@@ -3148,7 +3456,7 @@
                     <w:txbxContent>
                       <w:p>
                         <w:pPr>
-                          <w:spacing w:line="400" w:lineRule="exact"/>
+                          <w:spacing w:line="160" w:lineRule="exact"/>
                           <w:jc w:val="center"/>
                           <w:rPr>
                             <w:rFonts w:hint="eastAsia" w:ascii="仿宋" w:hAnsi="仿宋" w:eastAsia="仿宋" w:cs="仿宋"/>
@@ -3233,7 +3541,7 @@
           </w:tcPr>
           <w:p>
             <w:pPr>
-              <w:spacing w:line="360" w:lineRule="auto"/>
+              <w:spacing w:line="144" w:lineRule="auto"/>
               <w:rPr>
                 <w:rFonts w:hint="eastAsia" w:ascii="仿宋" w:hAnsi="仿宋" w:eastAsia="仿宋" w:cs="仿宋"/>
                 <w:sz w:val="24"/>
@@ -3264,7 +3572,7 @@
           </w:tcPr>
           <w:p>
             <w:pPr>
-              <w:spacing w:line="360" w:lineRule="auto"/>
+              <w:spacing w:line="144" w:lineRule="auto"/>
               <w:rPr>
                 <w:rFonts w:hint="eastAsia" w:ascii="仿宋" w:hAnsi="仿宋" w:eastAsia="仿宋" w:cs="仿宋"/>
                 <w:b/>
@@ -3279,7 +3587,34 @@
                 <w:color w:val="000000"/>
                 <w:sz w:val="24"/>
               </w:rPr>
-              <w:t>测评得分：{{dimension.competency-a1-01.score}}分</w:t>
+              <w:t xml:space="preserve">测评得分：</w:t>
+            </w:r>
+            <w:sdt>
+              <w:sdtPr>
+                <w:alias w:val="dimension.competency-a1-01.score"/>
+                <w:tag w:val="dimension.competency-a1-01.score"/>
+                <w:text/>
+              </w:sdtPr>
+              <w:sdtContent>
+                <w:r>
+                  <w:rPr>
+                    <w:rFonts w:hint="eastAsia" w:ascii="仿宋" w:hAnsi="仿宋" w:eastAsia="仿宋" w:cs="仿宋"/>
+                    <w:b/>
+                    <w:color w:val="000000"/>
+                    <w:sz w:val="24"/>
+                  </w:rPr>
+                  <w:t>3.50</w:t>
+                </w:r>
+              </w:sdtContent>
+            </w:sdt>
+            <w:r>
+              <w:rPr>
+                <w:rFonts w:hint="eastAsia" w:ascii="仿宋" w:hAnsi="仿宋" w:eastAsia="仿宋" w:cs="仿宋"/>
+                <w:b/>
+                <w:color w:val="000000"/>
+                <w:sz w:val="24"/>
+              </w:rPr>
+              <w:t xml:space="preserve">分</w:t>
             </w:r>
             <w:r>
               <w:rPr>
@@ -3303,7 +3638,7 @@
           </w:p>
           <w:p>
             <w:pPr>
-              <w:spacing w:line="360" w:lineRule="auto"/>
+              <w:spacing w:line="144" w:lineRule="auto"/>
               <w:rPr>
                 <w:rFonts w:hint="eastAsia" w:ascii="仿宋" w:hAnsi="仿宋" w:eastAsia="仿宋" w:cs="仿宋"/>
                 <w:lang w:eastAsia="zh-CN"/>
@@ -3316,8 +3651,26 @@
                 <w:color w:val="000000"/>
                 <w:sz w:val="24"/>
               </w:rPr>
-              <w:t>评价等级：{{dimension.competency-a1-01.level}}</w:t>
+              <w:t xml:space="preserve">评价等级：</w:t>
             </w:r>
+            <w:sdt>
+              <w:sdtPr>
+                <w:alias w:val="dimension.competency-a1-01.level"/>
+                <w:tag w:val="dimension.competency-a1-01.level"/>
+                <w:text/>
+              </w:sdtPr>
+              <w:sdtContent>
+                <w:r>
+                  <w:rPr>
+                    <w:rFonts w:hint="eastAsia" w:ascii="仿宋" w:hAnsi="仿宋" w:eastAsia="仿宋" w:cs="仿宋"/>
+                    <w:b/>
+                    <w:color w:val="000000"/>
+                    <w:sz w:val="24"/>
+                  </w:rPr>
+                  <w:t>合格</w:t>
+                </w:r>
+              </w:sdtContent>
+            </w:sdt>
             <w:r>
               <w:rPr>
                 <w:rFonts w:hint="eastAsia" w:ascii="仿宋" w:hAnsi="仿宋" w:eastAsia="仿宋" w:cs="仿宋"/>
@@ -3350,7 +3703,7 @@
           </w:tblCellMar>
         </w:tblPrEx>
         <w:trPr>
-          <w:trHeight w:val="1417" w:hRule="atLeast"/>
+          <w:trHeight w:val="567" w:hRule="atLeast"/>
         </w:trPr>
         <w:tc>
           <w:tcPr>
@@ -3360,7 +3713,7 @@
           </w:tcPr>
           <w:p>
             <w:pPr>
-              <w:spacing w:line="360" w:lineRule="auto"/>
+              <w:spacing w:line="144" w:lineRule="auto"/>
               <w:rPr>
                 <w:rFonts w:hint="eastAsia" w:ascii="仿宋" w:hAnsi="仿宋" w:eastAsia="仿宋" w:cs="仿宋"/>
                 <w:sz w:val="24"/>
@@ -3373,15 +3726,33 @@
                 <w:sz w:val="22"/>
                 <w:szCs w:val="22"/>
               </w:rPr>
-              <w:t>【诊断】{{dimension.competency-a1-01.diagnosis}}</w:t>
+              <w:t xml:space="preserve">【诊断】</w:t>
             </w:r>
+            <w:sdt>
+              <w:sdtPr>
+                <w:alias w:val="dimension.competency-a1-01.diagnosis"/>
+                <w:tag w:val="dimension.competency-a1-01.diagnosis"/>
+                <w:text/>
+              </w:sdtPr>
+              <w:sdtContent>
+                <w:r>
+                  <w:rPr>
+                    <w:rFonts w:hint="eastAsia" w:ascii="仿宋" w:hAnsi="仿宋" w:eastAsia="仿宋" w:cs="仿宋"/>
+                    <w:color w:val="000000"/>
+                    <w:sz w:val="22"/>
+                    <w:szCs w:val="22"/>
+                  </w:rPr>
+                  <w:t>此处显示该维度的诊断与发展建议。</w:t>
+                </w:r>
+              </w:sdtContent>
+            </w:sdt>
           </w:p>
         </w:tc>
       </w:tr>
     </w:tbl>
     <w:p>
       <w:pPr>
-        <w:spacing w:line="360" w:lineRule="auto"/>
+        <w:spacing w:line="144" w:lineRule="auto"/>
         <w:rPr>
           <w:rFonts w:hint="eastAsia" w:ascii="仿宋" w:hAnsi="仿宋" w:eastAsia="仿宋" w:cs="仿宋"/>
           <w:b/>
@@ -3526,7 +3897,7 @@
                           <w:txbxContent>
                             <w:p>
                               <w:pPr>
-                                <w:spacing w:line="400" w:lineRule="exact"/>
+                                <w:spacing w:line="160" w:lineRule="exact"/>
                                 <w:jc w:val="center"/>
                                 <w:rPr>
                                   <w:rFonts w:hint="eastAsia" w:ascii="仿宋" w:hAnsi="仿宋" w:eastAsia="仿宋" w:cs="仿宋"/>
@@ -3603,7 +3974,7 @@
                     <w:txbxContent>
                       <w:p>
                         <w:pPr>
-                          <w:spacing w:line="400" w:lineRule="exact"/>
+                          <w:spacing w:line="160" w:lineRule="exact"/>
                           <w:jc w:val="center"/>
                           <w:rPr>
                             <w:rFonts w:hint="eastAsia" w:ascii="仿宋" w:hAnsi="仿宋" w:eastAsia="仿宋" w:cs="仿宋"/>
@@ -3688,7 +4059,7 @@
           </w:tcPr>
           <w:p>
             <w:pPr>
-              <w:spacing w:line="360" w:lineRule="auto"/>
+              <w:spacing w:line="144" w:lineRule="auto"/>
               <w:rPr>
                 <w:rFonts w:hint="eastAsia" w:ascii="仿宋" w:hAnsi="仿宋" w:eastAsia="仿宋" w:cs="仿宋"/>
                 <w:sz w:val="24"/>
@@ -3719,7 +4090,7 @@
           </w:tcPr>
           <w:p>
             <w:pPr>
-              <w:spacing w:line="360" w:lineRule="auto"/>
+              <w:spacing w:line="144" w:lineRule="auto"/>
               <w:rPr>
                 <w:rFonts w:hint="eastAsia" w:ascii="仿宋" w:hAnsi="仿宋" w:eastAsia="仿宋" w:cs="仿宋"/>
                 <w:b/>
@@ -3734,7 +4105,34 @@
                 <w:color w:val="000000"/>
                 <w:sz w:val="24"/>
               </w:rPr>
-              <w:t>测评得分：{{dimension.competency-a1-02.score}}分</w:t>
+              <w:t xml:space="preserve">测评得分：</w:t>
+            </w:r>
+            <w:sdt>
+              <w:sdtPr>
+                <w:alias w:val="dimension.competency-a1-02.score"/>
+                <w:tag w:val="dimension.competency-a1-02.score"/>
+                <w:text/>
+              </w:sdtPr>
+              <w:sdtContent>
+                <w:r>
+                  <w:rPr>
+                    <w:rFonts w:hint="eastAsia" w:ascii="仿宋" w:hAnsi="仿宋" w:eastAsia="仿宋" w:cs="仿宋"/>
+                    <w:b/>
+                    <w:color w:val="000000"/>
+                    <w:sz w:val="24"/>
+                  </w:rPr>
+                  <w:t>3.50</w:t>
+                </w:r>
+              </w:sdtContent>
+            </w:sdt>
+            <w:r>
+              <w:rPr>
+                <w:rFonts w:hint="eastAsia" w:ascii="仿宋" w:hAnsi="仿宋" w:eastAsia="仿宋" w:cs="仿宋"/>
+                <w:b/>
+                <w:color w:val="000000"/>
+                <w:sz w:val="24"/>
+              </w:rPr>
+              <w:t xml:space="preserve">分</w:t>
             </w:r>
             <w:r>
               <w:rPr>
@@ -3758,7 +4156,7 @@
           </w:p>
           <w:p>
             <w:pPr>
-              <w:spacing w:line="360" w:lineRule="auto"/>
+              <w:spacing w:line="144" w:lineRule="auto"/>
               <w:rPr>
                 <w:rFonts w:hint="eastAsia" w:ascii="仿宋" w:hAnsi="仿宋" w:eastAsia="仿宋" w:cs="仿宋"/>
                 <w:lang w:val="en-US" w:eastAsia="zh-CN"/>
@@ -3771,8 +4169,26 @@
                 <w:color w:val="000000"/>
                 <w:sz w:val="24"/>
               </w:rPr>
-              <w:t>评价等级：{{dimension.competency-a1-02.level}}</w:t>
+              <w:t xml:space="preserve">评价等级：</w:t>
             </w:r>
+            <w:sdt>
+              <w:sdtPr>
+                <w:alias w:val="dimension.competency-a1-02.level"/>
+                <w:tag w:val="dimension.competency-a1-02.level"/>
+                <w:text/>
+              </w:sdtPr>
+              <w:sdtContent>
+                <w:r>
+                  <w:rPr>
+                    <w:rFonts w:hint="eastAsia" w:ascii="仿宋" w:hAnsi="仿宋" w:eastAsia="仿宋" w:cs="仿宋"/>
+                    <w:b/>
+                    <w:color w:val="000000"/>
+                    <w:sz w:val="24"/>
+                  </w:rPr>
+                  <w:t>合格</w:t>
+                </w:r>
+              </w:sdtContent>
+            </w:sdt>
             <w:r>
               <w:rPr>
                 <w:rFonts w:hint="eastAsia" w:ascii="仿宋" w:hAnsi="仿宋" w:eastAsia="仿宋" w:cs="仿宋"/>
@@ -3805,7 +4221,7 @@
           </w:tblCellMar>
         </w:tblPrEx>
         <w:trPr>
-          <w:trHeight w:val="1417" w:hRule="atLeast"/>
+          <w:trHeight w:val="567" w:hRule="atLeast"/>
         </w:trPr>
         <w:tc>
           <w:tcPr>
@@ -3815,7 +4231,7 @@
           </w:tcPr>
           <w:p>
             <w:pPr>
-              <w:spacing w:line="360" w:lineRule="auto"/>
+              <w:spacing w:line="144" w:lineRule="auto"/>
               <w:rPr>
                 <w:rFonts w:hint="eastAsia" w:ascii="仿宋" w:hAnsi="仿宋" w:eastAsia="仿宋" w:cs="仿宋"/>
                 <w:sz w:val="24"/>
@@ -3828,15 +4244,33 @@
                 <w:sz w:val="22"/>
                 <w:szCs w:val="22"/>
               </w:rPr>
-              <w:t>【诊断】{{dimension.competency-a1-02.diagnosis}}</w:t>
+              <w:t xml:space="preserve">【诊断】</w:t>
             </w:r>
+            <w:sdt>
+              <w:sdtPr>
+                <w:alias w:val="dimension.competency-a1-02.diagnosis"/>
+                <w:tag w:val="dimension.competency-a1-02.diagnosis"/>
+                <w:text/>
+              </w:sdtPr>
+              <w:sdtContent>
+                <w:r>
+                  <w:rPr>
+                    <w:rFonts w:hint="eastAsia" w:ascii="仿宋" w:hAnsi="仿宋" w:eastAsia="仿宋" w:cs="仿宋"/>
+                    <w:color w:val="000000"/>
+                    <w:sz w:val="22"/>
+                    <w:szCs w:val="22"/>
+                  </w:rPr>
+                  <w:t>此处显示该维度的诊断与发展建议。</w:t>
+                </w:r>
+              </w:sdtContent>
+            </w:sdt>
           </w:p>
         </w:tc>
       </w:tr>
     </w:tbl>
     <w:p>
       <w:pPr>
-        <w:spacing w:line="360" w:lineRule="auto"/>
+        <w:spacing w:line="144" w:lineRule="auto"/>
         <w:rPr>
           <w:rFonts w:hint="eastAsia" w:ascii="仿宋" w:hAnsi="仿宋" w:eastAsia="仿宋" w:cs="仿宋"/>
           <w:b/>
@@ -3981,7 +4415,7 @@
                           <w:txbxContent>
                             <w:p>
                               <w:pPr>
-                                <w:spacing w:line="400" w:lineRule="exact"/>
+                                <w:spacing w:line="160" w:lineRule="exact"/>
                                 <w:jc w:val="center"/>
                                 <w:rPr>
                                   <w:rFonts w:hint="eastAsia" w:ascii="仿宋" w:hAnsi="仿宋" w:eastAsia="仿宋" w:cs="仿宋"/>
@@ -4058,7 +4492,7 @@
                     <w:txbxContent>
                       <w:p>
                         <w:pPr>
-                          <w:spacing w:line="400" w:lineRule="exact"/>
+                          <w:spacing w:line="160" w:lineRule="exact"/>
                           <w:jc w:val="center"/>
                           <w:rPr>
                             <w:rFonts w:hint="eastAsia" w:ascii="仿宋" w:hAnsi="仿宋" w:eastAsia="仿宋" w:cs="仿宋"/>
@@ -4142,7 +4576,7 @@
           </w:tcPr>
           <w:p>
             <w:pPr>
-              <w:spacing w:line="360" w:lineRule="auto"/>
+              <w:spacing w:line="144" w:lineRule="auto"/>
               <w:rPr>
                 <w:rFonts w:hint="eastAsia" w:ascii="仿宋" w:hAnsi="仿宋" w:eastAsia="仿宋" w:cs="仿宋"/>
                 <w:sz w:val="24"/>
@@ -4173,7 +4607,7 @@
           </w:tcPr>
           <w:p>
             <w:pPr>
-              <w:spacing w:line="360" w:lineRule="auto"/>
+              <w:spacing w:line="144" w:lineRule="auto"/>
               <w:rPr>
                 <w:rFonts w:hint="eastAsia" w:ascii="仿宋" w:hAnsi="仿宋" w:eastAsia="仿宋" w:cs="仿宋"/>
                 <w:b/>
@@ -4188,7 +4622,34 @@
                 <w:color w:val="000000"/>
                 <w:sz w:val="24"/>
               </w:rPr>
-              <w:t>测评得分：{{dimension.competency-a1-03.score}}分</w:t>
+              <w:t xml:space="preserve">测评得分：</w:t>
+            </w:r>
+            <w:sdt>
+              <w:sdtPr>
+                <w:alias w:val="dimension.competency-a1-03.score"/>
+                <w:tag w:val="dimension.competency-a1-03.score"/>
+                <w:text/>
+              </w:sdtPr>
+              <w:sdtContent>
+                <w:r>
+                  <w:rPr>
+                    <w:rFonts w:hint="eastAsia" w:ascii="仿宋" w:hAnsi="仿宋" w:eastAsia="仿宋" w:cs="仿宋"/>
+                    <w:b/>
+                    <w:color w:val="000000"/>
+                    <w:sz w:val="24"/>
+                  </w:rPr>
+                  <w:t>3.50</w:t>
+                </w:r>
+              </w:sdtContent>
+            </w:sdt>
+            <w:r>
+              <w:rPr>
+                <w:rFonts w:hint="eastAsia" w:ascii="仿宋" w:hAnsi="仿宋" w:eastAsia="仿宋" w:cs="仿宋"/>
+                <w:b/>
+                <w:color w:val="000000"/>
+                <w:sz w:val="24"/>
+              </w:rPr>
+              <w:t xml:space="preserve">分</w:t>
             </w:r>
             <w:r>
               <w:rPr>
@@ -4212,7 +4673,7 @@
           </w:p>
           <w:p>
             <w:pPr>
-              <w:spacing w:line="360" w:lineRule="auto"/>
+              <w:spacing w:line="144" w:lineRule="auto"/>
               <w:rPr>
                 <w:rFonts w:hint="eastAsia" w:ascii="仿宋" w:hAnsi="仿宋" w:eastAsia="仿宋" w:cs="仿宋"/>
               </w:rPr>
@@ -4224,8 +4685,26 @@
                 <w:color w:val="000000"/>
                 <w:sz w:val="24"/>
               </w:rPr>
-              <w:t>评价等级：{{dimension.competency-a1-03.level}}</w:t>
+              <w:t xml:space="preserve">评价等级：</w:t>
             </w:r>
+            <w:sdt>
+              <w:sdtPr>
+                <w:alias w:val="dimension.competency-a1-03.level"/>
+                <w:tag w:val="dimension.competency-a1-03.level"/>
+                <w:text/>
+              </w:sdtPr>
+              <w:sdtContent>
+                <w:r>
+                  <w:rPr>
+                    <w:rFonts w:hint="eastAsia" w:ascii="仿宋" w:hAnsi="仿宋" w:eastAsia="仿宋" w:cs="仿宋"/>
+                    <w:b/>
+                    <w:color w:val="000000"/>
+                    <w:sz w:val="24"/>
+                  </w:rPr>
+                  <w:t>合格</w:t>
+                </w:r>
+              </w:sdtContent>
+            </w:sdt>
           </w:p>
         </w:tc>
       </w:tr>
@@ -4248,7 +4727,7 @@
           </w:tblCellMar>
         </w:tblPrEx>
         <w:trPr>
-          <w:trHeight w:val="1417" w:hRule="atLeast"/>
+          <w:trHeight w:val="567" w:hRule="atLeast"/>
         </w:trPr>
         <w:tc>
           <w:tcPr>
@@ -4258,7 +4737,7 @@
           </w:tcPr>
           <w:p>
             <w:pPr>
-              <w:spacing w:line="360" w:lineRule="auto"/>
+              <w:spacing w:line="144" w:lineRule="auto"/>
               <w:rPr>
                 <w:rFonts w:hint="eastAsia" w:ascii="仿宋" w:hAnsi="仿宋" w:eastAsia="仿宋" w:cs="仿宋"/>
                 <w:sz w:val="24"/>
@@ -4271,15 +4750,33 @@
                 <w:sz w:val="22"/>
                 <w:szCs w:val="22"/>
               </w:rPr>
-              <w:t>【诊断】{{dimension.competency-a1-03.diagnosis}}</w:t>
+              <w:t xml:space="preserve">【诊断】</w:t>
             </w:r>
+            <w:sdt>
+              <w:sdtPr>
+                <w:alias w:val="dimension.competency-a1-03.diagnosis"/>
+                <w:tag w:val="dimension.competency-a1-03.diagnosis"/>
+                <w:text/>
+              </w:sdtPr>
+              <w:sdtContent>
+                <w:r>
+                  <w:rPr>
+                    <w:rFonts w:hint="eastAsia" w:ascii="仿宋" w:hAnsi="仿宋" w:eastAsia="仿宋" w:cs="仿宋"/>
+                    <w:color w:val="000000"/>
+                    <w:sz w:val="22"/>
+                    <w:szCs w:val="22"/>
+                  </w:rPr>
+                  <w:t>此处显示该维度的诊断与发展建议。</w:t>
+                </w:r>
+              </w:sdtContent>
+            </w:sdt>
           </w:p>
         </w:tc>
       </w:tr>
     </w:tbl>
     <w:p>
       <w:pPr>
-        <w:spacing w:line="360" w:lineRule="auto"/>
+        <w:spacing w:line="144" w:lineRule="auto"/>
         <w:rPr>
           <w:rFonts w:hint="eastAsia" w:ascii="仿宋" w:hAnsi="仿宋" w:eastAsia="仿宋" w:cs="仿宋"/>
           <w:b/>
@@ -4424,7 +4921,7 @@
                           <w:txbxContent>
                             <w:p>
                               <w:pPr>
-                                <w:spacing w:line="400" w:lineRule="exact"/>
+                                <w:spacing w:line="160" w:lineRule="exact"/>
                                 <w:jc w:val="center"/>
                                 <w:rPr>
                                   <w:rFonts w:hint="eastAsia" w:ascii="仿宋" w:hAnsi="仿宋" w:eastAsia="仿宋" w:cs="仿宋"/>
@@ -4501,7 +4998,7 @@
                     <w:txbxContent>
                       <w:p>
                         <w:pPr>
-                          <w:spacing w:line="400" w:lineRule="exact"/>
+                          <w:spacing w:line="160" w:lineRule="exact"/>
                           <w:jc w:val="center"/>
                           <w:rPr>
                             <w:rFonts w:hint="eastAsia" w:ascii="仿宋" w:hAnsi="仿宋" w:eastAsia="仿宋" w:cs="仿宋"/>
@@ -4586,7 +5083,7 @@
           </w:tcPr>
           <w:p>
             <w:pPr>
-              <w:spacing w:line="360" w:lineRule="auto"/>
+              <w:spacing w:line="144" w:lineRule="auto"/>
               <w:rPr>
                 <w:rFonts w:hint="eastAsia" w:ascii="仿宋" w:hAnsi="仿宋" w:eastAsia="仿宋" w:cs="仿宋"/>
                 <w:sz w:val="24"/>
@@ -4617,7 +5114,7 @@
           </w:tcPr>
           <w:p>
             <w:pPr>
-              <w:spacing w:line="360" w:lineRule="auto"/>
+              <w:spacing w:line="144" w:lineRule="auto"/>
               <w:rPr>
                 <w:rFonts w:hint="eastAsia" w:ascii="仿宋" w:hAnsi="仿宋" w:eastAsia="仿宋" w:cs="仿宋"/>
                 <w:b/>
@@ -4632,7 +5129,34 @@
                 <w:color w:val="000000"/>
                 <w:sz w:val="24"/>
               </w:rPr>
-              <w:t>测评得分：{{dimension.competency-a1-04.score}}分</w:t>
+              <w:t xml:space="preserve">测评得分：</w:t>
+            </w:r>
+            <w:sdt>
+              <w:sdtPr>
+                <w:alias w:val="dimension.competency-a1-04.score"/>
+                <w:tag w:val="dimension.competency-a1-04.score"/>
+                <w:text/>
+              </w:sdtPr>
+              <w:sdtContent>
+                <w:r>
+                  <w:rPr>
+                    <w:rFonts w:hint="eastAsia" w:ascii="仿宋" w:hAnsi="仿宋" w:eastAsia="仿宋" w:cs="仿宋"/>
+                    <w:b/>
+                    <w:color w:val="000000"/>
+                    <w:sz w:val="24"/>
+                  </w:rPr>
+                  <w:t>3.50</w:t>
+                </w:r>
+              </w:sdtContent>
+            </w:sdt>
+            <w:r>
+              <w:rPr>
+                <w:rFonts w:hint="eastAsia" w:ascii="仿宋" w:hAnsi="仿宋" w:eastAsia="仿宋" w:cs="仿宋"/>
+                <w:b/>
+                <w:color w:val="000000"/>
+                <w:sz w:val="24"/>
+              </w:rPr>
+              <w:t xml:space="preserve">分</w:t>
             </w:r>
             <w:r>
               <w:rPr>
@@ -4656,7 +5180,7 @@
           </w:p>
           <w:p>
             <w:pPr>
-              <w:spacing w:line="360" w:lineRule="auto"/>
+              <w:spacing w:line="144" w:lineRule="auto"/>
               <w:rPr>
                 <w:rFonts w:hint="eastAsia" w:ascii="仿宋" w:hAnsi="仿宋" w:eastAsia="仿宋" w:cs="仿宋"/>
                 <w:lang w:eastAsia="zh-CN"/>
@@ -4669,8 +5193,26 @@
                 <w:color w:val="000000"/>
                 <w:sz w:val="24"/>
               </w:rPr>
-              <w:t>评价等级：{{dimension.competency-a1-04.level}}</w:t>
+              <w:t xml:space="preserve">评价等级：</w:t>
             </w:r>
+            <w:sdt>
+              <w:sdtPr>
+                <w:alias w:val="dimension.competency-a1-04.level"/>
+                <w:tag w:val="dimension.competency-a1-04.level"/>
+                <w:text/>
+              </w:sdtPr>
+              <w:sdtContent>
+                <w:r>
+                  <w:rPr>
+                    <w:rFonts w:hint="eastAsia" w:ascii="仿宋" w:hAnsi="仿宋" w:eastAsia="仿宋" w:cs="仿宋"/>
+                    <w:b/>
+                    <w:color w:val="000000"/>
+                    <w:sz w:val="24"/>
+                  </w:rPr>
+                  <w:t>合格</w:t>
+                </w:r>
+              </w:sdtContent>
+            </w:sdt>
             <w:r>
               <w:rPr>
                 <w:rFonts w:hint="eastAsia" w:ascii="仿宋" w:hAnsi="仿宋" w:eastAsia="仿宋" w:cs="仿宋"/>
@@ -4703,7 +5245,7 @@
           </w:tblCellMar>
         </w:tblPrEx>
         <w:trPr>
-          <w:trHeight w:val="1417" w:hRule="atLeast"/>
+          <w:trHeight w:val="567" w:hRule="atLeast"/>
         </w:trPr>
         <w:tc>
           <w:tcPr>
@@ -4713,7 +5255,7 @@
           </w:tcPr>
           <w:p>
             <w:pPr>
-              <w:spacing w:line="360" w:lineRule="auto"/>
+              <w:spacing w:line="144" w:lineRule="auto"/>
               <w:rPr>
                 <w:rFonts w:hint="eastAsia" w:ascii="仿宋" w:hAnsi="仿宋" w:eastAsia="仿宋" w:cs="仿宋"/>
                 <w:sz w:val="24"/>
@@ -4726,15 +5268,33 @@
                 <w:sz w:val="22"/>
                 <w:szCs w:val="22"/>
               </w:rPr>
-              <w:t>【诊断】{{dimension.competency-a1-04.diagnosis}}</w:t>
+              <w:t xml:space="preserve">【诊断】</w:t>
             </w:r>
+            <w:sdt>
+              <w:sdtPr>
+                <w:alias w:val="dimension.competency-a1-04.diagnosis"/>
+                <w:tag w:val="dimension.competency-a1-04.diagnosis"/>
+                <w:text/>
+              </w:sdtPr>
+              <w:sdtContent>
+                <w:r>
+                  <w:rPr>
+                    <w:rFonts w:hint="eastAsia" w:ascii="仿宋" w:hAnsi="仿宋" w:eastAsia="仿宋" w:cs="仿宋"/>
+                    <w:color w:val="000000"/>
+                    <w:sz w:val="22"/>
+                    <w:szCs w:val="22"/>
+                  </w:rPr>
+                  <w:t>此处显示该维度的诊断与发展建议。</w:t>
+                </w:r>
+              </w:sdtContent>
+            </w:sdt>
           </w:p>
         </w:tc>
       </w:tr>
     </w:tbl>
     <w:p>
       <w:pPr>
-        <w:spacing w:line="360" w:lineRule="auto"/>
+        <w:spacing w:line="144" w:lineRule="auto"/>
         <w:rPr>
           <w:rFonts w:hint="eastAsia" w:ascii="仿宋" w:hAnsi="仿宋" w:eastAsia="仿宋" w:cs="仿宋"/>
           <w:b/>
@@ -4879,7 +5439,7 @@
                           <w:txbxContent>
                             <w:p>
                               <w:pPr>
-                                <w:spacing w:line="400" w:lineRule="exact"/>
+                                <w:spacing w:line="160" w:lineRule="exact"/>
                                 <w:jc w:val="center"/>
                                 <w:rPr>
                                   <w:rFonts w:hint="eastAsia" w:ascii="仿宋" w:hAnsi="仿宋" w:eastAsia="仿宋" w:cs="仿宋"/>
@@ -4956,7 +5516,7 @@
                     <w:txbxContent>
                       <w:p>
                         <w:pPr>
-                          <w:spacing w:line="400" w:lineRule="exact"/>
+                          <w:spacing w:line="160" w:lineRule="exact"/>
                           <w:jc w:val="center"/>
                           <w:rPr>
                             <w:rFonts w:hint="eastAsia" w:ascii="仿宋" w:hAnsi="仿宋" w:eastAsia="仿宋" w:cs="仿宋"/>
@@ -5041,7 +5601,7 @@
           </w:tcPr>
           <w:p>
             <w:pPr>
-              <w:spacing w:line="360" w:lineRule="auto"/>
+              <w:spacing w:line="144" w:lineRule="auto"/>
               <w:rPr>
                 <w:rFonts w:hint="eastAsia" w:ascii="仿宋" w:hAnsi="仿宋" w:eastAsia="仿宋" w:cs="仿宋"/>
                 <w:sz w:val="24"/>
@@ -5072,7 +5632,7 @@
           </w:tcPr>
           <w:p>
             <w:pPr>
-              <w:spacing w:line="360" w:lineRule="auto"/>
+              <w:spacing w:line="144" w:lineRule="auto"/>
               <w:rPr>
                 <w:rFonts w:hint="eastAsia" w:ascii="仿宋" w:hAnsi="仿宋" w:eastAsia="仿宋" w:cs="仿宋"/>
                 <w:b/>
@@ -5087,7 +5647,34 @@
                 <w:color w:val="000000"/>
                 <w:sz w:val="24"/>
               </w:rPr>
-              <w:t>测评得分：{{dimension.competency-a1-05.score}}分</w:t>
+              <w:t xml:space="preserve">测评得分：</w:t>
+            </w:r>
+            <w:sdt>
+              <w:sdtPr>
+                <w:alias w:val="dimension.competency-a1-05.score"/>
+                <w:tag w:val="dimension.competency-a1-05.score"/>
+                <w:text/>
+              </w:sdtPr>
+              <w:sdtContent>
+                <w:r>
+                  <w:rPr>
+                    <w:rFonts w:hint="eastAsia" w:ascii="仿宋" w:hAnsi="仿宋" w:eastAsia="仿宋" w:cs="仿宋"/>
+                    <w:b/>
+                    <w:color w:val="000000"/>
+                    <w:sz w:val="24"/>
+                  </w:rPr>
+                  <w:t>3.50</w:t>
+                </w:r>
+              </w:sdtContent>
+            </w:sdt>
+            <w:r>
+              <w:rPr>
+                <w:rFonts w:hint="eastAsia" w:ascii="仿宋" w:hAnsi="仿宋" w:eastAsia="仿宋" w:cs="仿宋"/>
+                <w:b/>
+                <w:color w:val="000000"/>
+                <w:sz w:val="24"/>
+              </w:rPr>
+              <w:t xml:space="preserve">分</w:t>
             </w:r>
             <w:r>
               <w:rPr>
@@ -5111,7 +5698,7 @@
           </w:p>
           <w:p>
             <w:pPr>
-              <w:spacing w:line="360" w:lineRule="auto"/>
+              <w:spacing w:line="144" w:lineRule="auto"/>
               <w:rPr>
                 <w:rFonts w:hint="eastAsia" w:ascii="仿宋" w:hAnsi="仿宋" w:eastAsia="仿宋" w:cs="仿宋"/>
                 <w:lang w:val="en-US" w:eastAsia="zh-CN"/>
@@ -5124,8 +5711,26 @@
                 <w:color w:val="000000"/>
                 <w:sz w:val="24"/>
               </w:rPr>
-              <w:t>评价等级：{{dimension.competency-a1-05.level}}</w:t>
+              <w:t xml:space="preserve">评价等级：</w:t>
             </w:r>
+            <w:sdt>
+              <w:sdtPr>
+                <w:alias w:val="dimension.competency-a1-05.level"/>
+                <w:tag w:val="dimension.competency-a1-05.level"/>
+                <w:text/>
+              </w:sdtPr>
+              <w:sdtContent>
+                <w:r>
+                  <w:rPr>
+                    <w:rFonts w:hint="eastAsia" w:ascii="仿宋" w:hAnsi="仿宋" w:eastAsia="仿宋" w:cs="仿宋"/>
+                    <w:b/>
+                    <w:color w:val="000000"/>
+                    <w:sz w:val="24"/>
+                  </w:rPr>
+                  <w:t>合格</w:t>
+                </w:r>
+              </w:sdtContent>
+            </w:sdt>
             <w:r>
               <w:rPr>
                 <w:rFonts w:hint="eastAsia" w:ascii="仿宋" w:hAnsi="仿宋" w:eastAsia="仿宋" w:cs="仿宋"/>
@@ -5157,7 +5762,7 @@
           </w:tblCellMar>
         </w:tblPrEx>
         <w:trPr>
-          <w:trHeight w:val="1417" w:hRule="atLeast"/>
+          <w:trHeight w:val="567" w:hRule="atLeast"/>
         </w:trPr>
         <w:tc>
           <w:tcPr>
@@ -5167,7 +5772,7 @@
           </w:tcPr>
           <w:p>
             <w:pPr>
-              <w:spacing w:line="360" w:lineRule="auto"/>
+              <w:spacing w:line="144" w:lineRule="auto"/>
               <w:rPr>
                 <w:rFonts w:hint="eastAsia" w:ascii="仿宋" w:hAnsi="仿宋" w:eastAsia="仿宋" w:cs="仿宋"/>
                 <w:sz w:val="24"/>
@@ -5180,8 +5785,26 @@
                 <w:sz w:val="22"/>
                 <w:szCs w:val="22"/>
               </w:rPr>
-              <w:t>【诊断】{{dimension.competency-a1-05.diagnosis}}</w:t>
+              <w:t xml:space="preserve">【诊断】</w:t>
             </w:r>
+            <w:sdt>
+              <w:sdtPr>
+                <w:alias w:val="dimension.competency-a1-05.diagnosis"/>
+                <w:tag w:val="dimension.competency-a1-05.diagnosis"/>
+                <w:text/>
+              </w:sdtPr>
+              <w:sdtContent>
+                <w:r>
+                  <w:rPr>
+                    <w:rFonts w:hint="eastAsia" w:ascii="仿宋" w:hAnsi="仿宋" w:eastAsia="仿宋" w:cs="仿宋"/>
+                    <w:color w:val="000000"/>
+                    <w:sz w:val="22"/>
+                    <w:szCs w:val="22"/>
+                  </w:rPr>
+                  <w:t>此处显示该维度的诊断与发展建议。</w:t>
+                </w:r>
+              </w:sdtContent>
+            </w:sdt>
           </w:p>
         </w:tc>
       </w:tr>
@@ -5235,7 +5858,7 @@
     </w:p>
     <w:p>
       <w:pPr>
-        <w:spacing w:line="360" w:lineRule="auto"/>
+        <w:spacing w:line="144" w:lineRule="auto"/>
         <w:rPr>
           <w:rFonts w:hint="eastAsia" w:ascii="仿宋" w:hAnsi="仿宋" w:eastAsia="仿宋" w:cs="仿宋"/>
           <w:b/>
@@ -5380,7 +6003,7 @@
                           <w:txbxContent>
                             <w:p>
                               <w:pPr>
-                                <w:spacing w:line="400" w:lineRule="exact"/>
+                                <w:spacing w:line="160" w:lineRule="exact"/>
                                 <w:jc w:val="center"/>
                                 <w:rPr>
                                   <w:rFonts w:hint="eastAsia" w:ascii="仿宋" w:hAnsi="仿宋" w:eastAsia="仿宋" w:cs="仿宋"/>
@@ -5457,7 +6080,7 @@
                     <w:txbxContent>
                       <w:p>
                         <w:pPr>
-                          <w:spacing w:line="400" w:lineRule="exact"/>
+                          <w:spacing w:line="160" w:lineRule="exact"/>
                           <w:jc w:val="center"/>
                           <w:rPr>
                             <w:rFonts w:hint="eastAsia" w:ascii="仿宋" w:hAnsi="仿宋" w:eastAsia="仿宋" w:cs="仿宋"/>
@@ -5542,7 +6165,7 @@
           </w:tcPr>
           <w:p>
             <w:pPr>
-              <w:spacing w:line="360" w:lineRule="auto"/>
+              <w:spacing w:line="144" w:lineRule="auto"/>
               <w:rPr>
                 <w:rFonts w:hint="eastAsia" w:ascii="仿宋" w:hAnsi="仿宋" w:eastAsia="仿宋" w:cs="仿宋"/>
                 <w:sz w:val="24"/>
@@ -5576,7 +6199,7 @@
           </w:tcPr>
           <w:p>
             <w:pPr>
-              <w:spacing w:line="360" w:lineRule="auto"/>
+              <w:spacing w:line="144" w:lineRule="auto"/>
               <w:rPr>
                 <w:rFonts w:hint="eastAsia" w:ascii="仿宋" w:hAnsi="仿宋" w:eastAsia="仿宋" w:cs="仿宋"/>
                 <w:b/>
@@ -5591,12 +6214,39 @@
                 <w:color w:val="000000"/>
                 <w:sz w:val="24"/>
               </w:rPr>
-              <w:t>测评得分：{{dimension.competency-b1-01.score}}分</w:t>
+              <w:t xml:space="preserve">测评得分：</w:t>
+            </w:r>
+            <w:sdt>
+              <w:sdtPr>
+                <w:alias w:val="dimension.competency-b1-01.score"/>
+                <w:tag w:val="dimension.competency-b1-01.score"/>
+                <w:text/>
+              </w:sdtPr>
+              <w:sdtContent>
+                <w:r>
+                  <w:rPr>
+                    <w:rFonts w:hint="eastAsia" w:ascii="仿宋" w:hAnsi="仿宋" w:eastAsia="仿宋" w:cs="仿宋"/>
+                    <w:b/>
+                    <w:color w:val="000000"/>
+                    <w:sz w:val="24"/>
+                  </w:rPr>
+                  <w:t>3.50</w:t>
+                </w:r>
+              </w:sdtContent>
+            </w:sdt>
+            <w:r>
+              <w:rPr>
+                <w:rFonts w:hint="eastAsia" w:ascii="仿宋" w:hAnsi="仿宋" w:eastAsia="仿宋" w:cs="仿宋"/>
+                <w:b/>
+                <w:color w:val="000000"/>
+                <w:sz w:val="24"/>
+              </w:rPr>
+              <w:t xml:space="preserve">分</w:t>
             </w:r>
           </w:p>
           <w:p>
             <w:pPr>
-              <w:spacing w:line="360" w:lineRule="auto"/>
+              <w:spacing w:line="144" w:lineRule="auto"/>
               <w:rPr>
                 <w:rFonts w:hint="eastAsia" w:ascii="仿宋" w:hAnsi="仿宋" w:eastAsia="仿宋" w:cs="仿宋"/>
                 <w:lang w:val="en-US" w:eastAsia="zh-CN"/>
@@ -5609,8 +6259,26 @@
                 <w:color w:val="000000"/>
                 <w:sz w:val="24"/>
               </w:rPr>
-              <w:t>评价等级：{{dimension.competency-b1-01.level}}</w:t>
+              <w:t xml:space="preserve">评价等级：</w:t>
             </w:r>
+            <w:sdt>
+              <w:sdtPr>
+                <w:alias w:val="dimension.competency-b1-01.level"/>
+                <w:tag w:val="dimension.competency-b1-01.level"/>
+                <w:text/>
+              </w:sdtPr>
+              <w:sdtContent>
+                <w:r>
+                  <w:rPr>
+                    <w:rFonts w:hint="eastAsia" w:ascii="仿宋" w:hAnsi="仿宋" w:eastAsia="仿宋" w:cs="仿宋"/>
+                    <w:b/>
+                    <w:color w:val="000000"/>
+                    <w:sz w:val="24"/>
+                  </w:rPr>
+                  <w:t>合格</w:t>
+                </w:r>
+              </w:sdtContent>
+            </w:sdt>
             <w:r>
               <w:rPr>
                 <w:rFonts w:hint="eastAsia" w:ascii="仿宋" w:hAnsi="仿宋" w:eastAsia="仿宋" w:cs="仿宋"/>
@@ -5642,7 +6310,7 @@
           </w:tblCellMar>
         </w:tblPrEx>
         <w:trPr>
-          <w:trHeight w:val="1417" w:hRule="atLeast"/>
+          <w:trHeight w:val="567" w:hRule="atLeast"/>
         </w:trPr>
         <w:tc>
           <w:tcPr>
@@ -5652,7 +6320,7 @@
           </w:tcPr>
           <w:p>
             <w:pPr>
-              <w:spacing w:line="360" w:lineRule="auto"/>
+              <w:spacing w:line="144" w:lineRule="auto"/>
               <w:rPr>
                 <w:rFonts w:hint="eastAsia" w:ascii="仿宋" w:hAnsi="仿宋" w:eastAsia="仿宋" w:cs="仿宋"/>
                 <w:sz w:val="24"/>
@@ -5665,15 +6333,33 @@
                 <w:sz w:val="22"/>
                 <w:szCs w:val="22"/>
               </w:rPr>
-              <w:t>【诊断】{{dimension.competency-b1-01.diagnosis}}</w:t>
+              <w:t xml:space="preserve">【诊断】</w:t>
             </w:r>
+            <w:sdt>
+              <w:sdtPr>
+                <w:alias w:val="dimension.competency-b1-01.diagnosis"/>
+                <w:tag w:val="dimension.competency-b1-01.diagnosis"/>
+                <w:text/>
+              </w:sdtPr>
+              <w:sdtContent>
+                <w:r>
+                  <w:rPr>
+                    <w:rFonts w:hint="eastAsia" w:ascii="仿宋" w:hAnsi="仿宋" w:eastAsia="仿宋" w:cs="仿宋"/>
+                    <w:color w:val="000000"/>
+                    <w:sz w:val="22"/>
+                    <w:szCs w:val="22"/>
+                  </w:rPr>
+                  <w:t>此处显示该维度的诊断与发展建议。</w:t>
+                </w:r>
+              </w:sdtContent>
+            </w:sdt>
           </w:p>
         </w:tc>
       </w:tr>
     </w:tbl>
     <w:p>
       <w:pPr>
-        <w:spacing w:line="360" w:lineRule="auto"/>
+        <w:spacing w:line="144" w:lineRule="auto"/>
         <w:rPr>
           <w:rFonts w:hint="eastAsia" w:ascii="仿宋" w:hAnsi="仿宋" w:eastAsia="仿宋" w:cs="仿宋"/>
           <w:b/>
@@ -5818,7 +6504,7 @@
                           <w:txbxContent>
                             <w:p>
                               <w:pPr>
-                                <w:spacing w:line="400" w:lineRule="exact"/>
+                                <w:spacing w:line="160" w:lineRule="exact"/>
                                 <w:jc w:val="center"/>
                                 <w:rPr>
                                   <w:rFonts w:hint="eastAsia" w:ascii="仿宋" w:hAnsi="仿宋" w:eastAsia="仿宋" w:cs="仿宋"/>
@@ -5895,7 +6581,7 @@
                     <w:txbxContent>
                       <w:p>
                         <w:pPr>
-                          <w:spacing w:line="400" w:lineRule="exact"/>
+                          <w:spacing w:line="160" w:lineRule="exact"/>
                           <w:jc w:val="center"/>
                           <w:rPr>
                             <w:rFonts w:hint="eastAsia" w:ascii="仿宋" w:hAnsi="仿宋" w:eastAsia="仿宋" w:cs="仿宋"/>
@@ -5979,7 +6665,7 @@
           </w:tcPr>
           <w:p>
             <w:pPr>
-              <w:spacing w:line="360" w:lineRule="auto"/>
+              <w:spacing w:line="144" w:lineRule="auto"/>
               <w:rPr>
                 <w:rFonts w:hint="eastAsia" w:ascii="仿宋" w:hAnsi="仿宋" w:eastAsia="仿宋" w:cs="仿宋"/>
                 <w:sz w:val="24"/>
@@ -6010,7 +6696,7 @@
           </w:tcPr>
           <w:p>
             <w:pPr>
-              <w:spacing w:line="360" w:lineRule="auto"/>
+              <w:spacing w:line="144" w:lineRule="auto"/>
               <w:rPr>
                 <w:rFonts w:hint="eastAsia" w:ascii="仿宋" w:hAnsi="仿宋" w:eastAsia="仿宋" w:cs="仿宋"/>
                 <w:b/>
@@ -6025,7 +6711,34 @@
                 <w:color w:val="000000"/>
                 <w:sz w:val="24"/>
               </w:rPr>
-              <w:t>测评得分：{{dimension.competency-b1-02.score}}分</w:t>
+              <w:t xml:space="preserve">测评得分：</w:t>
+            </w:r>
+            <w:sdt>
+              <w:sdtPr>
+                <w:alias w:val="dimension.competency-b1-02.score"/>
+                <w:tag w:val="dimension.competency-b1-02.score"/>
+                <w:text/>
+              </w:sdtPr>
+              <w:sdtContent>
+                <w:r>
+                  <w:rPr>
+                    <w:rFonts w:hint="eastAsia" w:ascii="仿宋" w:hAnsi="仿宋" w:eastAsia="仿宋" w:cs="仿宋"/>
+                    <w:b/>
+                    <w:color w:val="000000"/>
+                    <w:sz w:val="24"/>
+                  </w:rPr>
+                  <w:t>3.50</w:t>
+                </w:r>
+              </w:sdtContent>
+            </w:sdt>
+            <w:r>
+              <w:rPr>
+                <w:rFonts w:hint="eastAsia" w:ascii="仿宋" w:hAnsi="仿宋" w:eastAsia="仿宋" w:cs="仿宋"/>
+                <w:b/>
+                <w:color w:val="000000"/>
+                <w:sz w:val="24"/>
+              </w:rPr>
+              <w:t xml:space="preserve">分</w:t>
             </w:r>
             <w:r>
               <w:rPr>
@@ -6049,7 +6762,7 @@
           </w:p>
           <w:p>
             <w:pPr>
-              <w:spacing w:line="360" w:lineRule="auto"/>
+              <w:spacing w:line="144" w:lineRule="auto"/>
               <w:rPr>
                 <w:rFonts w:hint="eastAsia" w:ascii="仿宋" w:hAnsi="仿宋" w:eastAsia="仿宋" w:cs="仿宋"/>
                 <w:lang w:val="en-US" w:eastAsia="zh-CN"/>
@@ -6062,8 +6775,26 @@
                 <w:color w:val="000000"/>
                 <w:sz w:val="24"/>
               </w:rPr>
-              <w:t>评价等级：{{dimension.competency-b1-02.level}}</w:t>
+              <w:t xml:space="preserve">评价等级：</w:t>
             </w:r>
+            <w:sdt>
+              <w:sdtPr>
+                <w:alias w:val="dimension.competency-b1-02.level"/>
+                <w:tag w:val="dimension.competency-b1-02.level"/>
+                <w:text/>
+              </w:sdtPr>
+              <w:sdtContent>
+                <w:r>
+                  <w:rPr>
+                    <w:rFonts w:hint="eastAsia" w:ascii="仿宋" w:hAnsi="仿宋" w:eastAsia="仿宋" w:cs="仿宋"/>
+                    <w:b/>
+                    <w:color w:val="000000"/>
+                    <w:sz w:val="24"/>
+                  </w:rPr>
+                  <w:t>合格</w:t>
+                </w:r>
+              </w:sdtContent>
+            </w:sdt>
             <w:r>
               <w:rPr>
                 <w:rFonts w:hint="eastAsia" w:ascii="仿宋" w:hAnsi="仿宋" w:eastAsia="仿宋" w:cs="仿宋"/>
@@ -6096,7 +6827,7 @@
           </w:tblCellMar>
         </w:tblPrEx>
         <w:trPr>
-          <w:trHeight w:val="1417" w:hRule="atLeast"/>
+          <w:trHeight w:val="567" w:hRule="atLeast"/>
         </w:trPr>
         <w:tc>
           <w:tcPr>
@@ -6106,7 +6837,7 @@
           </w:tcPr>
           <w:p>
             <w:pPr>
-              <w:spacing w:line="360" w:lineRule="auto"/>
+              <w:spacing w:line="144" w:lineRule="auto"/>
               <w:rPr>
                 <w:rFonts w:hint="eastAsia" w:ascii="仿宋" w:hAnsi="仿宋" w:eastAsia="仿宋" w:cs="仿宋"/>
                 <w:sz w:val="24"/>
@@ -6119,15 +6850,33 @@
                 <w:sz w:val="22"/>
                 <w:szCs w:val="22"/>
               </w:rPr>
-              <w:t>【诊断】{{dimension.competency-b1-02.diagnosis}}</w:t>
+              <w:t xml:space="preserve">【诊断】</w:t>
             </w:r>
+            <w:sdt>
+              <w:sdtPr>
+                <w:alias w:val="dimension.competency-b1-02.diagnosis"/>
+                <w:tag w:val="dimension.competency-b1-02.diagnosis"/>
+                <w:text/>
+              </w:sdtPr>
+              <w:sdtContent>
+                <w:r>
+                  <w:rPr>
+                    <w:rFonts w:hint="eastAsia" w:ascii="仿宋" w:hAnsi="仿宋" w:eastAsia="仿宋" w:cs="仿宋"/>
+                    <w:color w:val="000000"/>
+                    <w:sz w:val="22"/>
+                    <w:szCs w:val="22"/>
+                  </w:rPr>
+                  <w:t>此处显示该维度的诊断与发展建议。</w:t>
+                </w:r>
+              </w:sdtContent>
+            </w:sdt>
           </w:p>
         </w:tc>
       </w:tr>
     </w:tbl>
     <w:p>
       <w:pPr>
-        <w:spacing w:line="360" w:lineRule="auto"/>
+        <w:spacing w:line="144" w:lineRule="auto"/>
         <w:rPr>
           <w:rFonts w:hint="eastAsia" w:ascii="仿宋" w:hAnsi="仿宋" w:eastAsia="仿宋" w:cs="仿宋"/>
           <w:b/>
@@ -6269,7 +7018,7 @@
                           <w:txbxContent>
                             <w:p>
                               <w:pPr>
-                                <w:spacing w:line="400" w:lineRule="exact"/>
+                                <w:spacing w:line="160" w:lineRule="exact"/>
                                 <w:jc w:val="center"/>
                                 <w:rPr>
                                   <w:rFonts w:hint="eastAsia" w:ascii="仿宋" w:hAnsi="仿宋" w:eastAsia="仿宋" w:cs="仿宋"/>
@@ -6346,7 +7095,7 @@
                     <w:txbxContent>
                       <w:p>
                         <w:pPr>
-                          <w:spacing w:line="400" w:lineRule="exact"/>
+                          <w:spacing w:line="160" w:lineRule="exact"/>
                           <w:jc w:val="center"/>
                           <w:rPr>
                             <w:rFonts w:hint="eastAsia" w:ascii="仿宋" w:hAnsi="仿宋" w:eastAsia="仿宋" w:cs="仿宋"/>
@@ -6430,7 +7179,7 @@
           </w:tcPr>
           <w:p>
             <w:pPr>
-              <w:spacing w:line="360" w:lineRule="auto"/>
+              <w:spacing w:line="144" w:lineRule="auto"/>
               <w:rPr>
                 <w:rFonts w:hint="eastAsia" w:ascii="仿宋" w:hAnsi="仿宋" w:eastAsia="仿宋" w:cs="仿宋"/>
                 <w:sz w:val="24"/>
@@ -6461,7 +7210,7 @@
           </w:tcPr>
           <w:p>
             <w:pPr>
-              <w:spacing w:line="360" w:lineRule="auto"/>
+              <w:spacing w:line="144" w:lineRule="auto"/>
               <w:rPr>
                 <w:rFonts w:hint="eastAsia" w:ascii="仿宋" w:hAnsi="仿宋" w:eastAsia="仿宋" w:cs="仿宋"/>
                 <w:b/>
@@ -6476,7 +7225,34 @@
                 <w:color w:val="000000"/>
                 <w:sz w:val="24"/>
               </w:rPr>
-              <w:t>测评得分：{{dimension.competency-b1-03.score}}分</w:t>
+              <w:t xml:space="preserve">测评得分：</w:t>
+            </w:r>
+            <w:sdt>
+              <w:sdtPr>
+                <w:alias w:val="dimension.competency-b1-03.score"/>
+                <w:tag w:val="dimension.competency-b1-03.score"/>
+                <w:text/>
+              </w:sdtPr>
+              <w:sdtContent>
+                <w:r>
+                  <w:rPr>
+                    <w:rFonts w:hint="eastAsia" w:ascii="仿宋" w:hAnsi="仿宋" w:eastAsia="仿宋" w:cs="仿宋"/>
+                    <w:b/>
+                    <w:color w:val="000000"/>
+                    <w:sz w:val="24"/>
+                  </w:rPr>
+                  <w:t>3.50</w:t>
+                </w:r>
+              </w:sdtContent>
+            </w:sdt>
+            <w:r>
+              <w:rPr>
+                <w:rFonts w:hint="eastAsia" w:ascii="仿宋" w:hAnsi="仿宋" w:eastAsia="仿宋" w:cs="仿宋"/>
+                <w:b/>
+                <w:color w:val="000000"/>
+                <w:sz w:val="24"/>
+              </w:rPr>
+              <w:t xml:space="preserve">分</w:t>
             </w:r>
             <w:r>
               <w:rPr>
@@ -6500,7 +7276,7 @@
           </w:p>
           <w:p>
             <w:pPr>
-              <w:spacing w:line="360" w:lineRule="auto"/>
+              <w:spacing w:line="144" w:lineRule="auto"/>
               <w:rPr>
                 <w:rFonts w:hint="eastAsia" w:ascii="仿宋" w:hAnsi="仿宋" w:eastAsia="仿宋" w:cs="仿宋"/>
                 <w:lang w:eastAsia="zh-CN"/>
@@ -6513,8 +7289,26 @@
                 <w:color w:val="000000"/>
                 <w:sz w:val="24"/>
               </w:rPr>
-              <w:t>评价等级：{{dimension.competency-b1-03.level}}</w:t>
+              <w:t xml:space="preserve">评价等级：</w:t>
             </w:r>
+            <w:sdt>
+              <w:sdtPr>
+                <w:alias w:val="dimension.competency-b1-03.level"/>
+                <w:tag w:val="dimension.competency-b1-03.level"/>
+                <w:text/>
+              </w:sdtPr>
+              <w:sdtContent>
+                <w:r>
+                  <w:rPr>
+                    <w:rFonts w:hint="eastAsia" w:ascii="仿宋" w:hAnsi="仿宋" w:eastAsia="仿宋" w:cs="仿宋"/>
+                    <w:b/>
+                    <w:color w:val="000000"/>
+                    <w:sz w:val="24"/>
+                  </w:rPr>
+                  <w:t>合格</w:t>
+                </w:r>
+              </w:sdtContent>
+            </w:sdt>
             <w:r>
               <w:rPr>
                 <w:rFonts w:hint="eastAsia" w:ascii="仿宋" w:hAnsi="仿宋" w:eastAsia="仿宋" w:cs="仿宋"/>
@@ -6547,7 +7341,7 @@
           </w:tblCellMar>
         </w:tblPrEx>
         <w:trPr>
-          <w:trHeight w:val="1417" w:hRule="atLeast"/>
+          <w:trHeight w:val="567" w:hRule="atLeast"/>
         </w:trPr>
         <w:tc>
           <w:tcPr>
@@ -6557,7 +7351,7 @@
           </w:tcPr>
           <w:p>
             <w:pPr>
-              <w:spacing w:line="360" w:lineRule="auto"/>
+              <w:spacing w:line="144" w:lineRule="auto"/>
               <w:rPr>
                 <w:rFonts w:hint="eastAsia" w:ascii="仿宋" w:hAnsi="仿宋" w:eastAsia="仿宋" w:cs="仿宋"/>
                 <w:sz w:val="24"/>
@@ -6570,15 +7364,33 @@
                 <w:sz w:val="22"/>
                 <w:szCs w:val="22"/>
               </w:rPr>
-              <w:t>【诊断】{{dimension.competency-b1-03.diagnosis}}</w:t>
+              <w:t xml:space="preserve">【诊断】</w:t>
             </w:r>
+            <w:sdt>
+              <w:sdtPr>
+                <w:alias w:val="dimension.competency-b1-03.diagnosis"/>
+                <w:tag w:val="dimension.competency-b1-03.diagnosis"/>
+                <w:text/>
+              </w:sdtPr>
+              <w:sdtContent>
+                <w:r>
+                  <w:rPr>
+                    <w:rFonts w:hint="eastAsia" w:ascii="仿宋" w:hAnsi="仿宋" w:eastAsia="仿宋" w:cs="仿宋"/>
+                    <w:color w:val="000000"/>
+                    <w:sz w:val="22"/>
+                    <w:szCs w:val="22"/>
+                  </w:rPr>
+                  <w:t>此处显示该维度的诊断与发展建议。</w:t>
+                </w:r>
+              </w:sdtContent>
+            </w:sdt>
           </w:p>
         </w:tc>
       </w:tr>
     </w:tbl>
     <w:p>
       <w:pPr>
-        <w:spacing w:line="360" w:lineRule="auto"/>
+        <w:spacing w:line="144" w:lineRule="auto"/>
         <w:rPr>
           <w:rFonts w:hint="eastAsia" w:ascii="仿宋" w:hAnsi="仿宋" w:eastAsia="仿宋" w:cs="仿宋"/>
           <w:b/>
@@ -6720,7 +7532,7 @@
                           <w:txbxContent>
                             <w:p>
                               <w:pPr>
-                                <w:spacing w:line="400" w:lineRule="exact"/>
+                                <w:spacing w:line="160" w:lineRule="exact"/>
                                 <w:jc w:val="center"/>
                                 <w:rPr>
                                   <w:rFonts w:hint="eastAsia" w:ascii="仿宋" w:hAnsi="仿宋" w:eastAsia="仿宋" w:cs="仿宋"/>
@@ -6797,7 +7609,7 @@
                     <w:txbxContent>
                       <w:p>
                         <w:pPr>
-                          <w:spacing w:line="400" w:lineRule="exact"/>
+                          <w:spacing w:line="160" w:lineRule="exact"/>
                           <w:jc w:val="center"/>
                           <w:rPr>
                             <w:rFonts w:hint="eastAsia" w:ascii="仿宋" w:hAnsi="仿宋" w:eastAsia="仿宋" w:cs="仿宋"/>
@@ -6881,7 +7693,7 @@
           </w:tcPr>
           <w:p>
             <w:pPr>
-              <w:spacing w:line="360" w:lineRule="auto"/>
+              <w:spacing w:line="144" w:lineRule="auto"/>
               <w:rPr>
                 <w:rFonts w:hint="eastAsia" w:ascii="仿宋" w:hAnsi="仿宋" w:eastAsia="仿宋" w:cs="仿宋"/>
                 <w:sz w:val="24"/>
@@ -6912,7 +7724,7 @@
           </w:tcPr>
           <w:p>
             <w:pPr>
-              <w:spacing w:line="360" w:lineRule="auto"/>
+              <w:spacing w:line="144" w:lineRule="auto"/>
               <w:rPr>
                 <w:rFonts w:hint="eastAsia" w:ascii="仿宋" w:hAnsi="仿宋" w:eastAsia="仿宋" w:cs="仿宋"/>
                 <w:b/>
@@ -6927,7 +7739,34 @@
                 <w:color w:val="000000"/>
                 <w:sz w:val="24"/>
               </w:rPr>
-              <w:t>测评得分：{{dimension.competency-b1-04.score}}分</w:t>
+              <w:t xml:space="preserve">测评得分：</w:t>
+            </w:r>
+            <w:sdt>
+              <w:sdtPr>
+                <w:alias w:val="dimension.competency-b1-04.score"/>
+                <w:tag w:val="dimension.competency-b1-04.score"/>
+                <w:text/>
+              </w:sdtPr>
+              <w:sdtContent>
+                <w:r>
+                  <w:rPr>
+                    <w:rFonts w:hint="eastAsia" w:ascii="仿宋" w:hAnsi="仿宋" w:eastAsia="仿宋" w:cs="仿宋"/>
+                    <w:b/>
+                    <w:color w:val="000000"/>
+                    <w:sz w:val="24"/>
+                  </w:rPr>
+                  <w:t>3.50</w:t>
+                </w:r>
+              </w:sdtContent>
+            </w:sdt>
+            <w:r>
+              <w:rPr>
+                <w:rFonts w:hint="eastAsia" w:ascii="仿宋" w:hAnsi="仿宋" w:eastAsia="仿宋" w:cs="仿宋"/>
+                <w:b/>
+                <w:color w:val="000000"/>
+                <w:sz w:val="24"/>
+              </w:rPr>
+              <w:t xml:space="preserve">分</w:t>
             </w:r>
             <w:r>
               <w:rPr>
@@ -6951,7 +7790,7 @@
           </w:p>
           <w:p>
             <w:pPr>
-              <w:spacing w:line="360" w:lineRule="auto"/>
+              <w:spacing w:line="144" w:lineRule="auto"/>
               <w:rPr>
                 <w:rFonts w:hint="eastAsia" w:ascii="仿宋" w:hAnsi="仿宋" w:eastAsia="仿宋" w:cs="仿宋"/>
                 <w:lang w:val="en-US" w:eastAsia="zh-CN"/>
@@ -6964,8 +7803,26 @@
                 <w:color w:val="000000"/>
                 <w:sz w:val="24"/>
               </w:rPr>
-              <w:t>评价等级：{{dimension.competency-b1-04.level}}</w:t>
+              <w:t xml:space="preserve">评价等级：</w:t>
             </w:r>
+            <w:sdt>
+              <w:sdtPr>
+                <w:alias w:val="dimension.competency-b1-04.level"/>
+                <w:tag w:val="dimension.competency-b1-04.level"/>
+                <w:text/>
+              </w:sdtPr>
+              <w:sdtContent>
+                <w:r>
+                  <w:rPr>
+                    <w:rFonts w:hint="eastAsia" w:ascii="仿宋" w:hAnsi="仿宋" w:eastAsia="仿宋" w:cs="仿宋"/>
+                    <w:b/>
+                    <w:color w:val="000000"/>
+                    <w:sz w:val="24"/>
+                  </w:rPr>
+                  <w:t>合格</w:t>
+                </w:r>
+              </w:sdtContent>
+            </w:sdt>
             <w:r>
               <w:rPr>
                 <w:rFonts w:hint="eastAsia" w:ascii="仿宋" w:hAnsi="仿宋" w:eastAsia="仿宋" w:cs="仿宋"/>
@@ -6998,7 +7855,7 @@
           </w:tblCellMar>
         </w:tblPrEx>
         <w:trPr>
-          <w:trHeight w:val="1417" w:hRule="atLeast"/>
+          <w:trHeight w:val="567" w:hRule="atLeast"/>
         </w:trPr>
         <w:tc>
           <w:tcPr>
@@ -7008,28 +7865,47 @@
           </w:tcPr>
           <w:p>
             <w:pPr>
-              <w:spacing w:line="360" w:lineRule="auto"/>
+              <w:spacing w:line="144" w:lineRule="auto"/>
               <w:rPr>
                 <w:rFonts w:hint="eastAsia" w:ascii="仿宋" w:hAnsi="仿宋" w:eastAsia="仿宋" w:cs="仿宋"/>
-                <w:sz w:val="24"/>
+                <w:sz w:val="10"/>
               </w:rPr>
             </w:pPr>
             <w:r>
               <w:rPr>
                 <w:rFonts w:hint="eastAsia" w:ascii="仿宋" w:hAnsi="仿宋" w:eastAsia="仿宋" w:cs="仿宋"/>
                 <w:color w:val="000000"/>
-                <w:sz w:val="22"/>
-                <w:szCs w:val="22"/>
+                <w:sz w:val="9"/>
+                <w:szCs w:val="9"/>
               </w:rPr>
-              <w:t>【诊断】{{dimension.competency-b1-04.diagnosis}}</w:t>
+              <w:t xml:space="preserve">【诊断】</w:t>
             </w:r>
+            <w:sdt>
+              <w:sdtPr>
+                <w:alias w:val="dimension.competency-b1-04.diagnosis"/>
+                <w:tag w:val="dimension.competency-b1-04.diagnosis"/>
+                <w:text/>
+              </w:sdtPr>
+              <w:sdtContent>
+                <w:r>
+                  <w:rPr>
+                    <w:rFonts w:hint="eastAsia" w:ascii="仿宋" w:hAnsi="仿宋" w:eastAsia="仿宋" w:cs="仿宋"/>
+                    <w:color w:val="000000"/>
+                    <w:sz w:val="9"/>
+                    <w:szCs w:val="9"/>
+                  </w:rPr>
+                  <w:t>此处显示该维度的诊断与发展建议。</w:t>
+                </w:r>
+              </w:sdtContent>
+            </w:sdt>
           </w:p>
         </w:tc>
       </w:tr>
     </w:tbl>
     <w:p>
       <w:pPr>
-        <w:spacing w:line="360" w:lineRule="auto"/>
+        <w:pageBreakBefore/>
+        <w:spacing w:line="144" w:lineRule="auto"/>
         <w:rPr>
           <w:rFonts w:hint="eastAsia" w:ascii="仿宋" w:hAnsi="仿宋" w:eastAsia="仿宋" w:cs="仿宋"/>
           <w:b/>
@@ -7171,7 +8047,7 @@
                           <w:txbxContent>
                             <w:p>
                               <w:pPr>
-                                <w:spacing w:line="400" w:lineRule="exact"/>
+                                <w:spacing w:line="160" w:lineRule="exact"/>
                                 <w:jc w:val="center"/>
                                 <w:rPr>
                                   <w:rFonts w:hint="eastAsia" w:ascii="仿宋" w:hAnsi="仿宋" w:eastAsia="仿宋" w:cs="仿宋"/>
@@ -7250,7 +8126,7 @@
                     <w:txbxContent>
                       <w:p>
                         <w:pPr>
-                          <w:spacing w:line="400" w:lineRule="exact"/>
+                          <w:spacing w:line="160" w:lineRule="exact"/>
                           <w:jc w:val="center"/>
                           <w:rPr>
                             <w:rFonts w:hint="eastAsia" w:ascii="仿宋" w:hAnsi="仿宋" w:eastAsia="仿宋" w:cs="仿宋"/>
@@ -7336,7 +8212,7 @@
           </w:tcPr>
           <w:p>
             <w:pPr>
-              <w:spacing w:line="360" w:lineRule="auto"/>
+              <w:spacing w:line="144" w:lineRule="auto"/>
               <w:rPr>
                 <w:rFonts w:hint="eastAsia" w:ascii="仿宋" w:hAnsi="仿宋" w:eastAsia="仿宋" w:cs="仿宋"/>
                 <w:sz w:val="24"/>
@@ -7370,7 +8246,7 @@
           </w:tcPr>
           <w:p>
             <w:pPr>
-              <w:spacing w:line="360" w:lineRule="auto"/>
+              <w:spacing w:line="144" w:lineRule="auto"/>
               <w:rPr>
                 <w:rFonts w:hint="eastAsia" w:ascii="仿宋" w:hAnsi="仿宋" w:eastAsia="仿宋" w:cs="仿宋"/>
                 <w:b/>
@@ -7385,12 +8261,39 @@
                 <w:color w:val="000000"/>
                 <w:sz w:val="24"/>
               </w:rPr>
-              <w:t>测评得分：{{dimension.competency-b1-05.score}}分</w:t>
+              <w:t xml:space="preserve">测评得分：</w:t>
+            </w:r>
+            <w:sdt>
+              <w:sdtPr>
+                <w:alias w:val="dimension.competency-b1-05.score"/>
+                <w:tag w:val="dimension.competency-b1-05.score"/>
+                <w:text/>
+              </w:sdtPr>
+              <w:sdtContent>
+                <w:r>
+                  <w:rPr>
+                    <w:rFonts w:hint="eastAsia" w:ascii="仿宋" w:hAnsi="仿宋" w:eastAsia="仿宋" w:cs="仿宋"/>
+                    <w:b/>
+                    <w:color w:val="000000"/>
+                    <w:sz w:val="24"/>
+                  </w:rPr>
+                  <w:t>3.50</w:t>
+                </w:r>
+              </w:sdtContent>
+            </w:sdt>
+            <w:r>
+              <w:rPr>
+                <w:rFonts w:hint="eastAsia" w:ascii="仿宋" w:hAnsi="仿宋" w:eastAsia="仿宋" w:cs="仿宋"/>
+                <w:b/>
+                <w:color w:val="000000"/>
+                <w:sz w:val="24"/>
+              </w:rPr>
+              <w:t xml:space="preserve">分</w:t>
             </w:r>
           </w:p>
           <w:p>
             <w:pPr>
-              <w:spacing w:line="360" w:lineRule="auto"/>
+              <w:spacing w:line="144" w:lineRule="auto"/>
               <w:rPr>
                 <w:rFonts w:hint="eastAsia" w:ascii="仿宋" w:hAnsi="仿宋" w:eastAsia="仿宋" w:cs="仿宋"/>
               </w:rPr>
@@ -7402,8 +8305,26 @@
                 <w:color w:val="000000"/>
                 <w:sz w:val="24"/>
               </w:rPr>
-              <w:t>评价等级：{{dimension.competency-b1-05.level}}</w:t>
+              <w:t xml:space="preserve">评价等级：</w:t>
             </w:r>
+            <w:sdt>
+              <w:sdtPr>
+                <w:alias w:val="dimension.competency-b1-05.level"/>
+                <w:tag w:val="dimension.competency-b1-05.level"/>
+                <w:text/>
+              </w:sdtPr>
+              <w:sdtContent>
+                <w:r>
+                  <w:rPr>
+                    <w:rFonts w:hint="eastAsia" w:ascii="仿宋" w:hAnsi="仿宋" w:eastAsia="仿宋" w:cs="仿宋"/>
+                    <w:b/>
+                    <w:color w:val="000000"/>
+                    <w:sz w:val="24"/>
+                  </w:rPr>
+                  <w:t>合格</w:t>
+                </w:r>
+              </w:sdtContent>
+            </w:sdt>
           </w:p>
         </w:tc>
       </w:tr>
@@ -7426,7 +8347,7 @@
           </w:tblCellMar>
         </w:tblPrEx>
         <w:trPr>
-          <w:trHeight w:val="1417" w:hRule="atLeast"/>
+          <w:trHeight w:val="567" w:hRule="atLeast"/>
         </w:trPr>
         <w:tc>
           <w:tcPr>
@@ -7436,7 +8357,7 @@
           </w:tcPr>
           <w:p>
             <w:pPr>
-              <w:spacing w:line="360" w:lineRule="auto"/>
+              <w:spacing w:line="144" w:lineRule="auto"/>
               <w:rPr>
                 <w:rFonts w:hint="eastAsia" w:ascii="仿宋" w:hAnsi="仿宋" w:eastAsia="仿宋" w:cs="仿宋"/>
                 <w:sz w:val="24"/>
@@ -7449,15 +8370,33 @@
                 <w:sz w:val="22"/>
                 <w:szCs w:val="22"/>
               </w:rPr>
-              <w:t>【诊断】{{dimension.competency-b1-05.diagnosis}}</w:t>
+              <w:t xml:space="preserve">【诊断】</w:t>
             </w:r>
+            <w:sdt>
+              <w:sdtPr>
+                <w:alias w:val="dimension.competency-b1-05.diagnosis"/>
+                <w:tag w:val="dimension.competency-b1-05.diagnosis"/>
+                <w:text/>
+              </w:sdtPr>
+              <w:sdtContent>
+                <w:r>
+                  <w:rPr>
+                    <w:rFonts w:hint="eastAsia" w:ascii="仿宋" w:hAnsi="仿宋" w:eastAsia="仿宋" w:cs="仿宋"/>
+                    <w:color w:val="000000"/>
+                    <w:sz w:val="22"/>
+                    <w:szCs w:val="22"/>
+                  </w:rPr>
+                  <w:t>此处显示该维度的诊断与发展建议。</w:t>
+                </w:r>
+              </w:sdtContent>
+            </w:sdt>
           </w:p>
         </w:tc>
       </w:tr>
     </w:tbl>
     <w:p>
       <w:pPr>
-        <w:spacing w:line="360" w:lineRule="auto"/>
+        <w:spacing w:line="144" w:lineRule="auto"/>
         <w:ind w:firstLine="0" w:firstLineChars="0"/>
         <w:rPr>
           <w:rFonts w:hint="default" w:ascii="宋体" w:hAnsi="宋体" w:eastAsia="宋体" w:cs="宋体"/>

</xml_diff>

<commit_message>
fix: correct phase-one Word template field mapping
</commit_message>
<xml_diff>
--- a/Go-based Refactored System/configs/export-templates/competency-phase1-report.docx
+++ b/Go-based Refactored System/configs/export-templates/competency-phase1-report.docx
@@ -22,7 +22,7 @@
         <mc:AlternateContent>
           <mc:Choice Requires="wps">
             <w:drawing>
-              <wp:anchor distT="0" distB="0" distL="114300" distR="114300" simplePos="0" relativeHeight="251663360" behindDoc="0" locked="0" layoutInCell="1" allowOverlap="1" wp14:anchorId="4B2350D6" wp14:editId="24E109D2">
+              <wp:anchor distT="0" distB="0" distL="114300" distR="114300" simplePos="0" relativeHeight="251662336" behindDoc="0" locked="0" layoutInCell="1" allowOverlap="1" wp14:anchorId="4B2350D6" wp14:editId="6D2257C2">
                 <wp:simplePos x="0" y="0"/>
                 <wp:positionH relativeFrom="column">
                   <wp:posOffset>4700905</wp:posOffset>
@@ -101,7 +101,7 @@
           </mc:Choice>
           <mc:Fallback>
             <w:pict>
-              <v:rect w14:anchorId="396ADF15" id="矩形 59" o:spid="_x0000_s1026" style="position:absolute;margin-left:370.15pt;margin-top:-76.35pt;width:184pt;height:179.55pt;z-index:251663360;visibility:visible;mso-wrap-style:square;mso-wrap-distance-left:9pt;mso-wrap-distance-top:0;mso-wrap-distance-right:9pt;mso-wrap-distance-bottom:0;mso-position-horizontal:absolute;mso-position-horizontal-relative:text;mso-position-vertical:absolute;mso-position-vertical-relative:text;v-text-anchor:middle" o:gfxdata="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" fillcolor="#f6f8fc" stroked="f" strokeweight="1pt">
+              <v:rect w14:anchorId="19CE7EDE" id="矩形 59" o:spid="_x0000_s1026" style="position:absolute;margin-left:370.15pt;margin-top:-76.35pt;width:184pt;height:179.55pt;z-index:251662336;visibility:visible;mso-wrap-style:square;mso-wrap-distance-left:9pt;mso-wrap-distance-top:0;mso-wrap-distance-right:9pt;mso-wrap-distance-bottom:0;mso-position-horizontal:absolute;mso-position-horizontal-relative:text;mso-position-vertical:absolute;mso-position-vertical-relative:text;v-text-anchor:middle" o:gfxdata="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" fillcolor="#f6f8fc" stroked="f" strokeweight="1pt">
                 <v:fill color2="#75bd42" o:opacity2="0" angle="135" colors="0 #f6f8fc;20316f #f6f8fc;56361f #75bd42" focus="100%" type="gradient">
                   <o:fill v:ext="view" type="gradientUnscaled"/>
                 </v:fill>
@@ -374,7 +374,7 @@
         <mc:AlternateContent>
           <mc:Choice Requires="wps">
             <w:drawing>
-              <wp:anchor distT="0" distB="0" distL="114300" distR="114300" simplePos="0" relativeHeight="251662336" behindDoc="0" locked="0" layoutInCell="1" allowOverlap="1" wp14:anchorId="1D91140A" wp14:editId="61BA7E73">
+              <wp:anchor distT="0" distB="0" distL="114300" distR="114300" simplePos="0" relativeHeight="251661312" behindDoc="0" locked="0" layoutInCell="1" allowOverlap="1" wp14:anchorId="1D91140A" wp14:editId="1E242EC1">
                 <wp:simplePos x="0" y="0"/>
                 <wp:positionH relativeFrom="column">
                   <wp:posOffset>-733425</wp:posOffset>
@@ -465,10 +465,10 @@
           </mc:Choice>
           <mc:Fallback>
             <w:pict>
-              <v:shapetype w14:anchorId="43934955" id="_x0000_t120" coordsize="21600,21600" o:spt="120" path="m10800,qx,10800,10800,21600,21600,10800,10800,xe">
+              <v:shapetype w14:anchorId="3A523E94" id="_x0000_t120" coordsize="21600,21600" o:spt="120" path="m10800,qx,10800,10800,21600,21600,10800,10800,xe">
                 <v:path gradientshapeok="t" o:connecttype="custom" o:connectlocs="10800,0;3163,3163;0,10800;3163,18437;10800,21600;18437,18437;21600,10800;18437,3163" textboxrect="3163,3163,18437,18437"/>
               </v:shapetype>
-              <v:shape id="流程图: 联系 60" o:spid="_x0000_s1026" type="#_x0000_t120" style="position:absolute;margin-left:-57.75pt;margin-top:116.75pt;width:221.3pt;height:150pt;z-index:251662336;visibility:visible;mso-wrap-style:square;mso-wrap-distance-left:9pt;mso-wrap-distance-top:0;mso-wrap-distance-right:9pt;mso-wrap-distance-bottom:0;mso-position-horizontal:absolute;mso-position-horizontal-relative:text;mso-position-vertical:absolute;mso-position-vertical-relative:text;v-text-anchor:middle" o:gfxdata="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" fillcolor="#f6f8fc" stroked="f" strokeweight="1pt">
+              <v:shape id="流程图: 联系 60" o:spid="_x0000_s1026" type="#_x0000_t120" style="position:absolute;margin-left:-57.75pt;margin-top:116.75pt;width:221.3pt;height:150pt;z-index:251661312;visibility:visible;mso-wrap-style:square;mso-wrap-distance-left:9pt;mso-wrap-distance-top:0;mso-wrap-distance-right:9pt;mso-wrap-distance-bottom:0;mso-position-horizontal:absolute;mso-position-horizontal-relative:text;mso-position-vertical:absolute;mso-position-vertical-relative:text;v-text-anchor:middle" o:gfxdata="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" fillcolor="#f6f8fc" stroked="f" strokeweight="1pt">
                 <v:fill opacity="61603f" color2="#b4dff0" o:opacity2="34734f" angle="315" colors="0 #f6f8fc;1311f #f6f8fc;34079f #acd78e;63570f #92d050;1 #00b0f0" focus="100%" type="gradient">
                   <o:fill v:ext="view" type="gradientUnscaled"/>
                 </v:fill>
@@ -490,7 +490,7 @@
         <mc:AlternateContent>
           <mc:Choice Requires="wps">
             <w:drawing>
-              <wp:anchor distT="0" distB="0" distL="114300" distR="114300" simplePos="0" relativeHeight="251661312" behindDoc="0" locked="0" layoutInCell="1" allowOverlap="1" wp14:anchorId="4A91F22B" wp14:editId="5C044724">
+              <wp:anchor distT="0" distB="0" distL="114300" distR="114300" simplePos="0" relativeHeight="251660288" behindDoc="0" locked="0" layoutInCell="1" allowOverlap="1" wp14:anchorId="4A91F22B" wp14:editId="3A0648D0">
                 <wp:simplePos x="0" y="0"/>
                 <wp:positionH relativeFrom="column">
                   <wp:posOffset>-1125855</wp:posOffset>
@@ -579,7 +579,7 @@
           </mc:Choice>
           <mc:Fallback>
             <w:pict>
-              <v:shape w14:anchorId="3747511E" id="流程图: 联系 7" o:spid="_x0000_s1026" type="#_x0000_t120" style="position:absolute;margin-left:-88.65pt;margin-top:61.25pt;width:144.4pt;height:149.4pt;z-index:251661312;visibility:visible;mso-wrap-style:square;mso-wrap-distance-left:9pt;mso-wrap-distance-top:0;mso-wrap-distance-right:9pt;mso-wrap-distance-bottom:0;mso-position-horizontal:absolute;mso-position-horizontal-relative:text;mso-position-vertical:absolute;mso-position-vertical-relative:text;v-text-anchor:middle" o:gfxdata="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" fillcolor="#f6f8fc" stroked="f" strokeweight="1pt">
+              <v:shape w14:anchorId="3C9569DE" id="流程图: 联系 7" o:spid="_x0000_s1026" type="#_x0000_t120" style="position:absolute;margin-left:-88.65pt;margin-top:61.25pt;width:144.4pt;height:149.4pt;z-index:251660288;visibility:visible;mso-wrap-style:square;mso-wrap-distance-left:9pt;mso-wrap-distance-top:0;mso-wrap-distance-right:9pt;mso-wrap-distance-bottom:0;mso-position-horizontal:absolute;mso-position-horizontal-relative:text;mso-position-vertical:absolute;mso-position-vertical-relative:text;v-text-anchor:middle" o:gfxdata="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" fillcolor="#f6f8fc" stroked="f" strokeweight="1pt">
                 <v:fill color2="#b4dff0" o:opacity2="34734f" angle="315" colors="0 #f6f8fc;1311f #f6f8fc;34079f #c8e5b3;62259f #c8e5b3;1 #00b0f0" focus="100%" type="gradient">
                   <o:fill v:ext="view" type="gradientUnscaled"/>
                 </v:fill>
@@ -849,7 +849,7 @@
         </w:numPr>
         <w:spacing w:beforeLines="50" w:before="156" w:afterLines="50" w:after="156" w:line="144" w:lineRule="auto"/>
         <w:rPr>
-          <w:rFonts w:ascii="黑体" w:eastAsia="黑体" w:hAnsi="黑体" w:cs="黑体"/>
+          <w:rFonts w:ascii="黑体" w:eastAsia="黑体" w:hAnsi="黑体" w:cs="黑体" w:hint="eastAsia"/>
           <w:b/>
           <w:bCs/>
           <w:color w:val="00B050"/>
@@ -1947,7 +1947,7 @@
                 <w:sz w:val="24"/>
               </w:rPr>
               <w:drawing>
-                <wp:anchor distT="0" distB="0" distL="114300" distR="114300" simplePos="0" relativeHeight="251674624" behindDoc="0" locked="0" layoutInCell="1" allowOverlap="1" wp14:anchorId="2504E648" wp14:editId="08CF44BE">
+                <wp:anchor distT="0" distB="0" distL="114300" distR="114300" simplePos="0" relativeHeight="251673600" behindDoc="0" locked="0" layoutInCell="1" allowOverlap="1" wp14:anchorId="2504E648" wp14:editId="50F3C8D4">
                   <wp:simplePos x="0" y="0"/>
                   <wp:positionH relativeFrom="column">
                     <wp:posOffset>488273</wp:posOffset>
@@ -2533,7 +2533,7 @@
           <w:noProof/>
         </w:rPr>
         <w:drawing>
-          <wp:anchor distT="0" distB="0" distL="114300" distR="114300" simplePos="0" relativeHeight="251675648" behindDoc="0" locked="0" layoutInCell="1" allowOverlap="1" wp14:anchorId="3CD2DE9F" wp14:editId="4040A289">
+          <wp:anchor distT="0" distB="0" distL="114300" distR="114300" simplePos="0" relativeHeight="251674624" behindDoc="0" locked="0" layoutInCell="1" allowOverlap="1" wp14:anchorId="3CD2DE9F" wp14:editId="336C5DDC">
             <wp:simplePos x="0" y="0"/>
             <wp:positionH relativeFrom="column">
               <wp:posOffset>216703</wp:posOffset>
@@ -2740,83 +2740,231 @@
           <w:szCs w:val="18"/>
         </w:rPr>
       </w:pPr>
-      <w:r>
-        <w:rPr>
-          <w:rFonts w:ascii="仿宋" w:eastAsia="仿宋" w:hAnsi="仿宋" w:cs="仿宋" w:hint="eastAsia"/>
-          <w:b/>
-          <w:bCs/>
-          <w:color w:val="15B720"/>
-          <w:sz w:val="18"/>
-          <w:szCs w:val="18"/>
-        </w:rPr>
-        <mc:AlternateContent>
-          <mc:Choice Requires="wpg">
-            <w:drawing>
-              <wp:anchor distT="0" distB="0" distL="114300" distR="114300" simplePos="0" relativeHeight="251665408" behindDoc="0" locked="0" layoutInCell="1" allowOverlap="1" wp14:anchorId="7902DEFA" wp14:editId="7FA476AC">
-                <wp:simplePos x="0" y="0"/>
-                <wp:positionH relativeFrom="column">
-                  <wp:posOffset>15875</wp:posOffset>
-                </wp:positionH>
-                <wp:positionV relativeFrom="paragraph">
-                  <wp:posOffset>363220</wp:posOffset>
-                </wp:positionV>
-                <wp:extent cx="5219700" cy="1259840"/>
-                <wp:effectExtent l="0" t="0" r="19050" b="16510"/>
-                <wp:wrapTopAndBottom/>
-                <wp:docPr id="63" name="组合 63"/>
-                <wp:cNvGraphicFramePr/>
-                <a:graphic xmlns:a="http://schemas.openxmlformats.org/drawingml/2006/main">
-                  <a:graphicData uri="http://schemas.microsoft.com/office/word/2010/wordprocessingGroup">
-                    <wpg:wgp>
-                      <wpg:cNvGrpSpPr/>
-                      <wpg:grpSpPr>
-                        <a:xfrm>
-                          <a:off x="0" y="0"/>
-                          <a:ext cx="5219700" cy="1259840"/>
-                          <a:chOff x="15606" y="36541"/>
-                          <a:chExt cx="8450" cy="1984"/>
-                        </a:xfrm>
-                      </wpg:grpSpPr>
-                      <wps:wsp>
-                        <wps:cNvPr id="23" name="圆角矩形 23"/>
-                        <wps:cNvSpPr/>
-                        <wps:spPr>
-                          <a:xfrm>
-                            <a:off x="15606" y="37016"/>
-                            <a:ext cx="8450" cy="1509"/>
-                          </a:xfrm>
-                          <a:prstGeom prst="roundRect">
-                            <a:avLst/>
-                          </a:prstGeom>
-                          <a:noFill/>
-                          <a:ln w="6350" cap="flat" cmpd="sng" algn="ctr">
-                            <a:solidFill>
-                              <a:srgbClr val="FFFFFF">
-                                <a:lumMod val="50000"/>
-                              </a:srgbClr>
-                            </a:solidFill>
-                            <a:prstDash val="solid"/>
-                            <a:miter lim="800000"/>
-                          </a:ln>
-                          <a:effectLst/>
-                        </wps:spPr>
-                        <wps:style>
-                          <a:lnRef idx="2">
-                            <a:schemeClr val="accent1">
-                              <a:lumMod val="75000"/>
-                            </a:schemeClr>
-                          </a:lnRef>
-                          <a:fillRef idx="1">
-                            <a:schemeClr val="accent1"/>
-                          </a:fillRef>
-                          <a:effectRef idx="0">
-                            <a:srgbClr val="FFFFFF"/>
-                          </a:effectRef>
-                          <a:fontRef idx="minor">
-                            <a:schemeClr val="lt1"/>
-                          </a:fontRef>
-                        </wps:style>
-                        <wps:txbx>
+    </w:p>
+    <w:tbl>
+      <w:tblPr>
+        <w:tblStyle w:val="a3"/>
+        <w:tblW w:w="0" w:type="auto"/>
+        <w:tblLook w:val="04A0" w:firstRow="1" w:lastRow="0" w:firstColumn="1" w:lastColumn="0" w:noHBand="0" w:noVBand="1"/>
+      </w:tblPr>
+      <w:tblGrid>
+        <w:gridCol w:w="4987"/>
+        <w:gridCol w:w="1420"/>
+        <w:gridCol w:w="163"/>
+        <w:gridCol w:w="155"/>
+        <w:gridCol w:w="155"/>
+        <w:gridCol w:w="1416"/>
+      </w:tblGrid>
+      <w:tr>
+        <w:tc>
+          <w:tcPr>
+            <w:tcW w:w="8296" w:type="dxa"/>
+            <w:gridSpan w:val="6"/>
+          </w:tcPr>
+          <w:p>
+            <w:pPr>
+              <w:spacing w:line="144" w:lineRule="auto"/>
+              <w:rPr>
+                <w:rFonts w:ascii="仿宋" w:eastAsia="仿宋" w:hAnsi="仿宋" w:cs="仿宋" w:hint="eastAsia"/>
+                <w:b/>
+                <w:bCs/>
+                <w:color w:val="15B720"/>
+                <w:sz w:val="18"/>
+                <w:szCs w:val="18"/>
+              </w:rPr>
+            </w:pPr>
+            <w:r>
+              <w:rPr>
+                <w:rFonts w:ascii="仿宋" w:eastAsia="仿宋" w:hAnsi="仿宋" w:cs="仿宋" w:hint="eastAsia"/>
+                <w:b/>
+                <w:bCs/>
+                <w:noProof/>
+                <w:color w:val="15B720"/>
+                <w:sz w:val="18"/>
+                <w:szCs w:val="18"/>
+              </w:rPr>
+              <mc:AlternateContent>
+                <mc:Choice Requires="wpg">
+                  <w:drawing>
+                    <wp:anchor distT="0" distB="0" distL="114300" distR="114300" simplePos="0" relativeHeight="251676672" behindDoc="0" locked="0" layoutInCell="1" allowOverlap="1" wp14:anchorId="37475B9E" wp14:editId="5F598987">
+                      <wp:simplePos x="0" y="0"/>
+                      <wp:positionH relativeFrom="column">
+                        <wp:posOffset>-42545</wp:posOffset>
+                      </wp:positionH>
+                      <wp:positionV relativeFrom="paragraph">
+                        <wp:posOffset>198755</wp:posOffset>
+                      </wp:positionV>
+                      <wp:extent cx="5219700" cy="1259840"/>
+                      <wp:effectExtent l="0" t="0" r="19050" b="16510"/>
+                      <wp:wrapTopAndBottom/>
+                      <wp:docPr id="63" name="组合 63"/>
+                      <wp:cNvGraphicFramePr/>
+                      <a:graphic xmlns:a="http://schemas.openxmlformats.org/drawingml/2006/main">
+                        <a:graphicData uri="http://schemas.microsoft.com/office/word/2010/wordprocessingGroup">
+                          <wpg:wgp>
+                            <wpg:cNvGrpSpPr/>
+                            <wpg:grpSpPr>
+                              <a:xfrm>
+                                <a:off x="0" y="0"/>
+                                <a:ext cx="5219700" cy="1259840"/>
+                                <a:chOff x="15606" y="36541"/>
+                                <a:chExt cx="8450" cy="1984"/>
+                              </a:xfrm>
+                            </wpg:grpSpPr>
+                            <wps:wsp>
+                              <wps:cNvPr id="23" name="圆角矩形 23"/>
+                              <wps:cNvSpPr/>
+                              <wps:spPr>
+                                <a:xfrm>
+                                  <a:off x="15606" y="37016"/>
+                                  <a:ext cx="8450" cy="1509"/>
+                                </a:xfrm>
+                                <a:prstGeom prst="roundRect">
+                                  <a:avLst/>
+                                </a:prstGeom>
+                                <a:noFill/>
+                                <a:ln w="6350" cap="flat" cmpd="sng" algn="ctr">
+                                  <a:solidFill>
+                                    <a:srgbClr val="FFFFFF">
+                                      <a:lumMod val="50000"/>
+                                    </a:srgbClr>
+                                  </a:solidFill>
+                                  <a:prstDash val="solid"/>
+                                  <a:miter lim="800000"/>
+                                </a:ln>
+                                <a:effectLst/>
+                              </wps:spPr>
+                              <wps:style>
+                                <a:lnRef idx="2">
+                                  <a:schemeClr val="accent1">
+                                    <a:lumMod val="75000"/>
+                                  </a:schemeClr>
+                                </a:lnRef>
+                                <a:fillRef idx="1">
+                                  <a:schemeClr val="accent1"/>
+                                </a:fillRef>
+                                <a:effectRef idx="0">
+                                  <a:srgbClr val="FFFFFF"/>
+                                </a:effectRef>
+                                <a:fontRef idx="minor">
+                                  <a:schemeClr val="lt1"/>
+                                </a:fontRef>
+                              </wps:style>
+                              <wps:txbx>
+                                <w:txbxContent>
+                                  <w:p>
+                                    <w:pPr>
+                                      <w:rPr>
+                                        <w:rFonts w:ascii="仿宋" w:eastAsia="仿宋" w:hAnsi="仿宋" w:cs="仿宋" w:hint="eastAsia"/>
+                                        <w:color w:val="000000"/>
+                                        <w:sz w:val="22"/>
+                                        <w:szCs w:val="22"/>
+                                      </w:rPr>
+                                    </w:pPr>
+                                    <w:r>
+                                      <w:rPr>
+                                        <w:rFonts w:ascii="仿宋" w:eastAsia="仿宋" w:hAnsi="仿宋" w:cs="仿宋" w:hint="eastAsia"/>
+                                        <w:color w:val="000000"/>
+                                        <w:sz w:val="22"/>
+                                        <w:szCs w:val="22"/>
+                                      </w:rPr>
+                                      <w:t>运用归纳、演绎等逻辑方法分析问题，能对信息进行分类整合和概念辨析，推理过程条理清晰、环环相扣，能构建有充分依据的判断和结论。</w:t>
+                                    </w:r>
+                                  </w:p>
+                                </w:txbxContent>
+                              </wps:txbx>
+                              <wps:bodyPr rot="0" spcFirstLastPara="0" vertOverflow="overflow" horzOverflow="overflow" vert="horz" wrap="square" lIns="91440" tIns="45720" rIns="91440" bIns="45720" numCol="1" spcCol="0" rtlCol="0" fromWordArt="0" anchor="ctr" anchorCtr="0" forceAA="0" compatLnSpc="1">
+                                <a:noAutofit/>
+                              </wps:bodyPr>
+                            </wps:wsp>
+                            <wps:wsp>
+                              <wps:cNvPr id="24" name="矩形 24"/>
+                              <wps:cNvSpPr/>
+                              <wps:spPr>
+                                <a:xfrm>
+                                  <a:off x="16321" y="36541"/>
+                                  <a:ext cx="2489" cy="675"/>
+                                </a:xfrm>
+                                <a:prstGeom prst="rect">
+                                  <a:avLst/>
+                                </a:prstGeom>
+                                <a:solidFill>
+                                  <a:srgbClr val="75BD42">
+                                    <a:lumMod val="60000"/>
+                                    <a:lumOff val="40000"/>
+                                  </a:srgbClr>
+                                </a:solidFill>
+                                <a:ln w="12700" cap="flat" cmpd="sng" algn="ctr">
+                                  <a:noFill/>
+                                  <a:prstDash val="solid"/>
+                                  <a:miter lim="800000"/>
+                                </a:ln>
+                                <a:effectLst/>
+                              </wps:spPr>
+                              <wps:style>
+                                <a:lnRef idx="2">
+                                  <a:schemeClr val="accent1">
+                                    <a:lumMod val="75000"/>
+                                  </a:schemeClr>
+                                </a:lnRef>
+                                <a:fillRef idx="1">
+                                  <a:schemeClr val="accent1"/>
+                                </a:fillRef>
+                                <a:effectRef idx="0">
+                                  <a:srgbClr val="FFFFFF"/>
+                                </a:effectRef>
+                                <a:fontRef idx="minor">
+                                  <a:schemeClr val="lt1"/>
+                                </a:fontRef>
+                              </wps:style>
+                              <wps:txbx>
+                                <w:txbxContent>
+                                  <w:p>
+                                    <w:pPr>
+                                      <w:spacing w:line="400" w:lineRule="exact"/>
+                                      <w:jc w:val="center"/>
+                                      <w:rPr>
+                                        <w:rFonts w:ascii="仿宋" w:eastAsia="仿宋" w:hAnsi="仿宋" w:cs="仿宋" w:hint="eastAsia"/>
+                                        <w:b/>
+                                        <w:bCs/>
+                                        <w:color w:val="000000"/>
+                                        <w:sz w:val="28"/>
+                                        <w:szCs w:val="28"/>
+                                      </w:rPr>
+                                    </w:pPr>
+                                    <w:r>
+                                      <w:rPr>
+                                        <w:rFonts w:ascii="仿宋" w:eastAsia="仿宋" w:hAnsi="仿宋" w:cs="仿宋" w:hint="eastAsia"/>
+                                        <w:b/>
+                                        <w:bCs/>
+                                        <w:color w:val="000000"/>
+                                        <w:sz w:val="28"/>
+                                        <w:szCs w:val="28"/>
+                                      </w:rPr>
+                                      <w:t>逻辑思维</w:t>
+                                    </w:r>
+                                  </w:p>
+                                </w:txbxContent>
+                              </wps:txbx>
+                              <wps:bodyPr rot="0" spcFirstLastPara="0" vertOverflow="overflow" horzOverflow="overflow" vert="horz" wrap="square" lIns="91440" tIns="45720" rIns="91440" bIns="45720" numCol="1" spcCol="0" rtlCol="0" fromWordArt="0" anchor="ctr" anchorCtr="0" forceAA="0" compatLnSpc="1">
+                                <a:noAutofit/>
+                              </wps:bodyPr>
+                            </wps:wsp>
+                          </wpg:wgp>
+                        </a:graphicData>
+                      </a:graphic>
+                      <wp14:sizeRelH relativeFrom="margin">
+                        <wp14:pctWidth>0</wp14:pctWidth>
+                      </wp14:sizeRelH>
+                    </wp:anchor>
+                  </w:drawing>
+                </mc:Choice>
+                <mc:Fallback>
+                  <w:pict>
+                    <v:group w14:anchorId="37475B9E" id="组合 63" o:spid="_x0000_s1026" style="position:absolute;left:0;text-align:left;margin-left:-3.35pt;margin-top:15.65pt;width:411pt;height:99.2pt;z-index:251676672;mso-width-relative:margin" coordorigin="15606,36541" coordsize="8450,1984" o:gfxdata="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">
+                      <v:roundrect id="圆角矩形 23" o:spid="_x0000_s1027" style="position:absolute;left:15606;top:37016;width:8450;height:1509;visibility:visible;mso-wrap-style:square;v-text-anchor:middle" arcsize="10923f" o:gfxdata="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" filled="f" strokecolor="#7f7f7f" strokeweight=".5pt">
+                        <v:stroke joinstyle="miter"/>
+                        <v:textbox>
                           <w:txbxContent>
                             <w:p>
                               <w:pPr>
@@ -2838,52 +2986,10 @@
                               </w:r>
                             </w:p>
                           </w:txbxContent>
-                        </wps:txbx>
-                        <wps:bodyPr rot="0" spcFirstLastPara="0" vertOverflow="overflow" horzOverflow="overflow" vert="horz" wrap="square" lIns="91440" tIns="45720" rIns="91440" bIns="45720" numCol="1" spcCol="0" rtlCol="0" fromWordArt="0" anchor="ctr" anchorCtr="0" forceAA="0" compatLnSpc="1">
-                          <a:noAutofit/>
-                        </wps:bodyPr>
-                      </wps:wsp>
-                      <wps:wsp>
-                        <wps:cNvPr id="24" name="矩形 24"/>
-                        <wps:cNvSpPr/>
-                        <wps:spPr>
-                          <a:xfrm>
-                            <a:off x="16321" y="36541"/>
-                            <a:ext cx="2489" cy="675"/>
-                          </a:xfrm>
-                          <a:prstGeom prst="rect">
-                            <a:avLst/>
-                          </a:prstGeom>
-                          <a:solidFill>
-                            <a:srgbClr val="75BD42">
-                              <a:lumMod val="60000"/>
-                              <a:lumOff val="40000"/>
-                            </a:srgbClr>
-                          </a:solidFill>
-                          <a:ln w="12700" cap="flat" cmpd="sng" algn="ctr">
-                            <a:noFill/>
-                            <a:prstDash val="solid"/>
-                            <a:miter lim="800000"/>
-                          </a:ln>
-                          <a:effectLst/>
-                        </wps:spPr>
-                        <wps:style>
-                          <a:lnRef idx="2">
-                            <a:schemeClr val="accent1">
-                              <a:lumMod val="75000"/>
-                            </a:schemeClr>
-                          </a:lnRef>
-                          <a:fillRef idx="1">
-                            <a:schemeClr val="accent1"/>
-                          </a:fillRef>
-                          <a:effectRef idx="0">
-                            <a:srgbClr val="FFFFFF"/>
-                          </a:effectRef>
-                          <a:fontRef idx="minor">
-                            <a:schemeClr val="lt1"/>
-                          </a:fontRef>
-                        </wps:style>
-                        <wps:txbx>
+                        </v:textbox>
+                      </v:roundrect>
+                      <v:rect id="矩形 24" o:spid="_x0000_s1028" style="position:absolute;left:16321;top:36541;width:2489;height:675;visibility:visible;mso-wrap-style:square;v-text-anchor:middle" o:gfxdata="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" fillcolor="#acd78e" stroked="f" strokeweight="1pt">
+                        <v:textbox>
                           <w:txbxContent>
                             <w:p>
                               <w:pPr>
@@ -2911,129 +3017,36 @@
                               </w:r>
                             </w:p>
                           </w:txbxContent>
-                        </wps:txbx>
-                        <wps:bodyPr rot="0" spcFirstLastPara="0" vertOverflow="overflow" horzOverflow="overflow" vert="horz" wrap="square" lIns="91440" tIns="45720" rIns="91440" bIns="45720" numCol="1" spcCol="0" rtlCol="0" fromWordArt="0" anchor="ctr" anchorCtr="0" forceAA="0" compatLnSpc="1">
-                          <a:noAutofit/>
-                        </wps:bodyPr>
-                      </wps:wsp>
-                    </wpg:wgp>
-                  </a:graphicData>
-                </a:graphic>
-                <wp14:sizeRelH relativeFrom="margin">
-                  <wp14:pctWidth>0</wp14:pctWidth>
-                </wp14:sizeRelH>
-              </wp:anchor>
-            </w:drawing>
-          </mc:Choice>
-          <mc:Fallback>
-            <w:pict>
-              <v:group w14:anchorId="7902DEFA" id="组合 63" o:spid="_x0000_s1026" style="position:absolute;left:0;text-align:left;margin-left:1.25pt;margin-top:28.6pt;width:411pt;height:99.2pt;z-index:251665408;mso-width-relative:margin" coordorigin="15606,36541" coordsize="8450,1984" o:gfxdata="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">
-                <v:roundrect id="圆角矩形 23" o:spid="_x0000_s1027" style="position:absolute;left:15606;top:37016;width:8450;height:1509;visibility:visible;mso-wrap-style:square;v-text-anchor:middle" arcsize="10923f" o:gfxdata="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" filled="f" strokecolor="#7f7f7f" strokeweight=".5pt">
-                  <v:stroke joinstyle="miter"/>
-                  <v:textbox>
-                    <w:txbxContent>
-                      <w:p>
-                        <w:pPr>
-                          <w:rPr>
-                            <w:rFonts w:ascii="仿宋" w:eastAsia="仿宋" w:hAnsi="仿宋" w:cs="仿宋" w:hint="eastAsia"/>
-                            <w:color w:val="000000"/>
-                            <w:sz w:val="22"/>
-                            <w:szCs w:val="22"/>
-                          </w:rPr>
-                        </w:pPr>
-                        <w:r>
-                          <w:rPr>
-                            <w:rFonts w:ascii="仿宋" w:eastAsia="仿宋" w:hAnsi="仿宋" w:cs="仿宋" w:hint="eastAsia"/>
-                            <w:color w:val="000000"/>
-                            <w:sz w:val="22"/>
-                            <w:szCs w:val="22"/>
-                          </w:rPr>
-                          <w:t>运用归纳、演绎等逻辑方法分析问题，能对信息进行分类整合和概念辨析，推理过程条理清晰、环环相扣，能构建有充分依据的判断和结论。</w:t>
-                        </w:r>
-                      </w:p>
-                    </w:txbxContent>
-                  </v:textbox>
-                </v:roundrect>
-                <v:rect id="矩形 24" o:spid="_x0000_s1028" style="position:absolute;left:16321;top:36541;width:2489;height:675;visibility:visible;mso-wrap-style:square;v-text-anchor:middle" o:gfxdata="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" fillcolor="#acd78e" stroked="f" strokeweight="1pt">
-                  <v:textbox>
-                    <w:txbxContent>
-                      <w:p>
-                        <w:pPr>
-                          <w:spacing w:line="400" w:lineRule="exact"/>
-                          <w:jc w:val="center"/>
-                          <w:rPr>
-                            <w:rFonts w:ascii="仿宋" w:eastAsia="仿宋" w:hAnsi="仿宋" w:cs="仿宋" w:hint="eastAsia"/>
-                            <w:b/>
-                            <w:bCs/>
-                            <w:color w:val="000000"/>
-                            <w:sz w:val="28"/>
-                            <w:szCs w:val="28"/>
-                          </w:rPr>
-                        </w:pPr>
-                        <w:r>
-                          <w:rPr>
-                            <w:rFonts w:ascii="仿宋" w:eastAsia="仿宋" w:hAnsi="仿宋" w:cs="仿宋" w:hint="eastAsia"/>
-                            <w:b/>
-                            <w:bCs/>
-                            <w:color w:val="000000"/>
-                            <w:sz w:val="28"/>
-                            <w:szCs w:val="28"/>
-                          </w:rPr>
-                          <w:t>逻辑思维</w:t>
-                        </w:r>
-                      </w:p>
-                    </w:txbxContent>
-                  </v:textbox>
-                </v:rect>
-                <w10:wrap type="topAndBottom"/>
-              </v:group>
-            </w:pict>
-          </mc:Fallback>
-        </mc:AlternateContent>
-      </w:r>
-    </w:p>
-    <w:p>
-      <w:pPr>
-        <w:spacing w:line="144" w:lineRule="auto"/>
-        <w:rPr>
-          <w:rFonts w:ascii="仿宋" w:eastAsia="仿宋" w:hAnsi="仿宋" w:cs="仿宋" w:hint="eastAsia"/>
-          <w:b/>
-          <w:bCs/>
-          <w:color w:val="15B720"/>
-          <w:sz w:val="18"/>
-          <w:szCs w:val="18"/>
-        </w:rPr>
-      </w:pPr>
-    </w:p>
-    <w:tbl>
-      <w:tblPr>
-        <w:tblStyle w:val="a3"/>
-        <w:tblW w:w="0" w:type="auto"/>
-        <w:tblBorders>
-          <w:top w:val="none" w:sz="0" w:space="0" w:color="auto"/>
-          <w:left w:val="none" w:sz="0" w:space="0" w:color="auto"/>
-          <w:bottom w:val="none" w:sz="0" w:space="0" w:color="auto"/>
-          <w:right w:val="none" w:sz="0" w:space="0" w:color="auto"/>
-          <w:insideH w:val="none" w:sz="0" w:space="0" w:color="auto"/>
-          <w:insideV w:val="none" w:sz="0" w:space="0" w:color="auto"/>
-        </w:tblBorders>
-        <w:tblLook w:val="04A0" w:firstRow="1" w:lastRow="0" w:firstColumn="1" w:lastColumn="0" w:noHBand="0" w:noVBand="1"/>
-      </w:tblPr>
-      <w:tblGrid>
-        <w:gridCol w:w="3300"/>
-        <w:gridCol w:w="5006"/>
-      </w:tblGrid>
+                        </v:textbox>
+                      </v:rect>
+                      <w10:wrap type="topAndBottom"/>
+                    </v:group>
+                  </w:pict>
+                </mc:Fallback>
+              </mc:AlternateContent>
+            </w:r>
+          </w:p>
+        </w:tc>
+      </w:tr>
       <w:tr>
+        <w:trPr>
+          <w:trHeight w:val="2192"/>
+        </w:trPr>
         <w:tc>
           <w:tcPr>
-            <w:tcW w:w="3303" w:type="dxa"/>
+            <w:tcW w:w="6903" w:type="dxa"/>
+            <w:gridSpan w:val="5"/>
           </w:tcPr>
           <w:p>
             <w:pPr>
               <w:spacing w:line="144" w:lineRule="auto"/>
               <w:rPr>
                 <w:rFonts w:ascii="仿宋" w:eastAsia="仿宋" w:hAnsi="仿宋" w:cs="仿宋" w:hint="eastAsia"/>
-                <w:sz w:val="24"/>
+                <w:b/>
+                <w:bCs/>
+                <w:color w:val="15B720"/>
+                <w:sz w:val="18"/>
+                <w:szCs w:val="18"/>
               </w:rPr>
             </w:pPr>
             <w:r>
@@ -3041,9 +3054,17 @@
                 <w:noProof/>
               </w:rPr>
               <w:drawing>
-                <wp:inline distT="0" distB="0" distL="114300" distR="114300" wp14:anchorId="3E97BC6E" wp14:editId="636993C0">
+                <wp:anchor distT="0" distB="0" distL="114300" distR="114300" simplePos="0" relativeHeight="251681792" behindDoc="0" locked="0" layoutInCell="1" allowOverlap="1" wp14:anchorId="51D72980" wp14:editId="6FFE8AC5">
+                  <wp:simplePos x="0" y="0"/>
+                  <wp:positionH relativeFrom="column">
+                    <wp:posOffset>-1220</wp:posOffset>
+                  </wp:positionH>
+                  <wp:positionV relativeFrom="paragraph">
+                    <wp:posOffset>23639</wp:posOffset>
+                  </wp:positionV>
                   <wp:extent cx="1908810" cy="1085215"/>
-                  <wp:effectExtent l="0" t="0" r="15240" b="57785"/>
+                  <wp:effectExtent l="0" t="0" r="0" b="635"/>
+                  <wp:wrapTopAndBottom/>
                   <wp:docPr id="115" name="图表 2" descr="7b0a202020202263686172745265734964223a20223530303539353737220a7d0a"/>
                   <wp:cNvGraphicFramePr/>
                   <a:graphic xmlns:a="http://schemas.openxmlformats.org/drawingml/2006/main">
@@ -3051,14 +3072,14 @@
                       <c:chart xmlns:c="http://schemas.openxmlformats.org/drawingml/2006/chart" xmlns:r="http://schemas.openxmlformats.org/officeDocument/2006/relationships" r:id="rId20"/>
                     </a:graphicData>
                   </a:graphic>
-                </wp:inline>
+                </wp:anchor>
               </w:drawing>
             </w:r>
           </w:p>
         </w:tc>
         <w:tc>
           <w:tcPr>
-            <w:tcW w:w="5219" w:type="dxa"/>
+            <w:tcW w:w="1393" w:type="dxa"/>
             <w:vAlign w:val="center"/>
           </w:tcPr>
           <w:p>
@@ -3114,6 +3135,11 @@
               <w:spacing w:line="144" w:lineRule="auto"/>
               <w:rPr>
                 <w:rFonts w:ascii="仿宋" w:eastAsia="仿宋" w:hAnsi="仿宋" w:cs="仿宋" w:hint="eastAsia"/>
+                <w:b/>
+                <w:bCs/>
+                <w:color w:val="15B720"/>
+                <w:sz w:val="18"/>
+                <w:szCs w:val="18"/>
               </w:rPr>
             </w:pPr>
             <w:r>
@@ -3148,20 +3174,23 @@
         </w:tc>
       </w:tr>
       <w:tr>
-        <w:trPr>
-          <w:trHeight w:val="567"/>
-        </w:trPr>
         <w:tc>
           <w:tcPr>
-            <w:tcW w:w="8522" w:type="dxa"/>
-            <w:gridSpan w:val="2"/>
+            <w:tcW w:w="8296" w:type="dxa"/>
+            <w:gridSpan w:val="6"/>
+            <w:vAlign w:val="center"/>
           </w:tcPr>
           <w:p>
             <w:pPr>
               <w:spacing w:line="144" w:lineRule="auto"/>
+              <w:jc w:val="left"/>
               <w:rPr>
                 <w:rFonts w:ascii="仿宋" w:eastAsia="仿宋" w:hAnsi="仿宋" w:cs="仿宋" w:hint="eastAsia"/>
-                <w:sz w:val="24"/>
+                <w:b/>
+                <w:bCs/>
+                <w:color w:val="15B720"/>
+                <w:sz w:val="18"/>
+                <w:szCs w:val="18"/>
               </w:rPr>
             </w:pPr>
             <w:r>
@@ -3195,94 +3224,213 @@
           </w:p>
         </w:tc>
       </w:tr>
-    </w:tbl>
-    <w:p>
-      <w:pPr>
-        <w:spacing w:line="144" w:lineRule="auto"/>
-        <w:rPr>
-          <w:rFonts w:ascii="仿宋" w:eastAsia="仿宋" w:hAnsi="仿宋" w:cs="仿宋" w:hint="eastAsia"/>
-          <w:b/>
-          <w:bCs/>
-          <w:color w:val="15B720"/>
-          <w:sz w:val="18"/>
-          <w:szCs w:val="18"/>
-        </w:rPr>
-      </w:pPr>
-      <w:r>
-        <w:rPr>
-          <w:rFonts w:ascii="仿宋" w:eastAsia="仿宋" w:hAnsi="仿宋" w:cs="仿宋" w:hint="eastAsia"/>
-          <w:noProof/>
-          <w:sz w:val="28"/>
-        </w:rPr>
-        <w:lastRenderedPageBreak/>
-        <mc:AlternateContent>
-          <mc:Choice Requires="wpg">
-            <w:drawing>
-              <wp:anchor distT="0" distB="0" distL="114300" distR="114300" simplePos="0" relativeHeight="251664384" behindDoc="0" locked="0" layoutInCell="1" allowOverlap="1" wp14:anchorId="3D5D52C9" wp14:editId="645622E9">
-                <wp:simplePos x="0" y="0"/>
-                <wp:positionH relativeFrom="column">
-                  <wp:posOffset>2540</wp:posOffset>
-                </wp:positionH>
-                <wp:positionV relativeFrom="paragraph">
-                  <wp:posOffset>54610</wp:posOffset>
-                </wp:positionV>
-                <wp:extent cx="5219700" cy="1259840"/>
-                <wp:effectExtent l="0" t="0" r="19050" b="16510"/>
-                <wp:wrapTopAndBottom/>
-                <wp:docPr id="64" name="组合 64"/>
-                <wp:cNvGraphicFramePr/>
-                <a:graphic xmlns:a="http://schemas.openxmlformats.org/drawingml/2006/main">
-                  <a:graphicData uri="http://schemas.microsoft.com/office/word/2010/wordprocessingGroup">
-                    <wpg:wgp>
-                      <wpg:cNvGrpSpPr/>
-                      <wpg:grpSpPr>
-                        <a:xfrm>
-                          <a:off x="0" y="0"/>
-                          <a:ext cx="5219700" cy="1259840"/>
-                          <a:chOff x="15606" y="36541"/>
-                          <a:chExt cx="8450" cy="1984"/>
-                        </a:xfrm>
-                      </wpg:grpSpPr>
-                      <wps:wsp>
-                        <wps:cNvPr id="21" name="圆角矩形 23"/>
-                        <wps:cNvSpPr/>
-                        <wps:spPr>
-                          <a:xfrm>
-                            <a:off x="15606" y="37016"/>
-                            <a:ext cx="8450" cy="1509"/>
-                          </a:xfrm>
-                          <a:prstGeom prst="roundRect">
-                            <a:avLst/>
-                          </a:prstGeom>
-                          <a:noFill/>
-                          <a:ln w="6350" cap="flat" cmpd="sng" algn="ctr">
-                            <a:solidFill>
-                              <a:srgbClr val="FFFFFF">
-                                <a:lumMod val="50000"/>
-                              </a:srgbClr>
-                            </a:solidFill>
-                            <a:prstDash val="solid"/>
-                            <a:miter lim="800000"/>
-                          </a:ln>
-                          <a:effectLst/>
-                        </wps:spPr>
-                        <wps:style>
-                          <a:lnRef idx="2">
-                            <a:schemeClr val="accent1">
-                              <a:lumMod val="75000"/>
-                            </a:schemeClr>
-                          </a:lnRef>
-                          <a:fillRef idx="1">
-                            <a:schemeClr val="accent1"/>
-                          </a:fillRef>
-                          <a:effectRef idx="0">
-                            <a:srgbClr val="FFFFFF"/>
-                          </a:effectRef>
-                          <a:fontRef idx="minor">
-                            <a:schemeClr val="lt1"/>
-                          </a:fontRef>
-                        </wps:style>
-                        <wps:txbx>
+      <w:tr>
+        <w:tc>
+          <w:tcPr>
+            <w:tcW w:w="8296" w:type="dxa"/>
+            <w:gridSpan w:val="6"/>
+          </w:tcPr>
+          <w:p>
+            <w:pPr>
+              <w:spacing w:line="144" w:lineRule="auto"/>
+              <w:rPr>
+                <w:rFonts w:ascii="仿宋" w:eastAsia="仿宋" w:hAnsi="仿宋" w:cs="仿宋" w:hint="eastAsia"/>
+                <w:b/>
+                <w:bCs/>
+                <w:color w:val="15B720"/>
+                <w:sz w:val="18"/>
+                <w:szCs w:val="18"/>
+              </w:rPr>
+            </w:pPr>
+            <w:r>
+              <w:rPr>
+                <w:rFonts w:ascii="仿宋" w:eastAsia="仿宋" w:hAnsi="仿宋" w:cs="仿宋" w:hint="eastAsia"/>
+                <w:noProof/>
+                <w:sz w:val="28"/>
+              </w:rPr>
+              <w:lastRenderedPageBreak/>
+              <mc:AlternateContent>
+                <mc:Choice Requires="wpg">
+                  <w:drawing>
+                    <wp:anchor distT="0" distB="0" distL="114300" distR="114300" simplePos="0" relativeHeight="251678720" behindDoc="0" locked="0" layoutInCell="1" allowOverlap="1" wp14:anchorId="7C1ACDF9" wp14:editId="08FDDA43">
+                      <wp:simplePos x="0" y="0"/>
+                      <wp:positionH relativeFrom="column">
+                        <wp:posOffset>-42545</wp:posOffset>
+                      </wp:positionH>
+                      <wp:positionV relativeFrom="paragraph">
+                        <wp:posOffset>198755</wp:posOffset>
+                      </wp:positionV>
+                      <wp:extent cx="5219700" cy="1259840"/>
+                      <wp:effectExtent l="0" t="0" r="19050" b="16510"/>
+                      <wp:wrapTopAndBottom/>
+                      <wp:docPr id="64" name="组合 64"/>
+                      <wp:cNvGraphicFramePr/>
+                      <a:graphic xmlns:a="http://schemas.openxmlformats.org/drawingml/2006/main">
+                        <a:graphicData uri="http://schemas.microsoft.com/office/word/2010/wordprocessingGroup">
+                          <wpg:wgp>
+                            <wpg:cNvGrpSpPr/>
+                            <wpg:grpSpPr>
+                              <a:xfrm>
+                                <a:off x="0" y="0"/>
+                                <a:ext cx="5219700" cy="1259840"/>
+                                <a:chOff x="15606" y="36541"/>
+                                <a:chExt cx="8450" cy="1984"/>
+                              </a:xfrm>
+                            </wpg:grpSpPr>
+                            <wps:wsp>
+                              <wps:cNvPr id="21" name="圆角矩形 23"/>
+                              <wps:cNvSpPr/>
+                              <wps:spPr>
+                                <a:xfrm>
+                                  <a:off x="15606" y="37016"/>
+                                  <a:ext cx="8450" cy="1509"/>
+                                </a:xfrm>
+                                <a:prstGeom prst="roundRect">
+                                  <a:avLst/>
+                                </a:prstGeom>
+                                <a:noFill/>
+                                <a:ln w="6350" cap="flat" cmpd="sng" algn="ctr">
+                                  <a:solidFill>
+                                    <a:srgbClr val="FFFFFF">
+                                      <a:lumMod val="50000"/>
+                                    </a:srgbClr>
+                                  </a:solidFill>
+                                  <a:prstDash val="solid"/>
+                                  <a:miter lim="800000"/>
+                                </a:ln>
+                                <a:effectLst/>
+                              </wps:spPr>
+                              <wps:style>
+                                <a:lnRef idx="2">
+                                  <a:schemeClr val="accent1">
+                                    <a:lumMod val="75000"/>
+                                  </a:schemeClr>
+                                </a:lnRef>
+                                <a:fillRef idx="1">
+                                  <a:schemeClr val="accent1"/>
+                                </a:fillRef>
+                                <a:effectRef idx="0">
+                                  <a:srgbClr val="FFFFFF"/>
+                                </a:effectRef>
+                                <a:fontRef idx="minor">
+                                  <a:schemeClr val="lt1"/>
+                                </a:fontRef>
+                              </wps:style>
+                              <wps:txbx>
+                                <w:txbxContent>
+                                  <w:p>
+                                    <w:pPr>
+                                      <w:rPr>
+                                        <w:rFonts w:ascii="仿宋" w:eastAsia="仿宋" w:hAnsi="仿宋" w:cs="仿宋" w:hint="eastAsia"/>
+                                        <w:color w:val="000000"/>
+                                        <w:sz w:val="22"/>
+                                        <w:szCs w:val="22"/>
+                                      </w:rPr>
+                                    </w:pPr>
+                                    <w:r>
+                                      <w:rPr>
+                                        <w:rFonts w:ascii="仿宋" w:eastAsia="仿宋" w:hAnsi="仿宋" w:cs="仿宋" w:hint="eastAsia"/>
+                                        <w:color w:val="000000"/>
+                                        <w:sz w:val="22"/>
+                                        <w:szCs w:val="22"/>
+                                      </w:rPr>
+                                      <w:t>熟练运用各类数字化工具和AI技术处理工作事务，具备数据思维与人机协作意识，能够借助新技术手段提升工作效率和决策质量。</w:t>
+                                    </w:r>
+                                  </w:p>
+                                </w:txbxContent>
+                              </wps:txbx>
+                              <wps:bodyPr rot="0" spcFirstLastPara="0" vertOverflow="overflow" horzOverflow="overflow" vert="horz" wrap="square" lIns="91440" tIns="45720" rIns="91440" bIns="45720" numCol="1" spcCol="0" rtlCol="0" fromWordArt="0" anchor="ctr" anchorCtr="0" forceAA="0" compatLnSpc="1">
+                                <a:noAutofit/>
+                              </wps:bodyPr>
+                            </wps:wsp>
+                            <wps:wsp>
+                              <wps:cNvPr id="22" name="矩形 24"/>
+                              <wps:cNvSpPr/>
+                              <wps:spPr>
+                                <a:xfrm>
+                                  <a:off x="16321" y="36541"/>
+                                  <a:ext cx="2489" cy="675"/>
+                                </a:xfrm>
+                                <a:prstGeom prst="rect">
+                                  <a:avLst/>
+                                </a:prstGeom>
+                                <a:solidFill>
+                                  <a:srgbClr val="75BD42">
+                                    <a:lumMod val="60000"/>
+                                    <a:lumOff val="40000"/>
+                                  </a:srgbClr>
+                                </a:solidFill>
+                                <a:ln w="12700" cap="flat" cmpd="sng" algn="ctr">
+                                  <a:noFill/>
+                                  <a:prstDash val="solid"/>
+                                  <a:miter lim="800000"/>
+                                </a:ln>
+                                <a:effectLst/>
+                              </wps:spPr>
+                              <wps:style>
+                                <a:lnRef idx="2">
+                                  <a:schemeClr val="accent1">
+                                    <a:lumMod val="75000"/>
+                                  </a:schemeClr>
+                                </a:lnRef>
+                                <a:fillRef idx="1">
+                                  <a:schemeClr val="accent1"/>
+                                </a:fillRef>
+                                <a:effectRef idx="0">
+                                  <a:srgbClr val="FFFFFF"/>
+                                </a:effectRef>
+                                <a:fontRef idx="minor">
+                                  <a:schemeClr val="lt1"/>
+                                </a:fontRef>
+                              </wps:style>
+                              <wps:txbx>
+                                <w:txbxContent>
+                                  <w:p>
+                                    <w:pPr>
+                                      <w:spacing w:line="400" w:lineRule="exact"/>
+                                      <w:jc w:val="center"/>
+                                      <w:rPr>
+                                        <w:rFonts w:ascii="仿宋" w:eastAsia="仿宋" w:hAnsi="仿宋" w:cs="仿宋" w:hint="eastAsia"/>
+                                        <w:b/>
+                                        <w:bCs/>
+                                        <w:color w:val="000000"/>
+                                        <w:sz w:val="28"/>
+                                        <w:szCs w:val="28"/>
+                                      </w:rPr>
+                                    </w:pPr>
+                                    <w:r>
+                                      <w:rPr>
+                                        <w:rFonts w:ascii="仿宋" w:eastAsia="仿宋" w:hAnsi="仿宋" w:cs="仿宋" w:hint="eastAsia"/>
+                                        <w:b/>
+                                        <w:bCs/>
+                                        <w:color w:val="000000"/>
+                                        <w:sz w:val="28"/>
+                                        <w:szCs w:val="28"/>
+                                      </w:rPr>
+                                      <w:t>数字应用</w:t>
+                                    </w:r>
+                                  </w:p>
+                                </w:txbxContent>
+                              </wps:txbx>
+                              <wps:bodyPr rot="0" spcFirstLastPara="0" vertOverflow="overflow" horzOverflow="overflow" vert="horz" wrap="square" lIns="91440" tIns="45720" rIns="91440" bIns="45720" numCol="1" spcCol="0" rtlCol="0" fromWordArt="0" anchor="ctr" anchorCtr="0" forceAA="0" compatLnSpc="1">
+                                <a:noAutofit/>
+                              </wps:bodyPr>
+                            </wps:wsp>
+                          </wpg:wgp>
+                        </a:graphicData>
+                      </a:graphic>
+                      <wp14:sizeRelH relativeFrom="margin">
+                        <wp14:pctWidth>0</wp14:pctWidth>
+                      </wp14:sizeRelH>
+                    </wp:anchor>
+                  </w:drawing>
+                </mc:Choice>
+                <mc:Fallback>
+                  <w:pict>
+                    <v:group w14:anchorId="7C1ACDF9" id="组合 64" o:spid="_x0000_s1029" style="position:absolute;left:0;text-align:left;margin-left:-3.35pt;margin-top:15.65pt;width:411pt;height:99.2pt;z-index:251678720;mso-width-relative:margin" coordorigin="15606,36541" coordsize="8450,1984" o:gfxdata="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">
+                      <v:roundrect id="圆角矩形 23" o:spid="_x0000_s1030" style="position:absolute;left:15606;top:37016;width:8450;height:1509;visibility:visible;mso-wrap-style:square;v-text-anchor:middle" arcsize="10923f" o:gfxdata="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" filled="f" strokecolor="#7f7f7f" strokeweight=".5pt">
+                        <v:stroke joinstyle="miter"/>
+                        <v:textbox>
                           <w:txbxContent>
                             <w:p>
                               <w:pPr>
@@ -3304,52 +3452,10 @@
                               </w:r>
                             </w:p>
                           </w:txbxContent>
-                        </wps:txbx>
-                        <wps:bodyPr rot="0" spcFirstLastPara="0" vertOverflow="overflow" horzOverflow="overflow" vert="horz" wrap="square" lIns="91440" tIns="45720" rIns="91440" bIns="45720" numCol="1" spcCol="0" rtlCol="0" fromWordArt="0" anchor="ctr" anchorCtr="0" forceAA="0" compatLnSpc="1">
-                          <a:noAutofit/>
-                        </wps:bodyPr>
-                      </wps:wsp>
-                      <wps:wsp>
-                        <wps:cNvPr id="22" name="矩形 24"/>
-                        <wps:cNvSpPr/>
-                        <wps:spPr>
-                          <a:xfrm>
-                            <a:off x="16321" y="36541"/>
-                            <a:ext cx="2489" cy="675"/>
-                          </a:xfrm>
-                          <a:prstGeom prst="rect">
-                            <a:avLst/>
-                          </a:prstGeom>
-                          <a:solidFill>
-                            <a:srgbClr val="75BD42">
-                              <a:lumMod val="60000"/>
-                              <a:lumOff val="40000"/>
-                            </a:srgbClr>
-                          </a:solidFill>
-                          <a:ln w="12700" cap="flat" cmpd="sng" algn="ctr">
-                            <a:noFill/>
-                            <a:prstDash val="solid"/>
-                            <a:miter lim="800000"/>
-                          </a:ln>
-                          <a:effectLst/>
-                        </wps:spPr>
-                        <wps:style>
-                          <a:lnRef idx="2">
-                            <a:schemeClr val="accent1">
-                              <a:lumMod val="75000"/>
-                            </a:schemeClr>
-                          </a:lnRef>
-                          <a:fillRef idx="1">
-                            <a:schemeClr val="accent1"/>
-                          </a:fillRef>
-                          <a:effectRef idx="0">
-                            <a:srgbClr val="FFFFFF"/>
-                          </a:effectRef>
-                          <a:fontRef idx="minor">
-                            <a:schemeClr val="lt1"/>
-                          </a:fontRef>
-                        </wps:style>
-                        <wps:txbx>
+                        </v:textbox>
+                      </v:roundrect>
+                      <v:rect id="矩形 24" o:spid="_x0000_s1031" style="position:absolute;left:16321;top:36541;width:2489;height:675;visibility:visible;mso-wrap-style:square;v-text-anchor:middle" o:gfxdata="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" fillcolor="#acd78e" stroked="f" strokeweight="1pt">
+                        <v:textbox>
                           <w:txbxContent>
                             <w:p>
                               <w:pPr>
@@ -3377,116 +3483,33 @@
                               </w:r>
                             </w:p>
                           </w:txbxContent>
-                        </wps:txbx>
-                        <wps:bodyPr rot="0" spcFirstLastPara="0" vertOverflow="overflow" horzOverflow="overflow" vert="horz" wrap="square" lIns="91440" tIns="45720" rIns="91440" bIns="45720" numCol="1" spcCol="0" rtlCol="0" fromWordArt="0" anchor="ctr" anchorCtr="0" forceAA="0" compatLnSpc="1">
-                          <a:noAutofit/>
-                        </wps:bodyPr>
-                      </wps:wsp>
-                    </wpg:wgp>
-                  </a:graphicData>
-                </a:graphic>
-                <wp14:sizeRelH relativeFrom="margin">
-                  <wp14:pctWidth>0</wp14:pctWidth>
-                </wp14:sizeRelH>
-              </wp:anchor>
-            </w:drawing>
-          </mc:Choice>
-          <mc:Fallback>
-            <w:pict>
-              <v:group w14:anchorId="3D5D52C9" id="组合 64" o:spid="_x0000_s1029" style="position:absolute;left:0;text-align:left;margin-left:.2pt;margin-top:4.3pt;width:411pt;height:99.2pt;z-index:251664384;mso-width-relative:margin" coordorigin="15606,36541" coordsize="8450,1984" o:gfxdata="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">
-                <v:roundrect id="圆角矩形 23" o:spid="_x0000_s1030" style="position:absolute;left:15606;top:37016;width:8450;height:1509;visibility:visible;mso-wrap-style:square;v-text-anchor:middle" arcsize="10923f" o:gfxdata="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" filled="f" strokecolor="#7f7f7f" strokeweight=".5pt">
-                  <v:stroke joinstyle="miter"/>
-                  <v:textbox>
-                    <w:txbxContent>
-                      <w:p>
-                        <w:pPr>
-                          <w:rPr>
-                            <w:rFonts w:ascii="仿宋" w:eastAsia="仿宋" w:hAnsi="仿宋" w:cs="仿宋" w:hint="eastAsia"/>
-                            <w:color w:val="000000"/>
-                            <w:sz w:val="22"/>
-                            <w:szCs w:val="22"/>
-                          </w:rPr>
-                        </w:pPr>
-                        <w:r>
-                          <w:rPr>
-                            <w:rFonts w:ascii="仿宋" w:eastAsia="仿宋" w:hAnsi="仿宋" w:cs="仿宋" w:hint="eastAsia"/>
-                            <w:color w:val="000000"/>
-                            <w:sz w:val="22"/>
-                            <w:szCs w:val="22"/>
-                          </w:rPr>
-                          <w:t>熟练运用各类数字化工具和AI技术处理工作事务，具备数据思维与人机协作意识，能够借助新技术手段提升工作效率和决策质量。</w:t>
-                        </w:r>
-                      </w:p>
-                    </w:txbxContent>
-                  </v:textbox>
-                </v:roundrect>
-                <v:rect id="矩形 24" o:spid="_x0000_s1031" style="position:absolute;left:16321;top:36541;width:2489;height:675;visibility:visible;mso-wrap-style:square;v-text-anchor:middle" o:gfxdata="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" fillcolor="#acd78e" stroked="f" strokeweight="1pt">
-                  <v:textbox>
-                    <w:txbxContent>
-                      <w:p>
-                        <w:pPr>
-                          <w:spacing w:line="400" w:lineRule="exact"/>
-                          <w:jc w:val="center"/>
-                          <w:rPr>
-                            <w:rFonts w:ascii="仿宋" w:eastAsia="仿宋" w:hAnsi="仿宋" w:cs="仿宋" w:hint="eastAsia"/>
-                            <w:b/>
-                            <w:bCs/>
-                            <w:color w:val="000000"/>
-                            <w:sz w:val="28"/>
-                            <w:szCs w:val="28"/>
-                          </w:rPr>
-                        </w:pPr>
-                        <w:r>
-                          <w:rPr>
-                            <w:rFonts w:ascii="仿宋" w:eastAsia="仿宋" w:hAnsi="仿宋" w:cs="仿宋" w:hint="eastAsia"/>
-                            <w:b/>
-                            <w:bCs/>
-                            <w:color w:val="000000"/>
-                            <w:sz w:val="28"/>
-                            <w:szCs w:val="28"/>
-                          </w:rPr>
-                          <w:t>数字应用</w:t>
-                        </w:r>
-                      </w:p>
-                    </w:txbxContent>
-                  </v:textbox>
-                </v:rect>
-                <w10:wrap type="topAndBottom"/>
-              </v:group>
-            </w:pict>
-          </mc:Fallback>
-        </mc:AlternateContent>
-      </w:r>
-    </w:p>
-    <w:tbl>
-      <w:tblPr>
-        <w:tblStyle w:val="a3"/>
-        <w:tblW w:w="0" w:type="auto"/>
-        <w:tblBorders>
-          <w:top w:val="none" w:sz="0" w:space="0" w:color="auto"/>
-          <w:left w:val="none" w:sz="0" w:space="0" w:color="auto"/>
-          <w:bottom w:val="none" w:sz="0" w:space="0" w:color="auto"/>
-          <w:right w:val="none" w:sz="0" w:space="0" w:color="auto"/>
-          <w:insideH w:val="none" w:sz="0" w:space="0" w:color="auto"/>
-          <w:insideV w:val="none" w:sz="0" w:space="0" w:color="auto"/>
-        </w:tblBorders>
-        <w:tblLook w:val="04A0" w:firstRow="1" w:lastRow="0" w:firstColumn="1" w:lastColumn="0" w:noHBand="0" w:noVBand="1"/>
-      </w:tblPr>
-      <w:tblGrid>
-        <w:gridCol w:w="3300"/>
-        <w:gridCol w:w="5006"/>
-      </w:tblGrid>
+                        </v:textbox>
+                      </v:rect>
+                      <w10:wrap type="topAndBottom"/>
+                    </v:group>
+                  </w:pict>
+                </mc:Fallback>
+              </mc:AlternateContent>
+            </w:r>
+          </w:p>
+        </w:tc>
+      </w:tr>
       <w:tr>
         <w:tc>
           <w:tcPr>
-            <w:tcW w:w="3303" w:type="dxa"/>
+            <w:tcW w:w="6687" w:type="dxa"/>
+            <w:gridSpan w:val="4"/>
           </w:tcPr>
           <w:p>
             <w:pPr>
               <w:spacing w:line="144" w:lineRule="auto"/>
               <w:rPr>
                 <w:rFonts w:ascii="仿宋" w:eastAsia="仿宋" w:hAnsi="仿宋" w:cs="仿宋" w:hint="eastAsia"/>
-                <w:sz w:val="24"/>
+                <w:b/>
+                <w:bCs/>
+                <w:color w:val="15B720"/>
+                <w:sz w:val="18"/>
+                <w:szCs w:val="18"/>
               </w:rPr>
             </w:pPr>
             <w:r>
@@ -3494,7 +3517,7 @@
                 <w:noProof/>
               </w:rPr>
               <w:drawing>
-                <wp:inline distT="0" distB="0" distL="114300" distR="114300" wp14:anchorId="1A6F5A5C" wp14:editId="57862FA4">
+                <wp:inline distT="0" distB="0" distL="114300" distR="114300" wp14:anchorId="0497AFCF" wp14:editId="4A403F29">
                   <wp:extent cx="1920875" cy="1091565"/>
                   <wp:effectExtent l="0" t="0" r="3175" b="51435"/>
                   <wp:docPr id="116" name="图表 2" descr="7b0a202020202263686172745265734964223a20223530303539353737220a7d0a"/>
@@ -3511,8 +3534,8 @@
         </w:tc>
         <w:tc>
           <w:tcPr>
-            <w:tcW w:w="5219" w:type="dxa"/>
-            <w:vAlign w:val="center"/>
+            <w:tcW w:w="1609" w:type="dxa"/>
+            <w:gridSpan w:val="2"/>
           </w:tcPr>
           <w:p>
             <w:pPr>
@@ -3567,6 +3590,11 @@
               <w:spacing w:line="144" w:lineRule="auto"/>
               <w:rPr>
                 <w:rFonts w:ascii="仿宋" w:eastAsia="仿宋" w:hAnsi="仿宋" w:cs="仿宋" w:hint="eastAsia"/>
+                <w:b/>
+                <w:bCs/>
+                <w:color w:val="15B720"/>
+                <w:sz w:val="18"/>
+                <w:szCs w:val="18"/>
               </w:rPr>
             </w:pPr>
             <w:r>
@@ -3601,20 +3629,21 @@
         </w:tc>
       </w:tr>
       <w:tr>
-        <w:trPr>
-          <w:trHeight w:val="567"/>
-        </w:trPr>
         <w:tc>
           <w:tcPr>
-            <w:tcW w:w="8522" w:type="dxa"/>
-            <w:gridSpan w:val="2"/>
+            <w:tcW w:w="8296" w:type="dxa"/>
+            <w:gridSpan w:val="6"/>
           </w:tcPr>
           <w:p>
             <w:pPr>
               <w:spacing w:line="144" w:lineRule="auto"/>
               <w:rPr>
                 <w:rFonts w:ascii="仿宋" w:eastAsia="仿宋" w:hAnsi="仿宋" w:cs="仿宋" w:hint="eastAsia"/>
-                <w:sz w:val="24"/>
+                <w:b/>
+                <w:bCs/>
+                <w:color w:val="15B720"/>
+                <w:sz w:val="18"/>
+                <w:szCs w:val="18"/>
               </w:rPr>
             </w:pPr>
             <w:r>
@@ -3648,96 +3677,214 @@
           </w:p>
         </w:tc>
       </w:tr>
-    </w:tbl>
-    <w:p>
-      <w:pPr>
-        <w:spacing w:line="144" w:lineRule="auto"/>
-        <w:rPr>
-          <w:rFonts w:ascii="仿宋" w:eastAsia="仿宋" w:hAnsi="仿宋" w:cs="仿宋" w:hint="eastAsia"/>
-          <w:b/>
-          <w:bCs/>
-          <w:color w:val="15B720"/>
-          <w:sz w:val="18"/>
-          <w:szCs w:val="18"/>
-        </w:rPr>
-      </w:pPr>
-      <w:r>
-        <w:rPr>
-          <w:rFonts w:ascii="仿宋" w:eastAsia="仿宋" w:hAnsi="仿宋" w:cs="仿宋" w:hint="eastAsia"/>
-          <w:b/>
-          <w:bCs/>
-          <w:color w:val="15B720"/>
-          <w:sz w:val="18"/>
-          <w:szCs w:val="18"/>
-        </w:rPr>
-        <mc:AlternateContent>
-          <mc:Choice Requires="wpg">
-            <w:drawing>
-              <wp:anchor distT="0" distB="0" distL="114300" distR="114300" simplePos="0" relativeHeight="251667456" behindDoc="0" locked="0" layoutInCell="1" allowOverlap="1" wp14:anchorId="7E7AC635" wp14:editId="51DE8F1A">
-                <wp:simplePos x="0" y="0"/>
-                <wp:positionH relativeFrom="column">
-                  <wp:posOffset>2540</wp:posOffset>
-                </wp:positionH>
-                <wp:positionV relativeFrom="paragraph">
-                  <wp:posOffset>55245</wp:posOffset>
-                </wp:positionV>
-                <wp:extent cx="5219700" cy="1259840"/>
-                <wp:effectExtent l="0" t="0" r="19050" b="16510"/>
-                <wp:wrapTopAndBottom/>
-                <wp:docPr id="66" name="组合 66"/>
-                <wp:cNvGraphicFramePr/>
-                <a:graphic xmlns:a="http://schemas.openxmlformats.org/drawingml/2006/main">
-                  <a:graphicData uri="http://schemas.microsoft.com/office/word/2010/wordprocessingGroup">
-                    <wpg:wgp>
-                      <wpg:cNvGrpSpPr/>
-                      <wpg:grpSpPr>
-                        <a:xfrm>
-                          <a:off x="0" y="0"/>
-                          <a:ext cx="5219700" cy="1259840"/>
-                          <a:chOff x="15606" y="36541"/>
-                          <a:chExt cx="8450" cy="1984"/>
-                        </a:xfrm>
-                      </wpg:grpSpPr>
-                      <wps:wsp>
-                        <wps:cNvPr id="28" name="圆角矩形 23"/>
-                        <wps:cNvSpPr/>
-                        <wps:spPr>
-                          <a:xfrm>
-                            <a:off x="15606" y="37016"/>
-                            <a:ext cx="8450" cy="1509"/>
-                          </a:xfrm>
-                          <a:prstGeom prst="roundRect">
-                            <a:avLst/>
-                          </a:prstGeom>
-                          <a:noFill/>
-                          <a:ln w="6350" cap="flat" cmpd="sng" algn="ctr">
-                            <a:solidFill>
-                              <a:srgbClr val="FFFFFF">
-                                <a:lumMod val="50000"/>
-                              </a:srgbClr>
-                            </a:solidFill>
-                            <a:prstDash val="solid"/>
-                            <a:miter lim="800000"/>
-                          </a:ln>
-                          <a:effectLst/>
-                        </wps:spPr>
-                        <wps:style>
-                          <a:lnRef idx="2">
-                            <a:schemeClr val="accent1">
-                              <a:lumMod val="75000"/>
-                            </a:schemeClr>
-                          </a:lnRef>
-                          <a:fillRef idx="1">
-                            <a:schemeClr val="accent1"/>
-                          </a:fillRef>
-                          <a:effectRef idx="0">
-                            <a:srgbClr val="FFFFFF"/>
-                          </a:effectRef>
-                          <a:fontRef idx="minor">
-                            <a:schemeClr val="lt1"/>
-                          </a:fontRef>
-                        </wps:style>
-                        <wps:txbx>
+      <w:tr>
+        <w:tc>
+          <w:tcPr>
+            <w:tcW w:w="8296" w:type="dxa"/>
+            <w:gridSpan w:val="6"/>
+          </w:tcPr>
+          <w:p>
+            <w:pPr>
+              <w:spacing w:line="144" w:lineRule="auto"/>
+              <w:rPr>
+                <w:rFonts w:ascii="仿宋" w:eastAsia="仿宋" w:hAnsi="仿宋" w:cs="仿宋" w:hint="eastAsia"/>
+                <w:color w:val="000000"/>
+                <w:sz w:val="22"/>
+                <w:szCs w:val="22"/>
+              </w:rPr>
+            </w:pPr>
+            <w:r>
+              <w:rPr>
+                <w:rFonts w:ascii="仿宋" w:eastAsia="仿宋" w:hAnsi="仿宋" w:cs="仿宋" w:hint="eastAsia"/>
+                <w:b/>
+                <w:bCs/>
+                <w:noProof/>
+                <w:color w:val="15B720"/>
+                <w:sz w:val="18"/>
+                <w:szCs w:val="18"/>
+              </w:rPr>
+              <mc:AlternateContent>
+                <mc:Choice Requires="wpg">
+                  <w:drawing>
+                    <wp:anchor distT="0" distB="0" distL="114300" distR="114300" simplePos="0" relativeHeight="251680768" behindDoc="0" locked="0" layoutInCell="1" allowOverlap="1" wp14:anchorId="4C36A7D0" wp14:editId="0DAAE421">
+                      <wp:simplePos x="0" y="0"/>
+                      <wp:positionH relativeFrom="column">
+                        <wp:posOffset>-42545</wp:posOffset>
+                      </wp:positionH>
+                      <wp:positionV relativeFrom="paragraph">
+                        <wp:posOffset>200025</wp:posOffset>
+                      </wp:positionV>
+                      <wp:extent cx="5219700" cy="1259840"/>
+                      <wp:effectExtent l="0" t="0" r="19050" b="16510"/>
+                      <wp:wrapTopAndBottom/>
+                      <wp:docPr id="66" name="组合 66"/>
+                      <wp:cNvGraphicFramePr/>
+                      <a:graphic xmlns:a="http://schemas.openxmlformats.org/drawingml/2006/main">
+                        <a:graphicData uri="http://schemas.microsoft.com/office/word/2010/wordprocessingGroup">
+                          <wpg:wgp>
+                            <wpg:cNvGrpSpPr/>
+                            <wpg:grpSpPr>
+                              <a:xfrm>
+                                <a:off x="0" y="0"/>
+                                <a:ext cx="5219700" cy="1259840"/>
+                                <a:chOff x="15606" y="36541"/>
+                                <a:chExt cx="8450" cy="1984"/>
+                              </a:xfrm>
+                            </wpg:grpSpPr>
+                            <wps:wsp>
+                              <wps:cNvPr id="28" name="圆角矩形 23"/>
+                              <wps:cNvSpPr/>
+                              <wps:spPr>
+                                <a:xfrm>
+                                  <a:off x="15606" y="37016"/>
+                                  <a:ext cx="8450" cy="1509"/>
+                                </a:xfrm>
+                                <a:prstGeom prst="roundRect">
+                                  <a:avLst/>
+                                </a:prstGeom>
+                                <a:noFill/>
+                                <a:ln w="6350" cap="flat" cmpd="sng" algn="ctr">
+                                  <a:solidFill>
+                                    <a:srgbClr val="FFFFFF">
+                                      <a:lumMod val="50000"/>
+                                    </a:srgbClr>
+                                  </a:solidFill>
+                                  <a:prstDash val="solid"/>
+                                  <a:miter lim="800000"/>
+                                </a:ln>
+                                <a:effectLst/>
+                              </wps:spPr>
+                              <wps:style>
+                                <a:lnRef idx="2">
+                                  <a:schemeClr val="accent1">
+                                    <a:lumMod val="75000"/>
+                                  </a:schemeClr>
+                                </a:lnRef>
+                                <a:fillRef idx="1">
+                                  <a:schemeClr val="accent1"/>
+                                </a:fillRef>
+                                <a:effectRef idx="0">
+                                  <a:srgbClr val="FFFFFF"/>
+                                </a:effectRef>
+                                <a:fontRef idx="minor">
+                                  <a:schemeClr val="lt1"/>
+                                </a:fontRef>
+                              </wps:style>
+                              <wps:txbx>
+                                <w:txbxContent>
+                                  <w:p>
+                                    <w:pPr>
+                                      <w:rPr>
+                                        <w:rFonts w:ascii="仿宋" w:eastAsia="仿宋" w:hAnsi="仿宋" w:cs="仿宋" w:hint="eastAsia"/>
+                                        <w:color w:val="000000"/>
+                                        <w:sz w:val="22"/>
+                                        <w:szCs w:val="22"/>
+                                      </w:rPr>
+                                    </w:pPr>
+                                    <w:r>
+                                      <w:rPr>
+                                        <w:rFonts w:ascii="仿宋" w:eastAsia="仿宋" w:hAnsi="仿宋" w:cs="仿宋" w:hint="eastAsia"/>
+                                        <w:color w:val="000000"/>
+                                        <w:sz w:val="22"/>
+                                        <w:szCs w:val="22"/>
+                                      </w:rPr>
+                                      <w:t>接到任务后迅速响应、立即行动，紧盯时间节点，在保证质量的前提下追求效率，确保按时交付成果。</w:t>
+                                    </w:r>
+                                  </w:p>
+                                </w:txbxContent>
+                              </wps:txbx>
+                              <wps:bodyPr rot="0" spcFirstLastPara="0" vertOverflow="overflow" horzOverflow="overflow" vert="horz" wrap="square" lIns="91440" tIns="45720" rIns="91440" bIns="45720" numCol="1" spcCol="0" rtlCol="0" fromWordArt="0" anchor="ctr" anchorCtr="0" forceAA="0" compatLnSpc="1">
+                                <a:noAutofit/>
+                              </wps:bodyPr>
+                            </wps:wsp>
+                            <wps:wsp>
+                              <wps:cNvPr id="29" name="矩形 24"/>
+                              <wps:cNvSpPr/>
+                              <wps:spPr>
+                                <a:xfrm>
+                                  <a:off x="16321" y="36541"/>
+                                  <a:ext cx="2489" cy="675"/>
+                                </a:xfrm>
+                                <a:prstGeom prst="rect">
+                                  <a:avLst/>
+                                </a:prstGeom>
+                                <a:solidFill>
+                                  <a:srgbClr val="75BD42">
+                                    <a:lumMod val="60000"/>
+                                    <a:lumOff val="40000"/>
+                                  </a:srgbClr>
+                                </a:solidFill>
+                                <a:ln w="12700" cap="flat" cmpd="sng" algn="ctr">
+                                  <a:noFill/>
+                                  <a:prstDash val="solid"/>
+                                  <a:miter lim="800000"/>
+                                </a:ln>
+                                <a:effectLst/>
+                              </wps:spPr>
+                              <wps:style>
+                                <a:lnRef idx="2">
+                                  <a:schemeClr val="accent1">
+                                    <a:lumMod val="75000"/>
+                                  </a:schemeClr>
+                                </a:lnRef>
+                                <a:fillRef idx="1">
+                                  <a:schemeClr val="accent1"/>
+                                </a:fillRef>
+                                <a:effectRef idx="0">
+                                  <a:srgbClr val="FFFFFF"/>
+                                </a:effectRef>
+                                <a:fontRef idx="minor">
+                                  <a:schemeClr val="lt1"/>
+                                </a:fontRef>
+                              </wps:style>
+                              <wps:txbx>
+                                <w:txbxContent>
+                                  <w:p>
+                                    <w:pPr>
+                                      <w:spacing w:line="400" w:lineRule="exact"/>
+                                      <w:jc w:val="center"/>
+                                      <w:rPr>
+                                        <w:rFonts w:ascii="仿宋" w:eastAsia="仿宋" w:hAnsi="仿宋" w:cs="仿宋" w:hint="eastAsia"/>
+                                        <w:b/>
+                                        <w:bCs/>
+                                        <w:color w:val="000000"/>
+                                        <w:sz w:val="28"/>
+                                        <w:szCs w:val="28"/>
+                                      </w:rPr>
+                                    </w:pPr>
+                                    <w:r>
+                                      <w:rPr>
+                                        <w:rFonts w:ascii="仿宋" w:eastAsia="仿宋" w:hAnsi="仿宋" w:cs="仿宋" w:hint="eastAsia"/>
+                                        <w:b/>
+                                        <w:bCs/>
+                                        <w:color w:val="000000"/>
+                                        <w:sz w:val="28"/>
+                                        <w:szCs w:val="28"/>
+                                      </w:rPr>
+                                      <w:t>计划执行</w:t>
+                                    </w:r>
+                                  </w:p>
+                                </w:txbxContent>
+                              </wps:txbx>
+                              <wps:bodyPr rot="0" spcFirstLastPara="0" vertOverflow="overflow" horzOverflow="overflow" vert="horz" wrap="square" lIns="91440" tIns="45720" rIns="91440" bIns="45720" numCol="1" spcCol="0" rtlCol="0" fromWordArt="0" anchor="ctr" anchorCtr="0" forceAA="0" compatLnSpc="1">
+                                <a:noAutofit/>
+                              </wps:bodyPr>
+                            </wps:wsp>
+                          </wpg:wgp>
+                        </a:graphicData>
+                      </a:graphic>
+                      <wp14:sizeRelH relativeFrom="margin">
+                        <wp14:pctWidth>0</wp14:pctWidth>
+                      </wp14:sizeRelH>
+                    </wp:anchor>
+                  </w:drawing>
+                </mc:Choice>
+                <mc:Fallback>
+                  <w:pict>
+                    <v:group w14:anchorId="4C36A7D0" id="组合 66" o:spid="_x0000_s1032" style="position:absolute;left:0;text-align:left;margin-left:-3.35pt;margin-top:15.75pt;width:411pt;height:99.2pt;z-index:251680768;mso-width-relative:margin" coordorigin="15606,36541" coordsize="8450,1984" o:gfxdata="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">
+                      <v:roundrect id="圆角矩形 23" o:spid="_x0000_s1033" style="position:absolute;left:15606;top:37016;width:8450;height:1509;visibility:visible;mso-wrap-style:square;v-text-anchor:middle" arcsize="10923f" o:gfxdata="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" filled="f" strokecolor="#7f7f7f" strokeweight=".5pt">
+                        <v:stroke joinstyle="miter"/>
+                        <v:textbox>
                           <w:txbxContent>
                             <w:p>
                               <w:pPr>
@@ -3759,52 +3906,10 @@
                               </w:r>
                             </w:p>
                           </w:txbxContent>
-                        </wps:txbx>
-                        <wps:bodyPr rot="0" spcFirstLastPara="0" vertOverflow="overflow" horzOverflow="overflow" vert="horz" wrap="square" lIns="91440" tIns="45720" rIns="91440" bIns="45720" numCol="1" spcCol="0" rtlCol="0" fromWordArt="0" anchor="ctr" anchorCtr="0" forceAA="0" compatLnSpc="1">
-                          <a:noAutofit/>
-                        </wps:bodyPr>
-                      </wps:wsp>
-                      <wps:wsp>
-                        <wps:cNvPr id="29" name="矩形 24"/>
-                        <wps:cNvSpPr/>
-                        <wps:spPr>
-                          <a:xfrm>
-                            <a:off x="16321" y="36541"/>
-                            <a:ext cx="2489" cy="675"/>
-                          </a:xfrm>
-                          <a:prstGeom prst="rect">
-                            <a:avLst/>
-                          </a:prstGeom>
-                          <a:solidFill>
-                            <a:srgbClr val="75BD42">
-                              <a:lumMod val="60000"/>
-                              <a:lumOff val="40000"/>
-                            </a:srgbClr>
-                          </a:solidFill>
-                          <a:ln w="12700" cap="flat" cmpd="sng" algn="ctr">
-                            <a:noFill/>
-                            <a:prstDash val="solid"/>
-                            <a:miter lim="800000"/>
-                          </a:ln>
-                          <a:effectLst/>
-                        </wps:spPr>
-                        <wps:style>
-                          <a:lnRef idx="2">
-                            <a:schemeClr val="accent1">
-                              <a:lumMod val="75000"/>
-                            </a:schemeClr>
-                          </a:lnRef>
-                          <a:fillRef idx="1">
-                            <a:schemeClr val="accent1"/>
-                          </a:fillRef>
-                          <a:effectRef idx="0">
-                            <a:srgbClr val="FFFFFF"/>
-                          </a:effectRef>
-                          <a:fontRef idx="minor">
-                            <a:schemeClr val="lt1"/>
-                          </a:fontRef>
-                        </wps:style>
-                        <wps:txbx>
+                        </v:textbox>
+                      </v:roundrect>
+                      <v:rect id="矩形 24" o:spid="_x0000_s1034" style="position:absolute;left:16321;top:36541;width:2489;height:675;visibility:visible;mso-wrap-style:square;v-text-anchor:middle" o:gfxdata="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" fillcolor="#acd78e" stroked="f" strokeweight="1pt">
+                        <v:textbox>
                           <w:txbxContent>
                             <w:p>
                               <w:pPr>
@@ -3832,116 +3937,31 @@
                               </w:r>
                             </w:p>
                           </w:txbxContent>
-                        </wps:txbx>
-                        <wps:bodyPr rot="0" spcFirstLastPara="0" vertOverflow="overflow" horzOverflow="overflow" vert="horz" wrap="square" lIns="91440" tIns="45720" rIns="91440" bIns="45720" numCol="1" spcCol="0" rtlCol="0" fromWordArt="0" anchor="ctr" anchorCtr="0" forceAA="0" compatLnSpc="1">
-                          <a:noAutofit/>
-                        </wps:bodyPr>
-                      </wps:wsp>
-                    </wpg:wgp>
-                  </a:graphicData>
-                </a:graphic>
-                <wp14:sizeRelH relativeFrom="margin">
-                  <wp14:pctWidth>0</wp14:pctWidth>
-                </wp14:sizeRelH>
-              </wp:anchor>
-            </w:drawing>
-          </mc:Choice>
-          <mc:Fallback>
-            <w:pict>
-              <v:group w14:anchorId="7E7AC635" id="组合 66" o:spid="_x0000_s1032" style="position:absolute;left:0;text-align:left;margin-left:.2pt;margin-top:4.35pt;width:411pt;height:99.2pt;z-index:251667456;mso-width-relative:margin" coordorigin="15606,36541" coordsize="8450,1984" o:gfxdata="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">
-                <v:roundrect id="圆角矩形 23" o:spid="_x0000_s1033" style="position:absolute;left:15606;top:37016;width:8450;height:1509;visibility:visible;mso-wrap-style:square;v-text-anchor:middle" arcsize="10923f" o:gfxdata="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" filled="f" strokecolor="#7f7f7f" strokeweight=".5pt">
-                  <v:stroke joinstyle="miter"/>
-                  <v:textbox>
-                    <w:txbxContent>
-                      <w:p>
-                        <w:pPr>
-                          <w:rPr>
-                            <w:rFonts w:ascii="仿宋" w:eastAsia="仿宋" w:hAnsi="仿宋" w:cs="仿宋" w:hint="eastAsia"/>
-                            <w:color w:val="000000"/>
-                            <w:sz w:val="22"/>
-                            <w:szCs w:val="22"/>
-                          </w:rPr>
-                        </w:pPr>
-                        <w:r>
-                          <w:rPr>
-                            <w:rFonts w:ascii="仿宋" w:eastAsia="仿宋" w:hAnsi="仿宋" w:cs="仿宋" w:hint="eastAsia"/>
-                            <w:color w:val="000000"/>
-                            <w:sz w:val="22"/>
-                            <w:szCs w:val="22"/>
-                          </w:rPr>
-                          <w:t>接到任务后迅速响应、立即行动，紧盯时间节点，在保证质量的前提下追求效率，确保按时交付成果。</w:t>
-                        </w:r>
-                      </w:p>
-                    </w:txbxContent>
-                  </v:textbox>
-                </v:roundrect>
-                <v:rect id="矩形 24" o:spid="_x0000_s1034" style="position:absolute;left:16321;top:36541;width:2489;height:675;visibility:visible;mso-wrap-style:square;v-text-anchor:middle" o:gfxdata="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" fillcolor="#acd78e" stroked="f" strokeweight="1pt">
-                  <v:textbox>
-                    <w:txbxContent>
-                      <w:p>
-                        <w:pPr>
-                          <w:spacing w:line="400" w:lineRule="exact"/>
-                          <w:jc w:val="center"/>
-                          <w:rPr>
-                            <w:rFonts w:ascii="仿宋" w:eastAsia="仿宋" w:hAnsi="仿宋" w:cs="仿宋" w:hint="eastAsia"/>
-                            <w:b/>
-                            <w:bCs/>
-                            <w:color w:val="000000"/>
-                            <w:sz w:val="28"/>
-                            <w:szCs w:val="28"/>
-                          </w:rPr>
-                        </w:pPr>
-                        <w:r>
-                          <w:rPr>
-                            <w:rFonts w:ascii="仿宋" w:eastAsia="仿宋" w:hAnsi="仿宋" w:cs="仿宋" w:hint="eastAsia"/>
-                            <w:b/>
-                            <w:bCs/>
-                            <w:color w:val="000000"/>
-                            <w:sz w:val="28"/>
-                            <w:szCs w:val="28"/>
-                          </w:rPr>
-                          <w:t>计划执行</w:t>
-                        </w:r>
-                      </w:p>
-                    </w:txbxContent>
-                  </v:textbox>
-                </v:rect>
-                <w10:wrap type="topAndBottom"/>
-              </v:group>
-            </w:pict>
-          </mc:Fallback>
-        </mc:AlternateContent>
-      </w:r>
-    </w:p>
-    <w:tbl>
-      <w:tblPr>
-        <w:tblStyle w:val="a3"/>
-        <w:tblW w:w="0" w:type="auto"/>
-        <w:tblBorders>
-          <w:top w:val="none" w:sz="0" w:space="0" w:color="auto"/>
-          <w:left w:val="none" w:sz="0" w:space="0" w:color="auto"/>
-          <w:bottom w:val="none" w:sz="0" w:space="0" w:color="auto"/>
-          <w:right w:val="none" w:sz="0" w:space="0" w:color="auto"/>
-          <w:insideH w:val="none" w:sz="0" w:space="0" w:color="auto"/>
-          <w:insideV w:val="none" w:sz="0" w:space="0" w:color="auto"/>
-        </w:tblBorders>
-        <w:tblLook w:val="04A0" w:firstRow="1" w:lastRow="0" w:firstColumn="1" w:lastColumn="0" w:noHBand="0" w:noVBand="1"/>
-      </w:tblPr>
-      <w:tblGrid>
-        <w:gridCol w:w="3300"/>
-        <w:gridCol w:w="5006"/>
-      </w:tblGrid>
+                        </v:textbox>
+                      </v:rect>
+                      <w10:wrap type="topAndBottom"/>
+                    </v:group>
+                  </w:pict>
+                </mc:Fallback>
+              </mc:AlternateContent>
+            </w:r>
+          </w:p>
+        </w:tc>
+      </w:tr>
       <w:tr>
         <w:tc>
           <w:tcPr>
-            <w:tcW w:w="3303" w:type="dxa"/>
+            <w:tcW w:w="6471" w:type="dxa"/>
+            <w:gridSpan w:val="3"/>
           </w:tcPr>
           <w:p>
             <w:pPr>
               <w:spacing w:line="144" w:lineRule="auto"/>
               <w:rPr>
                 <w:rFonts w:ascii="仿宋" w:eastAsia="仿宋" w:hAnsi="仿宋" w:cs="仿宋" w:hint="eastAsia"/>
-                <w:sz w:val="24"/>
+                <w:color w:val="000000"/>
+                <w:sz w:val="22"/>
+                <w:szCs w:val="22"/>
               </w:rPr>
             </w:pPr>
             <w:r>
@@ -3949,7 +3969,7 @@
                 <w:noProof/>
               </w:rPr>
               <w:drawing>
-                <wp:inline distT="0" distB="0" distL="114300" distR="114300" wp14:anchorId="38DCEB38" wp14:editId="6224C131">
+                <wp:inline distT="0" distB="0" distL="114300" distR="114300" wp14:anchorId="2F4B8EBE" wp14:editId="00AFCFC4">
                   <wp:extent cx="1907540" cy="1084580"/>
                   <wp:effectExtent l="0" t="0" r="16510" b="58420"/>
                   <wp:docPr id="117" name="图表 2" descr="7b0a202020202263686172745265734964223a20223530303539353737220a7d0a"/>
@@ -3966,8 +3986,8 @@
         </w:tc>
         <w:tc>
           <w:tcPr>
-            <w:tcW w:w="5219" w:type="dxa"/>
-            <w:vAlign w:val="center"/>
+            <w:tcW w:w="1825" w:type="dxa"/>
+            <w:gridSpan w:val="3"/>
           </w:tcPr>
           <w:p>
             <w:pPr>
@@ -4022,6 +4042,9 @@
               <w:spacing w:line="144" w:lineRule="auto"/>
               <w:rPr>
                 <w:rFonts w:ascii="仿宋" w:eastAsia="仿宋" w:hAnsi="仿宋" w:cs="仿宋" w:hint="eastAsia"/>
+                <w:color w:val="000000"/>
+                <w:sz w:val="22"/>
+                <w:szCs w:val="22"/>
               </w:rPr>
             </w:pPr>
             <w:r>
@@ -4056,20 +4079,19 @@
         </w:tc>
       </w:tr>
       <w:tr>
-        <w:trPr>
-          <w:trHeight w:val="567"/>
-        </w:trPr>
         <w:tc>
           <w:tcPr>
-            <w:tcW w:w="8522" w:type="dxa"/>
-            <w:gridSpan w:val="2"/>
+            <w:tcW w:w="8296" w:type="dxa"/>
+            <w:gridSpan w:val="6"/>
           </w:tcPr>
           <w:p>
             <w:pPr>
               <w:spacing w:line="144" w:lineRule="auto"/>
               <w:rPr>
                 <w:rFonts w:ascii="仿宋" w:eastAsia="仿宋" w:hAnsi="仿宋" w:cs="仿宋" w:hint="eastAsia"/>
-                <w:sz w:val="24"/>
+                <w:color w:val="000000"/>
+                <w:sz w:val="22"/>
+                <w:szCs w:val="22"/>
               </w:rPr>
             </w:pPr>
             <w:r>
@@ -4103,93 +4125,210 @@
           </w:p>
         </w:tc>
       </w:tr>
-    </w:tbl>
-    <w:p>
-      <w:pPr>
-        <w:spacing w:line="144" w:lineRule="auto"/>
-        <w:rPr>
-          <w:rFonts w:ascii="仿宋" w:eastAsia="仿宋" w:hAnsi="仿宋" w:cs="仿宋" w:hint="eastAsia"/>
-          <w:b/>
-          <w:bCs/>
-          <w:color w:val="15B720"/>
-          <w:sz w:val="28"/>
-          <w:szCs w:val="28"/>
-        </w:rPr>
-      </w:pPr>
-      <w:r>
-        <w:rPr>
-          <w:rFonts w:ascii="仿宋" w:eastAsia="仿宋" w:hAnsi="仿宋" w:cs="仿宋" w:hint="eastAsia"/>
-          <w:noProof/>
-          <w:sz w:val="28"/>
-        </w:rPr>
-        <mc:AlternateContent>
-          <mc:Choice Requires="wpg">
-            <w:drawing>
-              <wp:anchor distT="0" distB="0" distL="114300" distR="114300" simplePos="0" relativeHeight="251668480" behindDoc="0" locked="0" layoutInCell="1" allowOverlap="1" wp14:anchorId="2BA294E1" wp14:editId="37147275">
-                <wp:simplePos x="0" y="0"/>
-                <wp:positionH relativeFrom="column">
-                  <wp:posOffset>2540</wp:posOffset>
-                </wp:positionH>
-                <wp:positionV relativeFrom="paragraph">
-                  <wp:posOffset>55245</wp:posOffset>
-                </wp:positionV>
-                <wp:extent cx="5219700" cy="1259840"/>
-                <wp:effectExtent l="0" t="0" r="19050" b="16510"/>
-                <wp:wrapTopAndBottom/>
-                <wp:docPr id="67" name="组合 67"/>
-                <wp:cNvGraphicFramePr/>
-                <a:graphic xmlns:a="http://schemas.openxmlformats.org/drawingml/2006/main">
-                  <a:graphicData uri="http://schemas.microsoft.com/office/word/2010/wordprocessingGroup">
-                    <wpg:wgp>
-                      <wpg:cNvGrpSpPr/>
-                      <wpg:grpSpPr>
-                        <a:xfrm>
-                          <a:off x="0" y="0"/>
-                          <a:ext cx="5219700" cy="1259840"/>
-                          <a:chOff x="15606" y="36541"/>
-                          <a:chExt cx="8450" cy="1984"/>
-                        </a:xfrm>
-                      </wpg:grpSpPr>
-                      <wps:wsp>
-                        <wps:cNvPr id="32" name="圆角矩形 23"/>
-                        <wps:cNvSpPr/>
-                        <wps:spPr>
-                          <a:xfrm>
-                            <a:off x="15606" y="37016"/>
-                            <a:ext cx="8450" cy="1509"/>
-                          </a:xfrm>
-                          <a:prstGeom prst="roundRect">
-                            <a:avLst/>
-                          </a:prstGeom>
-                          <a:noFill/>
-                          <a:ln w="6350" cap="flat" cmpd="sng" algn="ctr">
-                            <a:solidFill>
-                              <a:srgbClr val="FFFFFF">
-                                <a:lumMod val="50000"/>
-                              </a:srgbClr>
-                            </a:solidFill>
-                            <a:prstDash val="solid"/>
-                            <a:miter lim="800000"/>
-                          </a:ln>
-                          <a:effectLst/>
-                        </wps:spPr>
-                        <wps:style>
-                          <a:lnRef idx="2">
-                            <a:schemeClr val="accent1">
-                              <a:lumMod val="75000"/>
-                            </a:schemeClr>
-                          </a:lnRef>
-                          <a:fillRef idx="1">
-                            <a:schemeClr val="accent1"/>
-                          </a:fillRef>
-                          <a:effectRef idx="0">
-                            <a:srgbClr val="FFFFFF"/>
-                          </a:effectRef>
-                          <a:fontRef idx="minor">
-                            <a:schemeClr val="lt1"/>
-                          </a:fontRef>
-                        </wps:style>
-                        <wps:txbx>
+      <w:tr>
+        <w:tc>
+          <w:tcPr>
+            <w:tcW w:w="8296" w:type="dxa"/>
+            <w:gridSpan w:val="6"/>
+          </w:tcPr>
+          <w:p>
+            <w:pPr>
+              <w:spacing w:line="144" w:lineRule="auto"/>
+              <w:rPr>
+                <w:rFonts w:ascii="仿宋" w:eastAsia="仿宋" w:hAnsi="仿宋" w:cs="仿宋" w:hint="eastAsia"/>
+                <w:color w:val="000000"/>
+                <w:sz w:val="22"/>
+                <w:szCs w:val="22"/>
+              </w:rPr>
+            </w:pPr>
+            <w:r>
+              <w:rPr>
+                <w:rFonts w:ascii="仿宋" w:eastAsia="仿宋" w:hAnsi="仿宋" w:cs="仿宋" w:hint="eastAsia"/>
+                <w:noProof/>
+                <w:sz w:val="28"/>
+              </w:rPr>
+              <mc:AlternateContent>
+                <mc:Choice Requires="wpg">
+                  <w:drawing>
+                    <wp:anchor distT="0" distB="0" distL="114300" distR="114300" simplePos="0" relativeHeight="251683840" behindDoc="0" locked="0" layoutInCell="1" allowOverlap="1" wp14:anchorId="3FB23AE5" wp14:editId="338A475F">
+                      <wp:simplePos x="0" y="0"/>
+                      <wp:positionH relativeFrom="column">
+                        <wp:posOffset>-42545</wp:posOffset>
+                      </wp:positionH>
+                      <wp:positionV relativeFrom="paragraph">
+                        <wp:posOffset>196850</wp:posOffset>
+                      </wp:positionV>
+                      <wp:extent cx="5219700" cy="1259840"/>
+                      <wp:effectExtent l="0" t="0" r="19050" b="16510"/>
+                      <wp:wrapTopAndBottom/>
+                      <wp:docPr id="67" name="组合 67"/>
+                      <wp:cNvGraphicFramePr/>
+                      <a:graphic xmlns:a="http://schemas.openxmlformats.org/drawingml/2006/main">
+                        <a:graphicData uri="http://schemas.microsoft.com/office/word/2010/wordprocessingGroup">
+                          <wpg:wgp>
+                            <wpg:cNvGrpSpPr/>
+                            <wpg:grpSpPr>
+                              <a:xfrm>
+                                <a:off x="0" y="0"/>
+                                <a:ext cx="5219700" cy="1259840"/>
+                                <a:chOff x="15606" y="36541"/>
+                                <a:chExt cx="8450" cy="1984"/>
+                              </a:xfrm>
+                            </wpg:grpSpPr>
+                            <wps:wsp>
+                              <wps:cNvPr id="32" name="圆角矩形 23"/>
+                              <wps:cNvSpPr/>
+                              <wps:spPr>
+                                <a:xfrm>
+                                  <a:off x="15606" y="37016"/>
+                                  <a:ext cx="8450" cy="1509"/>
+                                </a:xfrm>
+                                <a:prstGeom prst="roundRect">
+                                  <a:avLst/>
+                                </a:prstGeom>
+                                <a:noFill/>
+                                <a:ln w="6350" cap="flat" cmpd="sng" algn="ctr">
+                                  <a:solidFill>
+                                    <a:srgbClr val="FFFFFF">
+                                      <a:lumMod val="50000"/>
+                                    </a:srgbClr>
+                                  </a:solidFill>
+                                  <a:prstDash val="solid"/>
+                                  <a:miter lim="800000"/>
+                                </a:ln>
+                                <a:effectLst/>
+                              </wps:spPr>
+                              <wps:style>
+                                <a:lnRef idx="2">
+                                  <a:schemeClr val="accent1">
+                                    <a:lumMod val="75000"/>
+                                  </a:schemeClr>
+                                </a:lnRef>
+                                <a:fillRef idx="1">
+                                  <a:schemeClr val="accent1"/>
+                                </a:fillRef>
+                                <a:effectRef idx="0">
+                                  <a:srgbClr val="FFFFFF"/>
+                                </a:effectRef>
+                                <a:fontRef idx="minor">
+                                  <a:schemeClr val="lt1"/>
+                                </a:fontRef>
+                              </wps:style>
+                              <wps:txbx>
+                                <w:txbxContent>
+                                  <w:p>
+                                    <w:pPr>
+                                      <w:rPr>
+                                        <w:rFonts w:ascii="仿宋" w:eastAsia="仿宋" w:hAnsi="仿宋" w:cs="仿宋" w:hint="eastAsia"/>
+                                        <w:color w:val="000000"/>
+                                        <w:sz w:val="22"/>
+                                        <w:szCs w:val="22"/>
+                                      </w:rPr>
+                                    </w:pPr>
+                                    <w:r>
+                                      <w:rPr>
+                                        <w:rFonts w:ascii="仿宋" w:eastAsia="仿宋" w:hAnsi="仿宋" w:cs="仿宋" w:hint="eastAsia"/>
+                                        <w:color w:val="000000"/>
+                                        <w:sz w:val="22"/>
+                                        <w:szCs w:val="22"/>
+                                      </w:rPr>
+                                      <w:t>保持学习新知识、新技能的意愿，善于通过观察、请教和实践等多种途径获取知识，并将所学有效运用到实际工作中。</w:t>
+                                    </w:r>
+                                  </w:p>
+                                </w:txbxContent>
+                              </wps:txbx>
+                              <wps:bodyPr rot="0" spcFirstLastPara="0" vertOverflow="overflow" horzOverflow="overflow" vert="horz" wrap="square" lIns="91440" tIns="45720" rIns="91440" bIns="45720" numCol="1" spcCol="0" rtlCol="0" fromWordArt="0" anchor="ctr" anchorCtr="0" forceAA="0" compatLnSpc="1">
+                                <a:noAutofit/>
+                              </wps:bodyPr>
+                            </wps:wsp>
+                            <wps:wsp>
+                              <wps:cNvPr id="33" name="矩形 24"/>
+                              <wps:cNvSpPr/>
+                              <wps:spPr>
+                                <a:xfrm>
+                                  <a:off x="16321" y="36541"/>
+                                  <a:ext cx="2489" cy="675"/>
+                                </a:xfrm>
+                                <a:prstGeom prst="rect">
+                                  <a:avLst/>
+                                </a:prstGeom>
+                                <a:solidFill>
+                                  <a:srgbClr val="75BD42">
+                                    <a:lumMod val="60000"/>
+                                    <a:lumOff val="40000"/>
+                                  </a:srgbClr>
+                                </a:solidFill>
+                                <a:ln w="12700" cap="flat" cmpd="sng" algn="ctr">
+                                  <a:noFill/>
+                                  <a:prstDash val="solid"/>
+                                  <a:miter lim="800000"/>
+                                </a:ln>
+                                <a:effectLst/>
+                              </wps:spPr>
+                              <wps:style>
+                                <a:lnRef idx="2">
+                                  <a:schemeClr val="accent1">
+                                    <a:lumMod val="75000"/>
+                                  </a:schemeClr>
+                                </a:lnRef>
+                                <a:fillRef idx="1">
+                                  <a:schemeClr val="accent1"/>
+                                </a:fillRef>
+                                <a:effectRef idx="0">
+                                  <a:srgbClr val="FFFFFF"/>
+                                </a:effectRef>
+                                <a:fontRef idx="minor">
+                                  <a:schemeClr val="lt1"/>
+                                </a:fontRef>
+                              </wps:style>
+                              <wps:txbx>
+                                <w:txbxContent>
+                                  <w:p>
+                                    <w:pPr>
+                                      <w:spacing w:line="400" w:lineRule="exact"/>
+                                      <w:jc w:val="center"/>
+                                      <w:rPr>
+                                        <w:rFonts w:ascii="仿宋" w:eastAsia="仿宋" w:hAnsi="仿宋" w:cs="仿宋" w:hint="eastAsia"/>
+                                        <w:b/>
+                                        <w:bCs/>
+                                        <w:color w:val="000000"/>
+                                        <w:sz w:val="28"/>
+                                        <w:szCs w:val="28"/>
+                                      </w:rPr>
+                                    </w:pPr>
+                                    <w:r>
+                                      <w:rPr>
+                                        <w:rFonts w:ascii="仿宋" w:eastAsia="仿宋" w:hAnsi="仿宋" w:cs="仿宋" w:hint="eastAsia"/>
+                                        <w:b/>
+                                        <w:bCs/>
+                                        <w:color w:val="000000"/>
+                                        <w:sz w:val="28"/>
+                                        <w:szCs w:val="28"/>
+                                      </w:rPr>
+                                      <w:t>持续学习</w:t>
+                                    </w:r>
+                                  </w:p>
+                                </w:txbxContent>
+                              </wps:txbx>
+                              <wps:bodyPr rot="0" spcFirstLastPara="0" vertOverflow="overflow" horzOverflow="overflow" vert="horz" wrap="square" lIns="91440" tIns="45720" rIns="91440" bIns="45720" numCol="1" spcCol="0" rtlCol="0" fromWordArt="0" anchor="ctr" anchorCtr="0" forceAA="0" compatLnSpc="1">
+                                <a:noAutofit/>
+                              </wps:bodyPr>
+                            </wps:wsp>
+                          </wpg:wgp>
+                        </a:graphicData>
+                      </a:graphic>
+                      <wp14:sizeRelH relativeFrom="margin">
+                        <wp14:pctWidth>0</wp14:pctWidth>
+                      </wp14:sizeRelH>
+                    </wp:anchor>
+                  </w:drawing>
+                </mc:Choice>
+                <mc:Fallback>
+                  <w:pict>
+                    <v:group w14:anchorId="3FB23AE5" id="组合 67" o:spid="_x0000_s1035" style="position:absolute;left:0;text-align:left;margin-left:-3.35pt;margin-top:15.5pt;width:411pt;height:99.2pt;z-index:251683840;mso-width-relative:margin" coordorigin="15606,36541" coordsize="8450,1984" o:gfxdata="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">
+                      <v:roundrect id="圆角矩形 23" o:spid="_x0000_s1036" style="position:absolute;left:15606;top:37016;width:8450;height:1509;visibility:visible;mso-wrap-style:square;v-text-anchor:middle" arcsize="10923f" o:gfxdata="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" filled="f" strokecolor="#7f7f7f" strokeweight=".5pt">
+                        <v:stroke joinstyle="miter"/>
+                        <v:textbox>
                           <w:txbxContent>
                             <w:p>
                               <w:pPr>
@@ -4211,52 +4350,10 @@
                               </w:r>
                             </w:p>
                           </w:txbxContent>
-                        </wps:txbx>
-                        <wps:bodyPr rot="0" spcFirstLastPara="0" vertOverflow="overflow" horzOverflow="overflow" vert="horz" wrap="square" lIns="91440" tIns="45720" rIns="91440" bIns="45720" numCol="1" spcCol="0" rtlCol="0" fromWordArt="0" anchor="ctr" anchorCtr="0" forceAA="0" compatLnSpc="1">
-                          <a:noAutofit/>
-                        </wps:bodyPr>
-                      </wps:wsp>
-                      <wps:wsp>
-                        <wps:cNvPr id="33" name="矩形 24"/>
-                        <wps:cNvSpPr/>
-                        <wps:spPr>
-                          <a:xfrm>
-                            <a:off x="16321" y="36541"/>
-                            <a:ext cx="2489" cy="675"/>
-                          </a:xfrm>
-                          <a:prstGeom prst="rect">
-                            <a:avLst/>
-                          </a:prstGeom>
-                          <a:solidFill>
-                            <a:srgbClr val="75BD42">
-                              <a:lumMod val="60000"/>
-                              <a:lumOff val="40000"/>
-                            </a:srgbClr>
-                          </a:solidFill>
-                          <a:ln w="12700" cap="flat" cmpd="sng" algn="ctr">
-                            <a:noFill/>
-                            <a:prstDash val="solid"/>
-                            <a:miter lim="800000"/>
-                          </a:ln>
-                          <a:effectLst/>
-                        </wps:spPr>
-                        <wps:style>
-                          <a:lnRef idx="2">
-                            <a:schemeClr val="accent1">
-                              <a:lumMod val="75000"/>
-                            </a:schemeClr>
-                          </a:lnRef>
-                          <a:fillRef idx="1">
-                            <a:schemeClr val="accent1"/>
-                          </a:fillRef>
-                          <a:effectRef idx="0">
-                            <a:srgbClr val="FFFFFF"/>
-                          </a:effectRef>
-                          <a:fontRef idx="minor">
-                            <a:schemeClr val="lt1"/>
-                          </a:fontRef>
-                        </wps:style>
-                        <wps:txbx>
+                        </v:textbox>
+                      </v:roundrect>
+                      <v:rect id="矩形 24" o:spid="_x0000_s1037" style="position:absolute;left:16321;top:36541;width:2489;height:675;visibility:visible;mso-wrap-style:square;v-text-anchor:middle" o:gfxdata="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" fillcolor="#acd78e" stroked="f" strokeweight="1pt">
+                        <v:textbox>
                           <w:txbxContent>
                             <w:p>
                               <w:pPr>
@@ -4284,125 +4381,38 @@
                               </w:r>
                             </w:p>
                           </w:txbxContent>
-                        </wps:txbx>
-                        <wps:bodyPr rot="0" spcFirstLastPara="0" vertOverflow="overflow" horzOverflow="overflow" vert="horz" wrap="square" lIns="91440" tIns="45720" rIns="91440" bIns="45720" numCol="1" spcCol="0" rtlCol="0" fromWordArt="0" anchor="ctr" anchorCtr="0" forceAA="0" compatLnSpc="1">
-                          <a:noAutofit/>
-                        </wps:bodyPr>
-                      </wps:wsp>
-                    </wpg:wgp>
-                  </a:graphicData>
-                </a:graphic>
-                <wp14:sizeRelH relativeFrom="margin">
-                  <wp14:pctWidth>0</wp14:pctWidth>
-                </wp14:sizeRelH>
-              </wp:anchor>
-            </w:drawing>
-          </mc:Choice>
-          <mc:Fallback>
-            <w:pict>
-              <v:group w14:anchorId="2BA294E1" id="组合 67" o:spid="_x0000_s1035" style="position:absolute;left:0;text-align:left;margin-left:.2pt;margin-top:4.35pt;width:411pt;height:99.2pt;z-index:251668480;mso-width-relative:margin" coordorigin="15606,36541" coordsize="8450,1984" o:gfxdata="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">
-                <v:roundrect id="圆角矩形 23" o:spid="_x0000_s1036" style="position:absolute;left:15606;top:37016;width:8450;height:1509;visibility:visible;mso-wrap-style:square;v-text-anchor:middle" arcsize="10923f" o:gfxdata="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" filled="f" strokecolor="#7f7f7f" strokeweight=".5pt">
-                  <v:stroke joinstyle="miter"/>
-                  <v:textbox>
-                    <w:txbxContent>
-                      <w:p>
-                        <w:pPr>
-                          <w:rPr>
-                            <w:rFonts w:ascii="仿宋" w:eastAsia="仿宋" w:hAnsi="仿宋" w:cs="仿宋" w:hint="eastAsia"/>
-                            <w:color w:val="000000"/>
-                            <w:sz w:val="22"/>
-                            <w:szCs w:val="22"/>
-                          </w:rPr>
-                        </w:pPr>
-                        <w:r>
-                          <w:rPr>
-                            <w:rFonts w:ascii="仿宋" w:eastAsia="仿宋" w:hAnsi="仿宋" w:cs="仿宋" w:hint="eastAsia"/>
-                            <w:color w:val="000000"/>
-                            <w:sz w:val="22"/>
-                            <w:szCs w:val="22"/>
-                          </w:rPr>
-                          <w:t>保持学习新知识、新技能的意愿，善于通过观察、请教和实践等多种途径获取知识，并将所学有效运用到实际工作中。</w:t>
-                        </w:r>
-                      </w:p>
-                    </w:txbxContent>
-                  </v:textbox>
-                </v:roundrect>
-                <v:rect id="矩形 24" o:spid="_x0000_s1037" style="position:absolute;left:16321;top:36541;width:2489;height:675;visibility:visible;mso-wrap-style:square;v-text-anchor:middle" o:gfxdata="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" fillcolor="#acd78e" stroked="f" strokeweight="1pt">
-                  <v:textbox>
-                    <w:txbxContent>
-                      <w:p>
-                        <w:pPr>
-                          <w:spacing w:line="400" w:lineRule="exact"/>
-                          <w:jc w:val="center"/>
-                          <w:rPr>
-                            <w:rFonts w:ascii="仿宋" w:eastAsia="仿宋" w:hAnsi="仿宋" w:cs="仿宋" w:hint="eastAsia"/>
-                            <w:b/>
-                            <w:bCs/>
-                            <w:color w:val="000000"/>
-                            <w:sz w:val="28"/>
-                            <w:szCs w:val="28"/>
-                          </w:rPr>
-                        </w:pPr>
-                        <w:r>
-                          <w:rPr>
-                            <w:rFonts w:ascii="仿宋" w:eastAsia="仿宋" w:hAnsi="仿宋" w:cs="仿宋" w:hint="eastAsia"/>
-                            <w:b/>
-                            <w:bCs/>
-                            <w:color w:val="000000"/>
-                            <w:sz w:val="28"/>
-                            <w:szCs w:val="28"/>
-                          </w:rPr>
-                          <w:t>持续学习</w:t>
-                        </w:r>
-                      </w:p>
-                    </w:txbxContent>
-                  </v:textbox>
-                </v:rect>
-                <w10:wrap type="topAndBottom"/>
-              </v:group>
-            </w:pict>
-          </mc:Fallback>
-        </mc:AlternateContent>
-      </w:r>
-    </w:p>
-    <w:tbl>
-      <w:tblPr>
-        <w:tblStyle w:val="a3"/>
-        <w:tblW w:w="0" w:type="auto"/>
-        <w:tblBorders>
-          <w:top w:val="none" w:sz="0" w:space="0" w:color="auto"/>
-          <w:left w:val="none" w:sz="0" w:space="0" w:color="auto"/>
-          <w:bottom w:val="none" w:sz="0" w:space="0" w:color="auto"/>
-          <w:right w:val="none" w:sz="0" w:space="0" w:color="auto"/>
-          <w:insideH w:val="none" w:sz="0" w:space="0" w:color="auto"/>
-          <w:insideV w:val="none" w:sz="0" w:space="0" w:color="auto"/>
-        </w:tblBorders>
-        <w:tblLook w:val="04A0" w:firstRow="1" w:lastRow="0" w:firstColumn="1" w:lastColumn="0" w:noHBand="0" w:noVBand="1"/>
-      </w:tblPr>
-      <w:tblGrid>
-        <w:gridCol w:w="3306"/>
-        <w:gridCol w:w="5000"/>
-      </w:tblGrid>
+                        </v:textbox>
+                      </v:rect>
+                      <w10:wrap type="topAndBottom"/>
+                    </v:group>
+                  </w:pict>
+                </mc:Fallback>
+              </mc:AlternateContent>
+            </w:r>
+          </w:p>
+        </w:tc>
+      </w:tr>
       <w:tr>
         <w:tc>
           <w:tcPr>
-            <w:tcW w:w="3303" w:type="dxa"/>
+            <w:tcW w:w="6241" w:type="dxa"/>
+            <w:gridSpan w:val="2"/>
           </w:tcPr>
           <w:p>
             <w:pPr>
               <w:spacing w:line="144" w:lineRule="auto"/>
               <w:rPr>
                 <w:rFonts w:ascii="仿宋" w:eastAsia="仿宋" w:hAnsi="仿宋" w:cs="仿宋" w:hint="eastAsia"/>
-                <w:sz w:val="24"/>
+                <w:noProof/>
+                <w:sz w:val="28"/>
               </w:rPr>
             </w:pPr>
             <w:r>
               <w:rPr>
                 <w:noProof/>
               </w:rPr>
-              <w:lastRenderedPageBreak/>
               <w:drawing>
-                <wp:inline distT="0" distB="0" distL="114300" distR="114300" wp14:anchorId="17F15DCC" wp14:editId="2677BD6F">
+                <wp:inline distT="0" distB="0" distL="114300" distR="114300" wp14:anchorId="5C060DB9" wp14:editId="6F495110">
                   <wp:extent cx="1951355" cy="1111885"/>
                   <wp:effectExtent l="0" t="0" r="10795" b="50165"/>
                   <wp:docPr id="118" name="图表 2" descr="7b0a202020202263686172745265734964223a20223530303539353737220a7d0a"/>
@@ -4419,8 +4429,8 @@
         </w:tc>
         <w:tc>
           <w:tcPr>
-            <w:tcW w:w="5219" w:type="dxa"/>
-            <w:vAlign w:val="center"/>
+            <w:tcW w:w="2055" w:type="dxa"/>
+            <w:gridSpan w:val="4"/>
           </w:tcPr>
           <w:p>
             <w:pPr>
@@ -4475,6 +4485,8 @@
               <w:spacing w:line="144" w:lineRule="auto"/>
               <w:rPr>
                 <w:rFonts w:ascii="仿宋" w:eastAsia="仿宋" w:hAnsi="仿宋" w:cs="仿宋" w:hint="eastAsia"/>
+                <w:noProof/>
+                <w:sz w:val="28"/>
               </w:rPr>
             </w:pPr>
             <w:r>
@@ -4509,38 +4521,39 @@
         </w:tc>
       </w:tr>
       <w:tr>
-        <w:trPr>
-          <w:trHeight w:val="567"/>
-        </w:trPr>
         <w:tc>
           <w:tcPr>
-            <w:tcW w:w="8522" w:type="dxa"/>
-            <w:gridSpan w:val="2"/>
+            <w:tcW w:w="8296" w:type="dxa"/>
+            <w:gridSpan w:val="6"/>
           </w:tcPr>
           <w:p>
             <w:pPr>
               <w:spacing w:line="144" w:lineRule="auto"/>
               <w:rPr>
                 <w:rFonts w:ascii="仿宋" w:eastAsia="仿宋" w:hAnsi="仿宋" w:cs="仿宋" w:hint="eastAsia"/>
-                <w:sz w:val="24"/>
-              </w:rPr>
-            </w:pPr>
-            <w:r>
-              <w:rPr>
-                <w:rFonts w:ascii="仿宋" w:eastAsia="仿宋" w:hAnsi="仿宋" w:cs="仿宋" w:hint="eastAsia"/>
                 <w:color w:val="000000"/>
                 <w:sz w:val="22"/>
                 <w:szCs w:val="22"/>
               </w:rPr>
-              <w:t>【诊断】</w:t>
-            </w:r>
+            </w:pPr>
             <w:sdt>
               <w:sdtPr>
-                <w:alias w:val="dimension.competency-a1-04.diagnosis"/>
+                <w:rPr>
+                  <w:rFonts w:ascii="仿宋" w:eastAsia="仿宋" w:hAnsi="仿宋" w:cs="仿宋" w:hint="eastAsia"/>
+                  <w:color w:val="000000"/>
+                  <w:sz w:val="22"/>
+                  <w:szCs w:val="22"/>
+                </w:rPr>
+                <w:alias w:val="dimension.competency-a1-03.diagnosis"/>
                 <w:tag w:val="dimension.competency-a1-04.diagnosis"/>
-                <w:id w:val="-1451932941"/>
+                <w:id w:val="867575397"/>
                 <w:text/>
               </w:sdtPr>
+              <w:sdtEndPr>
+                <w:rPr>
+                  <w:rFonts w:hint="default"/>
+                </w:rPr>
+              </w:sdtEndPr>
               <w:sdtContent>
                 <w:r>
                   <w:rPr>
@@ -4549,100 +4562,218 @@
                     <w:sz w:val="22"/>
                     <w:szCs w:val="22"/>
                   </w:rPr>
-                  <w:t>此处显示该维度的诊断与发展建议。</w:t>
+                  <w:t>【诊断】此处显示该维度的诊断与发展建议。</w:t>
                 </w:r>
               </w:sdtContent>
             </w:sdt>
           </w:p>
         </w:tc>
       </w:tr>
-    </w:tbl>
-    <w:p>
-      <w:pPr>
-        <w:spacing w:line="144" w:lineRule="auto"/>
-        <w:rPr>
-          <w:rFonts w:ascii="仿宋" w:eastAsia="仿宋" w:hAnsi="仿宋" w:cs="仿宋" w:hint="eastAsia"/>
-          <w:b/>
-          <w:bCs/>
-          <w:color w:val="15B720"/>
-          <w:sz w:val="18"/>
-          <w:szCs w:val="18"/>
-        </w:rPr>
-      </w:pPr>
-      <w:r>
-        <w:rPr>
-          <w:rFonts w:ascii="仿宋" w:eastAsia="仿宋" w:hAnsi="仿宋" w:cs="仿宋" w:hint="eastAsia"/>
-          <w:noProof/>
-          <w:sz w:val="28"/>
-        </w:rPr>
-        <mc:AlternateContent>
-          <mc:Choice Requires="wpg">
-            <w:drawing>
-              <wp:anchor distT="0" distB="0" distL="114300" distR="114300" simplePos="0" relativeHeight="251669504" behindDoc="0" locked="0" layoutInCell="1" allowOverlap="1" wp14:anchorId="49696976" wp14:editId="5AAB1760">
-                <wp:simplePos x="0" y="0"/>
-                <wp:positionH relativeFrom="column">
-                  <wp:posOffset>2540</wp:posOffset>
-                </wp:positionH>
-                <wp:positionV relativeFrom="paragraph">
-                  <wp:posOffset>55245</wp:posOffset>
-                </wp:positionV>
-                <wp:extent cx="5219700" cy="1259840"/>
-                <wp:effectExtent l="0" t="0" r="19050" b="16510"/>
-                <wp:wrapTopAndBottom/>
-                <wp:docPr id="68" name="组合 68"/>
-                <wp:cNvGraphicFramePr/>
-                <a:graphic xmlns:a="http://schemas.openxmlformats.org/drawingml/2006/main">
-                  <a:graphicData uri="http://schemas.microsoft.com/office/word/2010/wordprocessingGroup">
-                    <wpg:wgp>
-                      <wpg:cNvGrpSpPr/>
-                      <wpg:grpSpPr>
-                        <a:xfrm>
-                          <a:off x="0" y="0"/>
-                          <a:ext cx="5219700" cy="1259840"/>
-                          <a:chOff x="15606" y="36541"/>
-                          <a:chExt cx="8450" cy="1984"/>
-                        </a:xfrm>
-                      </wpg:grpSpPr>
-                      <wps:wsp>
-                        <wps:cNvPr id="36" name="圆角矩形 23"/>
-                        <wps:cNvSpPr/>
-                        <wps:spPr>
-                          <a:xfrm>
-                            <a:off x="15606" y="37016"/>
-                            <a:ext cx="8450" cy="1509"/>
-                          </a:xfrm>
-                          <a:prstGeom prst="roundRect">
-                            <a:avLst/>
-                          </a:prstGeom>
-                          <a:noFill/>
-                          <a:ln w="6350" cap="flat" cmpd="sng" algn="ctr">
-                            <a:solidFill>
-                              <a:srgbClr val="FFFFFF">
-                                <a:lumMod val="50000"/>
-                              </a:srgbClr>
-                            </a:solidFill>
-                            <a:prstDash val="solid"/>
-                            <a:miter lim="800000"/>
-                          </a:ln>
-                          <a:effectLst/>
-                        </wps:spPr>
-                        <wps:style>
-                          <a:lnRef idx="2">
-                            <a:schemeClr val="accent1">
-                              <a:lumMod val="75000"/>
-                            </a:schemeClr>
-                          </a:lnRef>
-                          <a:fillRef idx="1">
-                            <a:schemeClr val="accent1"/>
-                          </a:fillRef>
-                          <a:effectRef idx="0">
-                            <a:srgbClr val="FFFFFF"/>
-                          </a:effectRef>
-                          <a:fontRef idx="minor">
-                            <a:schemeClr val="lt1"/>
-                          </a:fontRef>
-                        </wps:style>
-                        <wps:txbx>
+      <w:tr>
+        <w:tc>
+          <w:tcPr>
+            <w:tcW w:w="8296" w:type="dxa"/>
+            <w:gridSpan w:val="6"/>
+          </w:tcPr>
+          <w:p>
+            <w:pPr>
+              <w:spacing w:line="144" w:lineRule="auto"/>
+              <w:rPr>
+                <w:rFonts w:ascii="仿宋" w:eastAsia="仿宋" w:hAnsi="仿宋" w:cs="仿宋" w:hint="eastAsia"/>
+                <w:color w:val="000000"/>
+                <w:sz w:val="22"/>
+                <w:szCs w:val="22"/>
+              </w:rPr>
+            </w:pPr>
+            <w:r>
+              <w:rPr>
+                <w:rFonts w:ascii="仿宋" w:eastAsia="仿宋" w:hAnsi="仿宋" w:cs="仿宋" w:hint="eastAsia"/>
+                <w:noProof/>
+                <w:sz w:val="28"/>
+              </w:rPr>
+              <w:lastRenderedPageBreak/>
+              <mc:AlternateContent>
+                <mc:Choice Requires="wpg">
+                  <w:drawing>
+                    <wp:anchor distT="0" distB="0" distL="114300" distR="114300" simplePos="0" relativeHeight="251685888" behindDoc="0" locked="0" layoutInCell="1" allowOverlap="1" wp14:anchorId="2589046C" wp14:editId="147B5BE2">
+                      <wp:simplePos x="0" y="0"/>
+                      <wp:positionH relativeFrom="column">
+                        <wp:posOffset>-42545</wp:posOffset>
+                      </wp:positionH>
+                      <wp:positionV relativeFrom="paragraph">
+                        <wp:posOffset>198755</wp:posOffset>
+                      </wp:positionV>
+                      <wp:extent cx="5219700" cy="1259840"/>
+                      <wp:effectExtent l="0" t="0" r="19050" b="16510"/>
+                      <wp:wrapTopAndBottom/>
+                      <wp:docPr id="68" name="组合 68"/>
+                      <wp:cNvGraphicFramePr/>
+                      <a:graphic xmlns:a="http://schemas.openxmlformats.org/drawingml/2006/main">
+                        <a:graphicData uri="http://schemas.microsoft.com/office/word/2010/wordprocessingGroup">
+                          <wpg:wgp>
+                            <wpg:cNvGrpSpPr/>
+                            <wpg:grpSpPr>
+                              <a:xfrm>
+                                <a:off x="0" y="0"/>
+                                <a:ext cx="5219700" cy="1259840"/>
+                                <a:chOff x="15606" y="36541"/>
+                                <a:chExt cx="8450" cy="1984"/>
+                              </a:xfrm>
+                            </wpg:grpSpPr>
+                            <wps:wsp>
+                              <wps:cNvPr id="36" name="圆角矩形 23"/>
+                              <wps:cNvSpPr/>
+                              <wps:spPr>
+                                <a:xfrm>
+                                  <a:off x="15606" y="37016"/>
+                                  <a:ext cx="8450" cy="1509"/>
+                                </a:xfrm>
+                                <a:prstGeom prst="roundRect">
+                                  <a:avLst/>
+                                </a:prstGeom>
+                                <a:noFill/>
+                                <a:ln w="6350" cap="flat" cmpd="sng" algn="ctr">
+                                  <a:solidFill>
+                                    <a:srgbClr val="FFFFFF">
+                                      <a:lumMod val="50000"/>
+                                    </a:srgbClr>
+                                  </a:solidFill>
+                                  <a:prstDash val="solid"/>
+                                  <a:miter lim="800000"/>
+                                </a:ln>
+                                <a:effectLst/>
+                              </wps:spPr>
+                              <wps:style>
+                                <a:lnRef idx="2">
+                                  <a:schemeClr val="accent1">
+                                    <a:lumMod val="75000"/>
+                                  </a:schemeClr>
+                                </a:lnRef>
+                                <a:fillRef idx="1">
+                                  <a:schemeClr val="accent1"/>
+                                </a:fillRef>
+                                <a:effectRef idx="0">
+                                  <a:srgbClr val="FFFFFF"/>
+                                </a:effectRef>
+                                <a:fontRef idx="minor">
+                                  <a:schemeClr val="lt1"/>
+                                </a:fontRef>
+                              </wps:style>
+                              <wps:txbx>
+                                <w:txbxContent>
+                                  <w:p>
+                                    <w:pPr>
+                                      <w:rPr>
+                                        <w:rFonts w:ascii="仿宋" w:eastAsia="仿宋" w:hAnsi="仿宋" w:cs="仿宋" w:hint="eastAsia"/>
+                                        <w:color w:val="000000"/>
+                                        <w:sz w:val="22"/>
+                                        <w:szCs w:val="22"/>
+                                      </w:rPr>
+                                    </w:pPr>
+                                    <w:r>
+                                      <w:rPr>
+                                        <w:rFonts w:ascii="仿宋" w:eastAsia="仿宋" w:hAnsi="仿宋" w:cs="仿宋" w:hint="eastAsia"/>
+                                        <w:color w:val="000000"/>
+                                        <w:sz w:val="22"/>
+                                        <w:szCs w:val="22"/>
+                                      </w:rPr>
+                                      <w:t>用准确恰当的语言传递信息，表达观点时条理清晰、重点突出，同时重视倾听与反馈，保证信息传达到位、理解准确。</w:t>
+                                    </w:r>
+                                  </w:p>
+                                </w:txbxContent>
+                              </wps:txbx>
+                              <wps:bodyPr rot="0" spcFirstLastPara="0" vertOverflow="overflow" horzOverflow="overflow" vert="horz" wrap="square" lIns="91440" tIns="45720" rIns="91440" bIns="45720" numCol="1" spcCol="0" rtlCol="0" fromWordArt="0" anchor="ctr" anchorCtr="0" forceAA="0" compatLnSpc="1">
+                                <a:noAutofit/>
+                              </wps:bodyPr>
+                            </wps:wsp>
+                            <wps:wsp>
+                              <wps:cNvPr id="37" name="矩形 24"/>
+                              <wps:cNvSpPr/>
+                              <wps:spPr>
+                                <a:xfrm>
+                                  <a:off x="16321" y="36541"/>
+                                  <a:ext cx="2489" cy="675"/>
+                                </a:xfrm>
+                                <a:prstGeom prst="rect">
+                                  <a:avLst/>
+                                </a:prstGeom>
+                                <a:solidFill>
+                                  <a:srgbClr val="75BD42">
+                                    <a:lumMod val="60000"/>
+                                    <a:lumOff val="40000"/>
+                                  </a:srgbClr>
+                                </a:solidFill>
+                                <a:ln w="12700" cap="flat" cmpd="sng" algn="ctr">
+                                  <a:noFill/>
+                                  <a:prstDash val="solid"/>
+                                  <a:miter lim="800000"/>
+                                </a:ln>
+                                <a:effectLst/>
+                              </wps:spPr>
+                              <wps:style>
+                                <a:lnRef idx="2">
+                                  <a:schemeClr val="accent1">
+                                    <a:lumMod val="75000"/>
+                                  </a:schemeClr>
+                                </a:lnRef>
+                                <a:fillRef idx="1">
+                                  <a:schemeClr val="accent1"/>
+                                </a:fillRef>
+                                <a:effectRef idx="0">
+                                  <a:srgbClr val="FFFFFF"/>
+                                </a:effectRef>
+                                <a:fontRef idx="minor">
+                                  <a:schemeClr val="lt1"/>
+                                </a:fontRef>
+                              </wps:style>
+                              <wps:txbx>
+                                <w:txbxContent>
+                                  <w:p>
+                                    <w:pPr>
+                                      <w:spacing w:line="400" w:lineRule="exact"/>
+                                      <w:jc w:val="center"/>
+                                      <w:rPr>
+                                        <w:rFonts w:ascii="仿宋" w:eastAsia="仿宋" w:hAnsi="仿宋" w:cs="仿宋" w:hint="eastAsia"/>
+                                        <w:b/>
+                                        <w:bCs/>
+                                        <w:color w:val="000000"/>
+                                        <w:sz w:val="28"/>
+                                        <w:szCs w:val="28"/>
+                                      </w:rPr>
+                                    </w:pPr>
+                                    <w:r>
+                                      <w:rPr>
+                                        <w:rFonts w:ascii="仿宋" w:eastAsia="仿宋" w:hAnsi="仿宋" w:cs="仿宋" w:hint="eastAsia"/>
+                                        <w:b/>
+                                        <w:bCs/>
+                                        <w:color w:val="000000"/>
+                                        <w:sz w:val="28"/>
+                                        <w:szCs w:val="28"/>
+                                      </w:rPr>
+                                      <w:t>沟通表达</w:t>
+                                    </w:r>
+                                  </w:p>
+                                </w:txbxContent>
+                              </wps:txbx>
+                              <wps:bodyPr rot="0" spcFirstLastPara="0" vertOverflow="overflow" horzOverflow="overflow" vert="horz" wrap="square" lIns="91440" tIns="45720" rIns="91440" bIns="45720" numCol="1" spcCol="0" rtlCol="0" fromWordArt="0" anchor="ctr" anchorCtr="0" forceAA="0" compatLnSpc="1">
+                                <a:noAutofit/>
+                              </wps:bodyPr>
+                            </wps:wsp>
+                          </wpg:wgp>
+                        </a:graphicData>
+                      </a:graphic>
+                      <wp14:sizeRelH relativeFrom="margin">
+                        <wp14:pctWidth>0</wp14:pctWidth>
+                      </wp14:sizeRelH>
+                    </wp:anchor>
+                  </w:drawing>
+                </mc:Choice>
+                <mc:Fallback>
+                  <w:pict>
+                    <v:group w14:anchorId="2589046C" id="组合 68" o:spid="_x0000_s1038" style="position:absolute;left:0;text-align:left;margin-left:-3.35pt;margin-top:15.65pt;width:411pt;height:99.2pt;z-index:251685888;mso-width-relative:margin" coordorigin="15606,36541" coordsize="8450,1984" o:gfxdata="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">
+                      <v:roundrect id="圆角矩形 23" o:spid="_x0000_s1039" style="position:absolute;left:15606;top:37016;width:8450;height:1509;visibility:visible;mso-wrap-style:square;v-text-anchor:middle" arcsize="10923f" o:gfxdata="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" filled="f" strokecolor="#7f7f7f" strokeweight=".5pt">
+                        <v:stroke joinstyle="miter"/>
+                        <v:textbox>
                           <w:txbxContent>
                             <w:p>
                               <w:pPr>
@@ -4664,52 +4795,10 @@
                               </w:r>
                             </w:p>
                           </w:txbxContent>
-                        </wps:txbx>
-                        <wps:bodyPr rot="0" spcFirstLastPara="0" vertOverflow="overflow" horzOverflow="overflow" vert="horz" wrap="square" lIns="91440" tIns="45720" rIns="91440" bIns="45720" numCol="1" spcCol="0" rtlCol="0" fromWordArt="0" anchor="ctr" anchorCtr="0" forceAA="0" compatLnSpc="1">
-                          <a:noAutofit/>
-                        </wps:bodyPr>
-                      </wps:wsp>
-                      <wps:wsp>
-                        <wps:cNvPr id="37" name="矩形 24"/>
-                        <wps:cNvSpPr/>
-                        <wps:spPr>
-                          <a:xfrm>
-                            <a:off x="16321" y="36541"/>
-                            <a:ext cx="2489" cy="675"/>
-                          </a:xfrm>
-                          <a:prstGeom prst="rect">
-                            <a:avLst/>
-                          </a:prstGeom>
-                          <a:solidFill>
-                            <a:srgbClr val="75BD42">
-                              <a:lumMod val="60000"/>
-                              <a:lumOff val="40000"/>
-                            </a:srgbClr>
-                          </a:solidFill>
-                          <a:ln w="12700" cap="flat" cmpd="sng" algn="ctr">
-                            <a:noFill/>
-                            <a:prstDash val="solid"/>
-                            <a:miter lim="800000"/>
-                          </a:ln>
-                          <a:effectLst/>
-                        </wps:spPr>
-                        <wps:style>
-                          <a:lnRef idx="2">
-                            <a:schemeClr val="accent1">
-                              <a:lumMod val="75000"/>
-                            </a:schemeClr>
-                          </a:lnRef>
-                          <a:fillRef idx="1">
-                            <a:schemeClr val="accent1"/>
-                          </a:fillRef>
-                          <a:effectRef idx="0">
-                            <a:srgbClr val="FFFFFF"/>
-                          </a:effectRef>
-                          <a:fontRef idx="minor">
-                            <a:schemeClr val="lt1"/>
-                          </a:fontRef>
-                        </wps:style>
-                        <wps:txbx>
+                        </v:textbox>
+                      </v:roundrect>
+                      <v:rect id="矩形 24" o:spid="_x0000_s1040" style="position:absolute;left:16321;top:36541;width:2489;height:675;visibility:visible;mso-wrap-style:square;v-text-anchor:middle" o:gfxdata="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" fillcolor="#acd78e" stroked="f" strokeweight="1pt">
+                        <v:textbox>
                           <w:txbxContent>
                             <w:p>
                               <w:pPr>
@@ -4737,116 +4826,33 @@
                               </w:r>
                             </w:p>
                           </w:txbxContent>
-                        </wps:txbx>
-                        <wps:bodyPr rot="0" spcFirstLastPara="0" vertOverflow="overflow" horzOverflow="overflow" vert="horz" wrap="square" lIns="91440" tIns="45720" rIns="91440" bIns="45720" numCol="1" spcCol="0" rtlCol="0" fromWordArt="0" anchor="ctr" anchorCtr="0" forceAA="0" compatLnSpc="1">
-                          <a:noAutofit/>
-                        </wps:bodyPr>
-                      </wps:wsp>
-                    </wpg:wgp>
-                  </a:graphicData>
-                </a:graphic>
-                <wp14:sizeRelH relativeFrom="margin">
-                  <wp14:pctWidth>0</wp14:pctWidth>
-                </wp14:sizeRelH>
-              </wp:anchor>
-            </w:drawing>
-          </mc:Choice>
-          <mc:Fallback>
-            <w:pict>
-              <v:group w14:anchorId="49696976" id="组合 68" o:spid="_x0000_s1038" style="position:absolute;left:0;text-align:left;margin-left:.2pt;margin-top:4.35pt;width:411pt;height:99.2pt;z-index:251669504;mso-width-relative:margin" coordorigin="15606,36541" coordsize="8450,1984" o:gfxdata="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">
-                <v:roundrect id="圆角矩形 23" o:spid="_x0000_s1039" style="position:absolute;left:15606;top:37016;width:8450;height:1509;visibility:visible;mso-wrap-style:square;v-text-anchor:middle" arcsize="10923f" o:gfxdata="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" filled="f" strokecolor="#7f7f7f" strokeweight=".5pt">
-                  <v:stroke joinstyle="miter"/>
-                  <v:textbox>
-                    <w:txbxContent>
-                      <w:p>
-                        <w:pPr>
-                          <w:rPr>
-                            <w:rFonts w:ascii="仿宋" w:eastAsia="仿宋" w:hAnsi="仿宋" w:cs="仿宋" w:hint="eastAsia"/>
-                            <w:color w:val="000000"/>
-                            <w:sz w:val="22"/>
-                            <w:szCs w:val="22"/>
-                          </w:rPr>
-                        </w:pPr>
-                        <w:r>
-                          <w:rPr>
-                            <w:rFonts w:ascii="仿宋" w:eastAsia="仿宋" w:hAnsi="仿宋" w:cs="仿宋" w:hint="eastAsia"/>
-                            <w:color w:val="000000"/>
-                            <w:sz w:val="22"/>
-                            <w:szCs w:val="22"/>
-                          </w:rPr>
-                          <w:t>用准确恰当的语言传递信息，表达观点时条理清晰、重点突出，同时重视倾听与反馈，保证信息传达到位、理解准确。</w:t>
-                        </w:r>
-                      </w:p>
-                    </w:txbxContent>
-                  </v:textbox>
-                </v:roundrect>
-                <v:rect id="矩形 24" o:spid="_x0000_s1040" style="position:absolute;left:16321;top:36541;width:2489;height:675;visibility:visible;mso-wrap-style:square;v-text-anchor:middle" o:gfxdata="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" fillcolor="#acd78e" stroked="f" strokeweight="1pt">
-                  <v:textbox>
-                    <w:txbxContent>
-                      <w:p>
-                        <w:pPr>
-                          <w:spacing w:line="400" w:lineRule="exact"/>
-                          <w:jc w:val="center"/>
-                          <w:rPr>
-                            <w:rFonts w:ascii="仿宋" w:eastAsia="仿宋" w:hAnsi="仿宋" w:cs="仿宋" w:hint="eastAsia"/>
-                            <w:b/>
-                            <w:bCs/>
-                            <w:color w:val="000000"/>
-                            <w:sz w:val="28"/>
-                            <w:szCs w:val="28"/>
-                          </w:rPr>
-                        </w:pPr>
-                        <w:r>
-                          <w:rPr>
-                            <w:rFonts w:ascii="仿宋" w:eastAsia="仿宋" w:hAnsi="仿宋" w:cs="仿宋" w:hint="eastAsia"/>
-                            <w:b/>
-                            <w:bCs/>
-                            <w:color w:val="000000"/>
-                            <w:sz w:val="28"/>
-                            <w:szCs w:val="28"/>
-                          </w:rPr>
-                          <w:t>沟通表达</w:t>
-                        </w:r>
-                      </w:p>
-                    </w:txbxContent>
-                  </v:textbox>
-                </v:rect>
-                <w10:wrap type="topAndBottom"/>
-              </v:group>
-            </w:pict>
-          </mc:Fallback>
-        </mc:AlternateContent>
-      </w:r>
-    </w:p>
-    <w:tbl>
-      <w:tblPr>
-        <w:tblStyle w:val="a3"/>
-        <w:tblW w:w="0" w:type="auto"/>
-        <w:tblBorders>
-          <w:top w:val="none" w:sz="0" w:space="0" w:color="auto"/>
-          <w:left w:val="none" w:sz="0" w:space="0" w:color="auto"/>
-          <w:bottom w:val="none" w:sz="0" w:space="0" w:color="auto"/>
-          <w:right w:val="none" w:sz="0" w:space="0" w:color="auto"/>
-          <w:insideH w:val="none" w:sz="0" w:space="0" w:color="auto"/>
-          <w:insideV w:val="none" w:sz="0" w:space="0" w:color="auto"/>
-        </w:tblBorders>
-        <w:tblLook w:val="04A0" w:firstRow="1" w:lastRow="0" w:firstColumn="1" w:lastColumn="0" w:noHBand="0" w:noVBand="1"/>
-      </w:tblPr>
-      <w:tblGrid>
-        <w:gridCol w:w="3300"/>
-        <w:gridCol w:w="5006"/>
-      </w:tblGrid>
+                        </v:textbox>
+                      </v:rect>
+                      <w10:wrap type="topAndBottom"/>
+                    </v:group>
+                  </w:pict>
+                </mc:Fallback>
+              </mc:AlternateContent>
+            </w:r>
+          </w:p>
+        </w:tc>
+      </w:tr>
       <w:tr>
+        <w:trPr>
+          <w:trHeight w:val="1266"/>
+        </w:trPr>
         <w:tc>
           <w:tcPr>
-            <w:tcW w:w="3303" w:type="dxa"/>
+            <w:tcW w:w="4148" w:type="dxa"/>
           </w:tcPr>
           <w:p>
             <w:pPr>
               <w:spacing w:line="144" w:lineRule="auto"/>
               <w:rPr>
                 <w:rFonts w:ascii="仿宋" w:eastAsia="仿宋" w:hAnsi="仿宋" w:cs="仿宋" w:hint="eastAsia"/>
-                <w:sz w:val="24"/>
+                <w:color w:val="000000"/>
+                <w:sz w:val="22"/>
+                <w:szCs w:val="22"/>
               </w:rPr>
             </w:pPr>
             <w:r>
@@ -4854,7 +4860,7 @@
                 <w:noProof/>
               </w:rPr>
               <w:drawing>
-                <wp:inline distT="0" distB="0" distL="114300" distR="114300" wp14:anchorId="4D6C8B42" wp14:editId="70ACA5B9">
+                <wp:inline distT="0" distB="0" distL="114300" distR="114300" wp14:anchorId="369F8499" wp14:editId="20AEC218">
                   <wp:extent cx="1919605" cy="1091565"/>
                   <wp:effectExtent l="0" t="0" r="4445" b="51435"/>
                   <wp:docPr id="119" name="图表 2" descr="7b0a202020202263686172745265734964223a20223530303539353737220a7d0a"/>
@@ -4871,8 +4877,8 @@
         </w:tc>
         <w:tc>
           <w:tcPr>
-            <w:tcW w:w="5219" w:type="dxa"/>
-            <w:vAlign w:val="center"/>
+            <w:tcW w:w="4148" w:type="dxa"/>
+            <w:gridSpan w:val="5"/>
           </w:tcPr>
           <w:p>
             <w:pPr>
@@ -4927,6 +4933,9 @@
               <w:spacing w:line="144" w:lineRule="auto"/>
               <w:rPr>
                 <w:rFonts w:ascii="仿宋" w:eastAsia="仿宋" w:hAnsi="仿宋" w:cs="仿宋" w:hint="eastAsia"/>
+                <w:color w:val="000000"/>
+                <w:sz w:val="22"/>
+                <w:szCs w:val="22"/>
               </w:rPr>
             </w:pPr>
             <w:r>
@@ -4961,20 +4970,19 @@
         </w:tc>
       </w:tr>
       <w:tr>
-        <w:trPr>
-          <w:trHeight w:val="567"/>
-        </w:trPr>
         <w:tc>
           <w:tcPr>
-            <w:tcW w:w="8522" w:type="dxa"/>
-            <w:gridSpan w:val="2"/>
+            <w:tcW w:w="8296" w:type="dxa"/>
+            <w:gridSpan w:val="6"/>
           </w:tcPr>
           <w:p>
             <w:pPr>
               <w:spacing w:line="144" w:lineRule="auto"/>
               <w:rPr>
                 <w:rFonts w:ascii="仿宋" w:eastAsia="仿宋" w:hAnsi="仿宋" w:cs="仿宋" w:hint="eastAsia"/>
-                <w:sz w:val="24"/>
+                <w:color w:val="000000"/>
+                <w:sz w:val="22"/>
+                <w:szCs w:val="22"/>
               </w:rPr>
             </w:pPr>
             <w:r>
@@ -5009,6 +5017,19 @@
         </w:tc>
       </w:tr>
     </w:tbl>
+    <w:p>
+      <w:pPr>
+        <w:spacing w:line="144" w:lineRule="auto"/>
+        <w:rPr>
+          <w:rFonts w:ascii="仿宋" w:eastAsia="仿宋" w:hAnsi="仿宋" w:cs="仿宋" w:hint="eastAsia"/>
+          <w:b/>
+          <w:bCs/>
+          <w:color w:val="15B720"/>
+          <w:sz w:val="18"/>
+          <w:szCs w:val="18"/>
+        </w:rPr>
+      </w:pPr>
+    </w:p>
     <w:p>
       <w:pPr>
         <w:rPr>
@@ -5055,7 +5076,7 @@
       <w:pPr>
         <w:spacing w:line="144" w:lineRule="auto"/>
         <w:rPr>
-          <w:rFonts w:ascii="仿宋" w:eastAsia="仿宋" w:hAnsi="仿宋" w:cs="仿宋"/>
+          <w:rFonts w:ascii="仿宋" w:eastAsia="仿宋" w:hAnsi="仿宋" w:cs="仿宋" w:hint="eastAsia"/>
           <w:b/>
           <w:bCs/>
           <w:color w:val="15B720"/>
@@ -5071,7 +5092,7 @@
         <mc:AlternateContent>
           <mc:Choice Requires="wpg">
             <w:drawing>
-              <wp:anchor distT="0" distB="0" distL="114300" distR="114300" simplePos="0" relativeHeight="251670528" behindDoc="0" locked="0" layoutInCell="1" allowOverlap="1" wp14:anchorId="74EA68DF" wp14:editId="02091713">
+              <wp:anchor distT="0" distB="0" distL="114300" distR="114300" simplePos="0" relativeHeight="251669504" behindDoc="0" locked="0" layoutInCell="1" allowOverlap="1" wp14:anchorId="74EA68DF" wp14:editId="5EAABF91">
                 <wp:simplePos x="0" y="0"/>
                 <wp:positionH relativeFrom="column">
                   <wp:posOffset>29210</wp:posOffset>
@@ -5249,7 +5270,7 @@
           </mc:Choice>
           <mc:Fallback>
             <w:pict>
-              <v:group w14:anchorId="74EA68DF" id="组合 69" o:spid="_x0000_s1041" style="position:absolute;left:0;text-align:left;margin-left:2.3pt;margin-top:22.9pt;width:411pt;height:96pt;z-index:251670528;mso-width-relative:margin;mso-height-relative:margin" coordorigin="15606,36605" coordsize="8450,1920" o:gfxdata="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">
+              <v:group w14:anchorId="74EA68DF" id="组合 69" o:spid="_x0000_s1041" style="position:absolute;left:0;text-align:left;margin-left:2.3pt;margin-top:22.9pt;width:411pt;height:96pt;z-index:251669504;mso-width-relative:margin;mso-height-relative:margin" coordorigin="15606,36605" coordsize="8450,1920" o:gfxdata="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">
                 <v:roundrect id="圆角矩形 23" o:spid="_x0000_s1042" style="position:absolute;left:15606;top:37016;width:8450;height:1509;visibility:visible;mso-wrap-style:square;v-text-anchor:middle" arcsize="10923f" o:gfxdata="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" filled="f" strokecolor="#7f7f7f" strokeweight=".5pt">
                   <v:stroke joinstyle="miter"/>
                   <v:textbox>
@@ -5537,11 +5558,10 @@
           <w:sz w:val="18"/>
           <w:szCs w:val="16"/>
         </w:rPr>
-        <w:lastRenderedPageBreak/>
         <mc:AlternateContent>
           <mc:Choice Requires="wpg">
             <w:drawing>
-              <wp:anchor distT="0" distB="0" distL="114300" distR="114300" simplePos="0" relativeHeight="251671552" behindDoc="0" locked="0" layoutInCell="1" allowOverlap="1" wp14:anchorId="5472BF84" wp14:editId="68A99FF6">
+              <wp:anchor distT="0" distB="0" distL="114300" distR="114300" simplePos="0" relativeHeight="251670528" behindDoc="0" locked="0" layoutInCell="1" allowOverlap="1" wp14:anchorId="5472BF84" wp14:editId="5783FA49">
                 <wp:simplePos x="0" y="0"/>
                 <wp:positionH relativeFrom="column">
                   <wp:posOffset>2540</wp:posOffset>
@@ -5716,7 +5736,7 @@
           </mc:Choice>
           <mc:Fallback>
             <w:pict>
-              <v:group w14:anchorId="5472BF84" id="组合 70" o:spid="_x0000_s1044" style="position:absolute;left:0;text-align:left;margin-left:.2pt;margin-top:4.3pt;width:411pt;height:99.2pt;z-index:251671552;mso-width-relative:margin" coordorigin="15606,36541" coordsize="8450,1984" o:gfxdata="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">
+              <v:group w14:anchorId="5472BF84" id="组合 70" o:spid="_x0000_s1044" style="position:absolute;left:0;text-align:left;margin-left:.2pt;margin-top:4.3pt;width:411pt;height:99.2pt;z-index:251670528;mso-width-relative:margin" coordorigin="15606,36541" coordsize="8450,1984" o:gfxdata="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">
                 <v:roundrect id="圆角矩形 23" o:spid="_x0000_s1045" style="position:absolute;left:15606;top:37016;width:8450;height:1509;visibility:visible;mso-wrap-style:square;v-text-anchor:middle" arcsize="10923f" o:gfxdata="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" filled="f" strokecolor="#7f7f7f" strokeweight=".5pt">
                   <v:stroke joinstyle="miter"/>
                   <v:textbox>
@@ -5816,6 +5836,7 @@
               <w:rPr>
                 <w:noProof/>
               </w:rPr>
+              <w:lastRenderedPageBreak/>
               <w:drawing>
                 <wp:inline distT="0" distB="0" distL="114300" distR="114300" wp14:anchorId="583CA0EB" wp14:editId="4E6A87FE">
                   <wp:extent cx="2065020" cy="1174115"/>
@@ -5993,7 +6014,7 @@
         <mc:AlternateContent>
           <mc:Choice Requires="wpg">
             <w:drawing>
-              <wp:anchor distT="0" distB="0" distL="114300" distR="114300" simplePos="0" relativeHeight="251672576" behindDoc="0" locked="0" layoutInCell="1" allowOverlap="1" wp14:anchorId="0BD8679B" wp14:editId="67EFFD21">
+              <wp:anchor distT="0" distB="0" distL="114300" distR="114300" simplePos="0" relativeHeight="251671552" behindDoc="0" locked="0" layoutInCell="1" allowOverlap="1" wp14:anchorId="0BD8679B" wp14:editId="7D25AFD6">
                 <wp:simplePos x="0" y="0"/>
                 <wp:positionH relativeFrom="column">
                   <wp:posOffset>2540</wp:posOffset>
@@ -6165,7 +6186,7 @@
           </mc:Choice>
           <mc:Fallback>
             <w:pict>
-              <v:group w14:anchorId="0BD8679B" id="组合 14" o:spid="_x0000_s1047" style="position:absolute;left:0;text-align:left;margin-left:.2pt;margin-top:4.35pt;width:411pt;height:99.2pt;z-index:251672576;mso-width-relative:margin" coordorigin="15606,36541" coordsize="8450,1984" o:gfxdata="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">
+              <v:group w14:anchorId="0BD8679B" id="组合 14" o:spid="_x0000_s1047" style="position:absolute;left:0;text-align:left;margin-left:.2pt;margin-top:4.35pt;width:411pt;height:99.2pt;z-index:251671552;mso-width-relative:margin" coordorigin="15606,36541" coordsize="8450,1984" o:gfxdata="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">
                 <v:roundrect id="圆角矩形 23" o:spid="_x0000_s1048" style="position:absolute;left:15606;top:37016;width:8450;height:1509;visibility:visible;mso-wrap-style:square;v-text-anchor:middle" arcsize="10923f" o:gfxdata="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" filled="f" strokecolor="#7f7f7f" strokeweight=".5pt">
                   <v:stroke joinstyle="miter"/>
                   <v:textbox>
@@ -6425,7 +6446,6 @@
       <w:pPr>
         <w:spacing w:line="144" w:lineRule="auto"/>
         <w:rPr>
-          <w:rFonts w:hint="eastAsia"/>
           <w:noProof/>
         </w:rPr>
       </w:pPr>
@@ -6437,7 +6457,7 @@
         <mc:AlternateContent>
           <mc:Choice Requires="wpg">
             <w:drawing>
-              <wp:anchor distT="0" distB="0" distL="114300" distR="114300" simplePos="0" relativeHeight="251673600" behindDoc="0" locked="0" layoutInCell="1" allowOverlap="1" wp14:anchorId="56538539" wp14:editId="2243ABF2">
+              <wp:anchor distT="0" distB="0" distL="114300" distR="114300" simplePos="0" relativeHeight="251672576" behindDoc="0" locked="0" layoutInCell="1" allowOverlap="1" wp14:anchorId="56538539" wp14:editId="29D7A578">
                 <wp:simplePos x="0" y="0"/>
                 <wp:positionH relativeFrom="column">
                   <wp:posOffset>2540</wp:posOffset>
@@ -6609,7 +6629,7 @@
           </mc:Choice>
           <mc:Fallback>
             <w:pict>
-              <v:group w14:anchorId="56538539" id="组合 19" o:spid="_x0000_s1050" style="position:absolute;left:0;text-align:left;margin-left:.2pt;margin-top:4.3pt;width:411pt;height:99.2pt;z-index:251673600;mso-width-relative:margin" coordorigin="15606,36541" coordsize="8450,1984" o:gfxdata="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">
+              <v:group w14:anchorId="56538539" id="组合 19" o:spid="_x0000_s1050" style="position:absolute;left:0;text-align:left;margin-left:.2pt;margin-top:4.3pt;width:411pt;height:99.2pt;z-index:251672576;mso-width-relative:margin" coordorigin="15606,36541" coordsize="8450,1984" o:gfxdata="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">
                 <v:roundrect id="圆角矩形 23" o:spid="_x0000_s1051" style="position:absolute;left:15606;top:37016;width:8450;height:1509;visibility:visible;mso-wrap-style:square;v-text-anchor:middle" arcsize="10923f" o:gfxdata="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" filled="f" strokecolor="#7f7f7f" strokeweight=".5pt">
                   <v:stroke joinstyle="miter"/>
                   <v:textbox>
@@ -6709,7 +6729,6 @@
               <w:rPr>
                 <w:noProof/>
               </w:rPr>
-              <w:lastRenderedPageBreak/>
               <w:drawing>
                 <wp:inline distT="0" distB="0" distL="114300" distR="114300" wp14:anchorId="496CBA13" wp14:editId="6B2B5466">
                   <wp:extent cx="2147570" cy="1221105"/>
@@ -6895,7 +6914,7 @@
         <mc:AlternateContent>
           <mc:Choice Requires="wpg">
             <w:drawing>
-              <wp:anchor distT="0" distB="0" distL="114300" distR="114300" simplePos="0" relativeHeight="251666432" behindDoc="0" locked="0" layoutInCell="1" allowOverlap="1" wp14:anchorId="7851C3AA" wp14:editId="088E7844">
+              <wp:anchor distT="0" distB="0" distL="114300" distR="114300" simplePos="0" relativeHeight="251665408" behindDoc="0" locked="0" layoutInCell="1" allowOverlap="1" wp14:anchorId="7851C3AA" wp14:editId="598DAFC7">
                 <wp:simplePos x="0" y="0"/>
                 <wp:positionH relativeFrom="column">
                   <wp:posOffset>3175</wp:posOffset>
@@ -7064,7 +7083,7 @@
           </mc:Choice>
           <mc:Fallback>
             <w:pict>
-              <v:group w14:anchorId="7851C3AA" id="组合 73" o:spid="_x0000_s1053" style="position:absolute;left:0;text-align:left;margin-left:.25pt;margin-top:4.25pt;width:422.5pt;height:99.2pt;z-index:251666432" coordorigin="15606,36541" coordsize="8450,1984" o:gfxdata="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">
+              <v:group w14:anchorId="7851C3AA" id="组合 73" o:spid="_x0000_s1053" style="position:absolute;left:0;text-align:left;margin-left:.25pt;margin-top:4.25pt;width:422.5pt;height:99.2pt;z-index:251665408" coordorigin="15606,36541" coordsize="8450,1984" o:gfxdata="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">
                 <v:roundrect id="圆角矩形 23" o:spid="_x0000_s1054" style="position:absolute;left:15606;top:37016;width:8450;height:1509;visibility:visible;mso-wrap-style:square;v-text-anchor:middle" arcsize="10923f" o:gfxdata="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" filled="f" strokecolor="#7f7f7f" strokeweight=".5pt">
                   <v:stroke joinstyle="miter"/>
                   <v:textbox>
@@ -7451,9 +7470,6 @@
             <w:pPr>
               <w:pStyle w:val="ab"/>
               <w:jc w:val="center"/>
-              <w:rPr>
-                <w:rFonts w:hint="eastAsia"/>
-              </w:rPr>
             </w:pPr>
             <w:r>
               <w:rPr>
@@ -7699,14 +7715,14 @@
         <v:path o:extrusionok="f" gradientshapeok="t" o:connecttype="rect"/>
         <o:lock v:ext="edit" aspectratio="t"/>
       </v:shapetype>
-      <v:shape id="0" o:spid="_x0000_i1025" type="#_x0000_t75" style="width:768pt;height:768pt" o:bullet="t">
+      <v:shape id="0" o:spid="_x0000_i1025" type="#_x0000_t75" style="width:767.85pt;height:767.85pt" o:bullet="t">
         <v:imagedata r:id="rId1" o:title=""/>
       </v:shape>
     </w:pict>
   </w:numPicBullet>
   <w:numPicBullet w:numPicBulletId="1">
     <w:pict>
-      <v:shape id="1" o:spid="_x0000_i1026" type="#_x0000_t75" style="width:768pt;height:768.75pt" o:bullet="t">
+      <v:shape id="1" o:spid="_x0000_i1026" type="#_x0000_t75" style="width:767.85pt;height:768.65pt" o:bullet="t">
         <v:imagedata r:id="rId2" o:title=""/>
       </v:shape>
     </w:pict>
@@ -10550,7 +10566,7 @@
             </c:spPr>
             <c:extLst>
               <c:ext xmlns:c16="http://schemas.microsoft.com/office/drawing/2014/chart" uri="{C3380CC4-5D6E-409C-BE32-E72D297353CC}">
-                <c16:uniqueId val="{00000001-03B3-460C-A7D9-139082A0D0FA}"/>
+                <c16:uniqueId val="{00000001-50CA-418E-839C-ED6013A566D1}"/>
               </c:ext>
             </c:extLst>
           </c:dPt>
@@ -10578,7 +10594,7 @@
             </c:spPr>
             <c:extLst>
               <c:ext xmlns:c16="http://schemas.microsoft.com/office/drawing/2014/chart" uri="{C3380CC4-5D6E-409C-BE32-E72D297353CC}">
-                <c16:uniqueId val="{00000003-03B3-460C-A7D9-139082A0D0FA}"/>
+                <c16:uniqueId val="{00000003-50CA-418E-839C-ED6013A566D1}"/>
               </c:ext>
             </c:extLst>
           </c:dPt>
@@ -10607,7 +10623,7 @@
                   </c15:layout>
                 </c:ext>
                 <c:ext xmlns:c16="http://schemas.microsoft.com/office/drawing/2014/chart" uri="{C3380CC4-5D6E-409C-BE32-E72D297353CC}">
-                  <c16:uniqueId val="{00000001-03B3-460C-A7D9-139082A0D0FA}"/>
+                  <c16:uniqueId val="{00000001-50CA-418E-839C-ED6013A566D1}"/>
                 </c:ext>
               </c:extLst>
             </c:dLbl>
@@ -10617,7 +10633,7 @@
               <c:extLst>
                 <c:ext xmlns:c15="http://schemas.microsoft.com/office/drawing/2012/chart" uri="{CE6537A1-D6FC-4f65-9D91-7224C49458BB}"/>
                 <c:ext xmlns:c16="http://schemas.microsoft.com/office/drawing/2014/chart" uri="{C3380CC4-5D6E-409C-BE32-E72D297353CC}">
-                  <c16:uniqueId val="{00000003-03B3-460C-A7D9-139082A0D0FA}"/>
+                  <c16:uniqueId val="{00000003-50CA-418E-839C-ED6013A566D1}"/>
                 </c:ext>
               </c:extLst>
             </c:dLbl>
@@ -10690,7 +10706,7 @@
           </c:val>
           <c:extLst>
             <c:ext xmlns:c16="http://schemas.microsoft.com/office/drawing/2014/chart" uri="{C3380CC4-5D6E-409C-BE32-E72D297353CC}">
-              <c16:uniqueId val="{00000004-03B3-460C-A7D9-139082A0D0FA}"/>
+              <c16:uniqueId val="{00000004-50CA-418E-839C-ED6013A566D1}"/>
             </c:ext>
           </c:extLst>
         </c:ser>
@@ -10839,7 +10855,7 @@
             </c:spPr>
             <c:extLst>
               <c:ext xmlns:c16="http://schemas.microsoft.com/office/drawing/2014/chart" uri="{C3380CC4-5D6E-409C-BE32-E72D297353CC}">
-                <c16:uniqueId val="{00000001-7CEE-4442-BCAC-E00695C4C363}"/>
+                <c16:uniqueId val="{00000001-41CA-445D-92F9-53E2D202F42E}"/>
               </c:ext>
             </c:extLst>
           </c:dPt>
@@ -10867,7 +10883,7 @@
             </c:spPr>
             <c:extLst>
               <c:ext xmlns:c16="http://schemas.microsoft.com/office/drawing/2014/chart" uri="{C3380CC4-5D6E-409C-BE32-E72D297353CC}">
-                <c16:uniqueId val="{00000003-7CEE-4442-BCAC-E00695C4C363}"/>
+                <c16:uniqueId val="{00000003-41CA-445D-92F9-53E2D202F42E}"/>
               </c:ext>
             </c:extLst>
           </c:dPt>
@@ -10896,7 +10912,7 @@
                   </c15:layout>
                 </c:ext>
                 <c:ext xmlns:c16="http://schemas.microsoft.com/office/drawing/2014/chart" uri="{C3380CC4-5D6E-409C-BE32-E72D297353CC}">
-                  <c16:uniqueId val="{00000001-7CEE-4442-BCAC-E00695C4C363}"/>
+                  <c16:uniqueId val="{00000001-41CA-445D-92F9-53E2D202F42E}"/>
                 </c:ext>
               </c:extLst>
             </c:dLbl>
@@ -10906,7 +10922,7 @@
               <c:extLst>
                 <c:ext xmlns:c15="http://schemas.microsoft.com/office/drawing/2012/chart" uri="{CE6537A1-D6FC-4f65-9D91-7224C49458BB}"/>
                 <c:ext xmlns:c16="http://schemas.microsoft.com/office/drawing/2014/chart" uri="{C3380CC4-5D6E-409C-BE32-E72D297353CC}">
-                  <c16:uniqueId val="{00000003-7CEE-4442-BCAC-E00695C4C363}"/>
+                  <c16:uniqueId val="{00000003-41CA-445D-92F9-53E2D202F42E}"/>
                 </c:ext>
               </c:extLst>
             </c:dLbl>
@@ -10979,7 +10995,7 @@
           </c:val>
           <c:extLst>
             <c:ext xmlns:c16="http://schemas.microsoft.com/office/drawing/2014/chart" uri="{C3380CC4-5D6E-409C-BE32-E72D297353CC}">
-              <c16:uniqueId val="{00000004-7CEE-4442-BCAC-E00695C4C363}"/>
+              <c16:uniqueId val="{00000004-41CA-445D-92F9-53E2D202F42E}"/>
             </c:ext>
           </c:extLst>
         </c:ser>
@@ -11128,7 +11144,7 @@
             </c:spPr>
             <c:extLst>
               <c:ext xmlns:c16="http://schemas.microsoft.com/office/drawing/2014/chart" uri="{C3380CC4-5D6E-409C-BE32-E72D297353CC}">
-                <c16:uniqueId val="{00000001-B07E-43C0-8EB3-C5986F1D029A}"/>
+                <c16:uniqueId val="{00000001-5DEA-411A-A532-E9F5F04174C0}"/>
               </c:ext>
             </c:extLst>
           </c:dPt>
@@ -11156,7 +11172,7 @@
             </c:spPr>
             <c:extLst>
               <c:ext xmlns:c16="http://schemas.microsoft.com/office/drawing/2014/chart" uri="{C3380CC4-5D6E-409C-BE32-E72D297353CC}">
-                <c16:uniqueId val="{00000003-B07E-43C0-8EB3-C5986F1D029A}"/>
+                <c16:uniqueId val="{00000003-5DEA-411A-A532-E9F5F04174C0}"/>
               </c:ext>
             </c:extLst>
           </c:dPt>
@@ -11185,7 +11201,7 @@
                   </c15:layout>
                 </c:ext>
                 <c:ext xmlns:c16="http://schemas.microsoft.com/office/drawing/2014/chart" uri="{C3380CC4-5D6E-409C-BE32-E72D297353CC}">
-                  <c16:uniqueId val="{00000001-B07E-43C0-8EB3-C5986F1D029A}"/>
+                  <c16:uniqueId val="{00000001-5DEA-411A-A532-E9F5F04174C0}"/>
                 </c:ext>
               </c:extLst>
             </c:dLbl>
@@ -11195,7 +11211,7 @@
               <c:extLst>
                 <c:ext xmlns:c15="http://schemas.microsoft.com/office/drawing/2012/chart" uri="{CE6537A1-D6FC-4f65-9D91-7224C49458BB}"/>
                 <c:ext xmlns:c16="http://schemas.microsoft.com/office/drawing/2014/chart" uri="{C3380CC4-5D6E-409C-BE32-E72D297353CC}">
-                  <c16:uniqueId val="{00000003-B07E-43C0-8EB3-C5986F1D029A}"/>
+                  <c16:uniqueId val="{00000003-5DEA-411A-A532-E9F5F04174C0}"/>
                 </c:ext>
               </c:extLst>
             </c:dLbl>
@@ -11268,7 +11284,7 @@
           </c:val>
           <c:extLst>
             <c:ext xmlns:c16="http://schemas.microsoft.com/office/drawing/2014/chart" uri="{C3380CC4-5D6E-409C-BE32-E72D297353CC}">
-              <c16:uniqueId val="{00000004-B07E-43C0-8EB3-C5986F1D029A}"/>
+              <c16:uniqueId val="{00000004-5DEA-411A-A532-E9F5F04174C0}"/>
             </c:ext>
           </c:extLst>
         </c:ser>
@@ -11417,7 +11433,7 @@
             </c:spPr>
             <c:extLst>
               <c:ext xmlns:c16="http://schemas.microsoft.com/office/drawing/2014/chart" uri="{C3380CC4-5D6E-409C-BE32-E72D297353CC}">
-                <c16:uniqueId val="{00000001-2C1A-4DA6-9E62-70D0469B632A}"/>
+                <c16:uniqueId val="{00000001-A99A-4951-821B-13F169911C83}"/>
               </c:ext>
             </c:extLst>
           </c:dPt>
@@ -11445,7 +11461,7 @@
             </c:spPr>
             <c:extLst>
               <c:ext xmlns:c16="http://schemas.microsoft.com/office/drawing/2014/chart" uri="{C3380CC4-5D6E-409C-BE32-E72D297353CC}">
-                <c16:uniqueId val="{00000003-2C1A-4DA6-9E62-70D0469B632A}"/>
+                <c16:uniqueId val="{00000003-A99A-4951-821B-13F169911C83}"/>
               </c:ext>
             </c:extLst>
           </c:dPt>
@@ -11474,7 +11490,7 @@
                   </c15:layout>
                 </c:ext>
                 <c:ext xmlns:c16="http://schemas.microsoft.com/office/drawing/2014/chart" uri="{C3380CC4-5D6E-409C-BE32-E72D297353CC}">
-                  <c16:uniqueId val="{00000001-2C1A-4DA6-9E62-70D0469B632A}"/>
+                  <c16:uniqueId val="{00000001-A99A-4951-821B-13F169911C83}"/>
                 </c:ext>
               </c:extLst>
             </c:dLbl>
@@ -11484,7 +11500,7 @@
               <c:extLst>
                 <c:ext xmlns:c15="http://schemas.microsoft.com/office/drawing/2012/chart" uri="{CE6537A1-D6FC-4f65-9D91-7224C49458BB}"/>
                 <c:ext xmlns:c16="http://schemas.microsoft.com/office/drawing/2014/chart" uri="{C3380CC4-5D6E-409C-BE32-E72D297353CC}">
-                  <c16:uniqueId val="{00000003-2C1A-4DA6-9E62-70D0469B632A}"/>
+                  <c16:uniqueId val="{00000003-A99A-4951-821B-13F169911C83}"/>
                 </c:ext>
               </c:extLst>
             </c:dLbl>
@@ -11557,7 +11573,7 @@
           </c:val>
           <c:extLst>
             <c:ext xmlns:c16="http://schemas.microsoft.com/office/drawing/2014/chart" uri="{C3380CC4-5D6E-409C-BE32-E72D297353CC}">
-              <c16:uniqueId val="{00000004-2C1A-4DA6-9E62-70D0469B632A}"/>
+              <c16:uniqueId val="{00000004-A99A-4951-821B-13F169911C83}"/>
             </c:ext>
           </c:extLst>
         </c:ser>
@@ -11706,7 +11722,7 @@
             </c:spPr>
             <c:extLst>
               <c:ext xmlns:c16="http://schemas.microsoft.com/office/drawing/2014/chart" uri="{C3380CC4-5D6E-409C-BE32-E72D297353CC}">
-                <c16:uniqueId val="{00000001-A454-4221-BAF7-E6A15544E004}"/>
+                <c16:uniqueId val="{00000001-21FF-4650-BCD3-AFF589A8D249}"/>
               </c:ext>
             </c:extLst>
           </c:dPt>
@@ -11734,7 +11750,7 @@
             </c:spPr>
             <c:extLst>
               <c:ext xmlns:c16="http://schemas.microsoft.com/office/drawing/2014/chart" uri="{C3380CC4-5D6E-409C-BE32-E72D297353CC}">
-                <c16:uniqueId val="{00000003-A454-4221-BAF7-E6A15544E004}"/>
+                <c16:uniqueId val="{00000003-21FF-4650-BCD3-AFF589A8D249}"/>
               </c:ext>
             </c:extLst>
           </c:dPt>
@@ -11763,7 +11779,7 @@
                   </c15:layout>
                 </c:ext>
                 <c:ext xmlns:c16="http://schemas.microsoft.com/office/drawing/2014/chart" uri="{C3380CC4-5D6E-409C-BE32-E72D297353CC}">
-                  <c16:uniqueId val="{00000001-A454-4221-BAF7-E6A15544E004}"/>
+                  <c16:uniqueId val="{00000001-21FF-4650-BCD3-AFF589A8D249}"/>
                 </c:ext>
               </c:extLst>
             </c:dLbl>
@@ -11773,7 +11789,7 @@
               <c:extLst>
                 <c:ext xmlns:c15="http://schemas.microsoft.com/office/drawing/2012/chart" uri="{CE6537A1-D6FC-4f65-9D91-7224C49458BB}"/>
                 <c:ext xmlns:c16="http://schemas.microsoft.com/office/drawing/2014/chart" uri="{C3380CC4-5D6E-409C-BE32-E72D297353CC}">
-                  <c16:uniqueId val="{00000003-A454-4221-BAF7-E6A15544E004}"/>
+                  <c16:uniqueId val="{00000003-21FF-4650-BCD3-AFF589A8D249}"/>
                 </c:ext>
               </c:extLst>
             </c:dLbl>
@@ -11846,7 +11862,7 @@
           </c:val>
           <c:extLst>
             <c:ext xmlns:c16="http://schemas.microsoft.com/office/drawing/2014/chart" uri="{C3380CC4-5D6E-409C-BE32-E72D297353CC}">
-              <c16:uniqueId val="{00000004-A454-4221-BAF7-E6A15544E004}"/>
+              <c16:uniqueId val="{00000004-21FF-4650-BCD3-AFF589A8D249}"/>
             </c:ext>
           </c:extLst>
         </c:ser>

</xml_diff>